<commit_message>
Converted UNF to 1NF – removed repeating groups and identified primary keys
</commit_message>
<xml_diff>
--- a/Applied/App04/A4-2 NORMALISATION.docx
+++ b/Applied/App04/A4-2 NORMALISATION.docx
@@ -14,6 +14,891 @@
         </w:rPr>
         <w:t>A4-2</w:t>
       </w:r>
+      <w:r>
+        <w:rPr>
+          <w:lang w:val="en-US"/>
+        </w:rPr>
+        <w:t xml:space="preserve">.1- Property </w:t>
+      </w:r>
+      <w:proofErr w:type="spellStart"/>
+      <w:r>
+        <w:rPr>
+          <w:lang w:val="en-US"/>
+        </w:rPr>
+        <w:t>Maintainence</w:t>
+      </w:r>
+      <w:proofErr w:type="spellEnd"/>
+      <w:r>
+        <w:rPr>
+          <w:lang w:val="en-US"/>
+        </w:rPr>
+        <w:t xml:space="preserve"> report</w:t>
+      </w:r>
+    </w:p>
+    <w:p>
+      <w:pPr>
+        <w:pStyle w:val="p1"/>
+      </w:pPr>
+      <w:r>
+        <w:rPr>
+          <w:b/>
+          <w:bCs/>
+        </w:rPr>
+        <w:t>UNF</w:t>
+      </w:r>
+    </w:p>
+    <w:p>
+      <w:pPr>
+        <w:pStyle w:val="p1"/>
+      </w:pPr>
+      <w:r>
+        <w:t xml:space="preserve">PROPERTY (prop_no, prop_address, </w:t>
+      </w:r>
+      <w:proofErr w:type="spellStart"/>
+      <w:r>
+        <w:t>owner</w:t>
+      </w:r>
+      <w:r>
+        <w:t>_</w:t>
+      </w:r>
+      <w:r>
+        <w:t>no</w:t>
+      </w:r>
+      <w:proofErr w:type="spellEnd"/>
+      <w:r>
+        <w:t xml:space="preserve">, </w:t>
+      </w:r>
+      <w:proofErr w:type="spellStart"/>
+      <w:r>
+        <w:t>owner_givname</w:t>
+      </w:r>
+      <w:proofErr w:type="spellEnd"/>
+      <w:r>
+        <w:t xml:space="preserve">, </w:t>
+      </w:r>
+      <w:proofErr w:type="spellStart"/>
+      <w:r>
+        <w:t>owner</w:t>
+      </w:r>
+      <w:r>
+        <w:t>_</w:t>
+      </w:r>
+      <w:r>
+        <w:t>famname</w:t>
+      </w:r>
+      <w:proofErr w:type="spellEnd"/>
+      <w:r>
+        <w:t>,</w:t>
+      </w:r>
+      <w:r>
+        <w:t xml:space="preserve"> </w:t>
+      </w:r>
+      <w:proofErr w:type="spellStart"/>
+      <w:r>
+        <w:t>owner</w:t>
+      </w:r>
+      <w:r>
+        <w:t>_</w:t>
+      </w:r>
+      <w:r>
+        <w:t>address</w:t>
+      </w:r>
+      <w:proofErr w:type="spellEnd"/>
+      <w:r>
+        <w:t>, (maint</w:t>
+      </w:r>
+      <w:r>
+        <w:t>_</w:t>
+      </w:r>
+      <w:r>
+        <w:t>datetime,</w:t>
+      </w:r>
+      <w:r>
+        <w:t xml:space="preserve"> </w:t>
+      </w:r>
+      <w:proofErr w:type="spellStart"/>
+      <w:r>
+        <w:t>maint</w:t>
+      </w:r>
+      <w:r>
+        <w:t>_</w:t>
+      </w:r>
+      <w:r>
+        <w:t>desc</w:t>
+      </w:r>
+      <w:proofErr w:type="spellEnd"/>
+      <w:r>
+        <w:t>, maint</w:t>
+      </w:r>
+      <w:r>
+        <w:t>_</w:t>
+      </w:r>
+      <w:r>
+        <w:t>cost))</w:t>
+      </w:r>
+    </w:p>
+    <w:p>
+      <w:pPr>
+        <w:pStyle w:val="p1"/>
+      </w:pPr>
+    </w:p>
+    <w:p>
+      <w:pPr>
+        <w:pStyle w:val="p1"/>
+      </w:pPr>
+      <w:r>
+        <w:rPr>
+          <w:b/>
+          <w:bCs/>
+        </w:rPr>
+        <w:t>1NF</w:t>
+      </w:r>
+    </w:p>
+    <w:p>
+      <w:pPr>
+        <w:pStyle w:val="p1"/>
+      </w:pPr>
+      <w:r>
+        <w:t>PROPERTY (</w:t>
+      </w:r>
+      <w:r>
+        <w:rPr>
+          <w:u w:val="single"/>
+        </w:rPr>
+        <w:t>prop_no</w:t>
+      </w:r>
+      <w:r>
+        <w:t xml:space="preserve">, prop_address, </w:t>
+      </w:r>
+      <w:proofErr w:type="spellStart"/>
+      <w:r>
+        <w:t>owner</w:t>
+      </w:r>
+      <w:r>
+        <w:t>_</w:t>
+      </w:r>
+      <w:r>
+        <w:t>no</w:t>
+      </w:r>
+      <w:proofErr w:type="spellEnd"/>
+      <w:r>
+        <w:t xml:space="preserve">, </w:t>
+      </w:r>
+      <w:proofErr w:type="spellStart"/>
+      <w:r>
+        <w:t>owner_givname</w:t>
+      </w:r>
+      <w:proofErr w:type="spellEnd"/>
+      <w:r>
+        <w:t xml:space="preserve">, </w:t>
+      </w:r>
+      <w:proofErr w:type="spellStart"/>
+      <w:r>
+        <w:t>owner</w:t>
+      </w:r>
+      <w:r>
+        <w:t>_</w:t>
+      </w:r>
+      <w:proofErr w:type="gramStart"/>
+      <w:r>
+        <w:t>f</w:t>
+      </w:r>
+      <w:r>
+        <w:t>amname,owner</w:t>
+      </w:r>
+      <w:proofErr w:type="gramEnd"/>
+      <w:r>
+        <w:t>_</w:t>
+      </w:r>
+      <w:r>
+        <w:t>address</w:t>
+      </w:r>
+      <w:proofErr w:type="spellEnd"/>
+      <w:r>
+        <w:t>)</w:t>
+      </w:r>
+    </w:p>
+    <w:p>
+      <w:pPr>
+        <w:pStyle w:val="p1"/>
+      </w:pPr>
+      <w:r>
+        <w:t>CK:</w:t>
+      </w:r>
+    </w:p>
+    <w:p>
+      <w:pPr>
+        <w:pStyle w:val="p1"/>
+        <w:numPr>
+          <w:ilvl w:val="0"/>
+          <w:numId w:val="1"/>
+        </w:numPr>
+      </w:pPr>
+      <w:r>
+        <w:t>prop_no</w:t>
+      </w:r>
+    </w:p>
+    <w:p>
+      <w:pPr>
+        <w:pStyle w:val="p1"/>
+      </w:pPr>
+    </w:p>
+    <w:p>
+      <w:pPr>
+        <w:pStyle w:val="p1"/>
+      </w:pPr>
+      <w:r>
+        <w:t>MAINTENANCE (</w:t>
+      </w:r>
+      <w:r>
+        <w:rPr>
+          <w:u w:val="single"/>
+        </w:rPr>
+        <w:t>prop_no</w:t>
+      </w:r>
+      <w:r>
+        <w:t xml:space="preserve">, </w:t>
+      </w:r>
+      <w:r>
+        <w:rPr>
+          <w:u w:val="single"/>
+        </w:rPr>
+        <w:t>maint</w:t>
+      </w:r>
+      <w:r>
+        <w:rPr>
+          <w:u w:val="single"/>
+        </w:rPr>
+        <w:t>_</w:t>
+      </w:r>
+      <w:r>
+        <w:rPr>
+          <w:u w:val="single"/>
+        </w:rPr>
+        <w:t>datetime,</w:t>
+      </w:r>
+      <w:r>
+        <w:t xml:space="preserve"> </w:t>
+      </w:r>
+      <w:proofErr w:type="spellStart"/>
+      <w:r>
+        <w:t>maint</w:t>
+      </w:r>
+      <w:r>
+        <w:t>_</w:t>
+      </w:r>
+      <w:r>
+        <w:t>desc</w:t>
+      </w:r>
+      <w:proofErr w:type="spellEnd"/>
+      <w:r>
+        <w:t>, maint_cost)</w:t>
+      </w:r>
+    </w:p>
+    <w:p>
+      <w:pPr>
+        <w:pStyle w:val="p1"/>
+      </w:pPr>
+    </w:p>
+    <w:p>
+      <w:pPr>
+        <w:pStyle w:val="p1"/>
+      </w:pPr>
+      <w:r>
+        <w:t>CK:</w:t>
+      </w:r>
+    </w:p>
+    <w:p>
+      <w:pPr>
+        <w:pStyle w:val="p1"/>
+        <w:numPr>
+          <w:ilvl w:val="0"/>
+          <w:numId w:val="1"/>
+        </w:numPr>
+      </w:pPr>
+      <w:r>
+        <w:t>prop_no, maint</w:t>
+      </w:r>
+      <w:r>
+        <w:t>_</w:t>
+      </w:r>
+      <w:r>
+        <w:t>d</w:t>
+      </w:r>
+      <w:r>
+        <w:t>a</w:t>
+      </w:r>
+      <w:r>
+        <w:t>tetime</w:t>
+      </w:r>
+    </w:p>
+    <w:p>
+      <w:pPr>
+        <w:pStyle w:val="p1"/>
+      </w:pPr>
+    </w:p>
+    <w:p>
+      <w:pPr>
+        <w:pStyle w:val="p1"/>
+      </w:pPr>
+      <w:r>
+        <w:t>Partial Dependencies:</w:t>
+      </w:r>
+      <w:r>
+        <w:t xml:space="preserve"> </w:t>
+      </w:r>
+      <w:r>
+        <w:t>None</w:t>
+      </w:r>
+    </w:p>
+    <w:p>
+      <w:pPr>
+        <w:pStyle w:val="p1"/>
+      </w:pPr>
+    </w:p>
+    <w:p>
+      <w:pPr>
+        <w:rPr>
+          <w:lang w:val="en-US"/>
+        </w:rPr>
+      </w:pPr>
+    </w:p>
+    <w:p>
+      <w:pPr>
+        <w:pStyle w:val="p1"/>
+      </w:pPr>
+      <w:r>
+        <w:rPr>
+          <w:b/>
+          <w:bCs/>
+        </w:rPr>
+        <w:t>2NF</w:t>
+      </w:r>
+    </w:p>
+    <w:p>
+      <w:pPr>
+        <w:pStyle w:val="p1"/>
+      </w:pPr>
+    </w:p>
+    <w:p>
+      <w:pPr>
+        <w:pStyle w:val="p1"/>
+      </w:pPr>
+      <w:r>
+        <w:t>PROPERTY (</w:t>
+      </w:r>
+      <w:r>
+        <w:rPr>
+          <w:u w:val="single"/>
+        </w:rPr>
+        <w:t>prop_no</w:t>
+      </w:r>
+      <w:r>
+        <w:t xml:space="preserve">, prop_address, </w:t>
+      </w:r>
+      <w:proofErr w:type="spellStart"/>
+      <w:r>
+        <w:t>owner</w:t>
+      </w:r>
+      <w:r>
+        <w:t>_</w:t>
+      </w:r>
+      <w:r>
+        <w:t>no</w:t>
+      </w:r>
+      <w:proofErr w:type="spellEnd"/>
+      <w:r>
+        <w:t xml:space="preserve">, </w:t>
+      </w:r>
+      <w:proofErr w:type="spellStart"/>
+      <w:r>
+        <w:t>owner_givname</w:t>
+      </w:r>
+      <w:proofErr w:type="spellEnd"/>
+      <w:r>
+        <w:t xml:space="preserve">, </w:t>
+      </w:r>
+      <w:proofErr w:type="spellStart"/>
+      <w:r>
+        <w:t>owner</w:t>
+      </w:r>
+      <w:r>
+        <w:t>_</w:t>
+      </w:r>
+      <w:proofErr w:type="gramStart"/>
+      <w:r>
+        <w:t>famname,owner</w:t>
+      </w:r>
+      <w:proofErr w:type="gramEnd"/>
+      <w:r>
+        <w:t>_a</w:t>
+      </w:r>
+      <w:r>
+        <w:t>ddress</w:t>
+      </w:r>
+      <w:proofErr w:type="spellEnd"/>
+      <w:r>
+        <w:t>)</w:t>
+      </w:r>
+    </w:p>
+    <w:p>
+      <w:pPr>
+        <w:pStyle w:val="p1"/>
+      </w:pPr>
+    </w:p>
+    <w:p>
+      <w:pPr>
+        <w:pStyle w:val="p1"/>
+      </w:pPr>
+      <w:r>
+        <w:t>MAINTENANCE (</w:t>
+      </w:r>
+      <w:r>
+        <w:rPr>
+          <w:u w:val="single"/>
+        </w:rPr>
+        <w:t>prop_no, maint</w:t>
+      </w:r>
+      <w:r>
+        <w:rPr>
+          <w:u w:val="single"/>
+        </w:rPr>
+        <w:t>_</w:t>
+      </w:r>
+      <w:r>
+        <w:rPr>
+          <w:u w:val="single"/>
+        </w:rPr>
+        <w:t>datetime</w:t>
+      </w:r>
+      <w:r>
+        <w:t xml:space="preserve">, </w:t>
+      </w:r>
+      <w:proofErr w:type="spellStart"/>
+      <w:r>
+        <w:t>maint</w:t>
+      </w:r>
+      <w:r>
+        <w:t>_</w:t>
+      </w:r>
+      <w:r>
+        <w:t>desc</w:t>
+      </w:r>
+      <w:proofErr w:type="spellEnd"/>
+      <w:r>
+        <w:t>, maint</w:t>
+      </w:r>
+      <w:r>
+        <w:t>_</w:t>
+      </w:r>
+      <w:r>
+        <w:t>cost)</w:t>
+      </w:r>
+    </w:p>
+    <w:p>
+      <w:pPr>
+        <w:pStyle w:val="p1"/>
+      </w:pPr>
+    </w:p>
+    <w:p>
+      <w:pPr>
+        <w:pStyle w:val="p1"/>
+      </w:pPr>
+      <w:r>
+        <w:t>Transitive dependencies:</w:t>
+      </w:r>
+    </w:p>
+    <w:p>
+      <w:pPr>
+        <w:pStyle w:val="p1"/>
+      </w:pPr>
+      <w:proofErr w:type="spellStart"/>
+      <w:r>
+        <w:t>o</w:t>
+      </w:r>
+      <w:r>
+        <w:t>wner</w:t>
+      </w:r>
+      <w:r>
+        <w:t>_</w:t>
+      </w:r>
+      <w:r>
+        <w:t>no</w:t>
+      </w:r>
+      <w:proofErr w:type="spellEnd"/>
+      <w:r>
+        <w:t xml:space="preserve"> → </w:t>
+      </w:r>
+      <w:proofErr w:type="spellStart"/>
+      <w:r>
+        <w:t>owner_givname</w:t>
+      </w:r>
+      <w:proofErr w:type="spellEnd"/>
+      <w:r>
+        <w:t xml:space="preserve">, </w:t>
+      </w:r>
+      <w:proofErr w:type="spellStart"/>
+      <w:r>
+        <w:t>owner</w:t>
+      </w:r>
+      <w:r>
+        <w:t>_f</w:t>
+      </w:r>
+      <w:r>
+        <w:t>amname</w:t>
+      </w:r>
+      <w:proofErr w:type="spellEnd"/>
+      <w:r>
+        <w:t xml:space="preserve">, </w:t>
+      </w:r>
+      <w:proofErr w:type="spellStart"/>
+      <w:r>
+        <w:t>owner</w:t>
+      </w:r>
+      <w:r>
+        <w:t>_</w:t>
+      </w:r>
+      <w:r>
+        <w:t>address</w:t>
+      </w:r>
+      <w:proofErr w:type="spellEnd"/>
+    </w:p>
+    <w:p>
+      <w:pPr>
+        <w:rPr>
+          <w:lang w:val="en-US"/>
+        </w:rPr>
+      </w:pPr>
+    </w:p>
+    <w:p>
+      <w:pPr>
+        <w:rPr>
+          <w:lang w:val="en-US"/>
+        </w:rPr>
+      </w:pPr>
+      <w:r>
+        <w:rPr>
+          <w:lang w:val="en-US"/>
+        </w:rPr>
+        <w:t>3NF</w:t>
+      </w:r>
+    </w:p>
+    <w:p>
+      <w:pPr>
+        <w:rPr>
+          <w:lang w:val="en-US"/>
+        </w:rPr>
+      </w:pPr>
+      <w:proofErr w:type="gramStart"/>
+      <w:r>
+        <w:rPr>
+          <w:lang w:val="en-US"/>
+        </w:rPr>
+        <w:t>OWNER(</w:t>
+      </w:r>
+      <w:proofErr w:type="spellStart"/>
+      <w:proofErr w:type="gramEnd"/>
+      <w:r>
+        <w:rPr>
+          <w:lang w:val="en-US"/>
+        </w:rPr>
+        <w:t>owner_no</w:t>
+      </w:r>
+      <w:proofErr w:type="spellEnd"/>
+      <w:r>
+        <w:rPr>
+          <w:lang w:val="en-US"/>
+        </w:rPr>
+        <w:t xml:space="preserve">, </w:t>
+      </w:r>
+      <w:proofErr w:type="spellStart"/>
+      <w:r>
+        <w:rPr>
+          <w:lang w:val="en-US"/>
+        </w:rPr>
+        <w:t>owner_givname</w:t>
+      </w:r>
+      <w:proofErr w:type="spellEnd"/>
+      <w:r>
+        <w:rPr>
+          <w:lang w:val="en-US"/>
+        </w:rPr>
+        <w:t xml:space="preserve">, </w:t>
+      </w:r>
+      <w:proofErr w:type="spellStart"/>
+      <w:r>
+        <w:rPr>
+          <w:lang w:val="en-US"/>
+        </w:rPr>
+        <w:t>owner_famname</w:t>
+      </w:r>
+      <w:proofErr w:type="spellEnd"/>
+      <w:r>
+        <w:rPr>
+          <w:lang w:val="en-US"/>
+        </w:rPr>
+        <w:t xml:space="preserve">, </w:t>
+      </w:r>
+      <w:proofErr w:type="spellStart"/>
+      <w:r>
+        <w:rPr>
+          <w:lang w:val="en-US"/>
+        </w:rPr>
+        <w:t>owner_address</w:t>
+      </w:r>
+      <w:proofErr w:type="spellEnd"/>
+      <w:r>
+        <w:rPr>
+          <w:lang w:val="en-US"/>
+        </w:rPr>
+        <w:t>)</w:t>
+      </w:r>
+    </w:p>
+    <w:p>
+      <w:pPr>
+        <w:rPr>
+          <w:lang w:val="en-US"/>
+        </w:rPr>
+      </w:pPr>
+      <w:r>
+        <w:rPr>
+          <w:lang w:val="en-US"/>
+        </w:rPr>
+        <w:t>PROPERTY (</w:t>
+      </w:r>
+      <w:proofErr w:type="spellStart"/>
+      <w:r>
+        <w:rPr>
+          <w:lang w:val="en-US"/>
+        </w:rPr>
+        <w:t>prop_no</w:t>
+      </w:r>
+      <w:proofErr w:type="spellEnd"/>
+      <w:r>
+        <w:rPr>
+          <w:lang w:val="en-US"/>
+        </w:rPr>
+        <w:t xml:space="preserve">, </w:t>
+      </w:r>
+      <w:proofErr w:type="spellStart"/>
+      <w:r>
+        <w:rPr>
+          <w:lang w:val="en-US"/>
+        </w:rPr>
+        <w:t>prop_address</w:t>
+      </w:r>
+      <w:proofErr w:type="spellEnd"/>
+      <w:r>
+        <w:rPr>
+          <w:lang w:val="en-US"/>
+        </w:rPr>
+        <w:t xml:space="preserve">, </w:t>
+      </w:r>
+      <w:proofErr w:type="spellStart"/>
+      <w:r>
+        <w:rPr>
+          <w:lang w:val="en-US"/>
+        </w:rPr>
+        <w:t>owner_no</w:t>
+      </w:r>
+      <w:proofErr w:type="spellEnd"/>
+      <w:r>
+        <w:rPr>
+          <w:lang w:val="en-US"/>
+        </w:rPr>
+        <w:t>)</w:t>
+      </w:r>
+    </w:p>
+    <w:p>
+      <w:pPr>
+        <w:rPr>
+          <w:lang w:val="en-US"/>
+        </w:rPr>
+      </w:pPr>
+      <w:proofErr w:type="gramStart"/>
+      <w:r>
+        <w:rPr>
+          <w:lang w:val="en-US"/>
+        </w:rPr>
+        <w:t>MAINTAINENCE(</w:t>
+      </w:r>
+      <w:proofErr w:type="spellStart"/>
+      <w:proofErr w:type="gramEnd"/>
+      <w:r>
+        <w:rPr>
+          <w:lang w:val="en-US"/>
+        </w:rPr>
+        <w:t>prop_no</w:t>
+      </w:r>
+      <w:proofErr w:type="spellEnd"/>
+      <w:r>
+        <w:rPr>
+          <w:lang w:val="en-US"/>
+        </w:rPr>
+        <w:t xml:space="preserve">, </w:t>
+      </w:r>
+      <w:proofErr w:type="spellStart"/>
+      <w:r>
+        <w:rPr>
+          <w:lang w:val="en-US"/>
+        </w:rPr>
+        <w:t>maint_datetime</w:t>
+      </w:r>
+      <w:proofErr w:type="spellEnd"/>
+      <w:r>
+        <w:rPr>
+          <w:lang w:val="en-US"/>
+        </w:rPr>
+        <w:t xml:space="preserve">, </w:t>
+      </w:r>
+      <w:proofErr w:type="spellStart"/>
+      <w:r>
+        <w:rPr>
+          <w:lang w:val="en-US"/>
+        </w:rPr>
+        <w:t>maint_desc</w:t>
+      </w:r>
+      <w:proofErr w:type="spellEnd"/>
+      <w:r>
+        <w:rPr>
+          <w:lang w:val="en-US"/>
+        </w:rPr>
+        <w:t xml:space="preserve">, </w:t>
+      </w:r>
+      <w:proofErr w:type="spellStart"/>
+      <w:r>
+        <w:rPr>
+          <w:lang w:val="en-US"/>
+        </w:rPr>
+        <w:t>maint_cost</w:t>
+      </w:r>
+      <w:proofErr w:type="spellEnd"/>
+      <w:r>
+        <w:rPr>
+          <w:lang w:val="en-US"/>
+        </w:rPr>
+        <w:t>)</w:t>
+      </w:r>
+    </w:p>
+    <w:p>
+      <w:pPr>
+        <w:pStyle w:val="p1"/>
+      </w:pPr>
+      <w:r>
+        <w:t>Full Dependencies:</w:t>
+      </w:r>
+    </w:p>
+    <w:p>
+      <w:pPr>
+        <w:pStyle w:val="p1"/>
+      </w:pPr>
+      <w:proofErr w:type="spellStart"/>
+      <w:r>
+        <w:t>o</w:t>
+      </w:r>
+      <w:r>
+        <w:t>wner</w:t>
+      </w:r>
+      <w:r>
+        <w:t>_</w:t>
+      </w:r>
+      <w:r>
+        <w:t>no</w:t>
+      </w:r>
+      <w:proofErr w:type="spellEnd"/>
+      <w:r>
+        <w:t xml:space="preserve"> → </w:t>
+      </w:r>
+      <w:proofErr w:type="spellStart"/>
+      <w:r>
+        <w:t>owner_givname</w:t>
+      </w:r>
+      <w:proofErr w:type="spellEnd"/>
+      <w:r>
+        <w:t xml:space="preserve">, </w:t>
+      </w:r>
+      <w:proofErr w:type="spellStart"/>
+      <w:r>
+        <w:t>owner</w:t>
+      </w:r>
+      <w:r>
+        <w:t>_</w:t>
+      </w:r>
+      <w:r>
+        <w:t>famname</w:t>
+      </w:r>
+      <w:proofErr w:type="spellEnd"/>
+      <w:r>
+        <w:t xml:space="preserve">, </w:t>
+      </w:r>
+      <w:proofErr w:type="spellStart"/>
+      <w:r>
+        <w:t>owner</w:t>
+      </w:r>
+      <w:r>
+        <w:t>_addess</w:t>
+      </w:r>
+      <w:proofErr w:type="spellEnd"/>
+    </w:p>
+    <w:p>
+      <w:pPr>
+        <w:pStyle w:val="p1"/>
+      </w:pPr>
+      <w:r>
+        <w:t xml:space="preserve">prop_no → prop_address, </w:t>
+      </w:r>
+      <w:proofErr w:type="spellStart"/>
+      <w:r>
+        <w:t>owner</w:t>
+      </w:r>
+      <w:r>
+        <w:t>_</w:t>
+      </w:r>
+      <w:r>
+        <w:t>no</w:t>
+      </w:r>
+      <w:proofErr w:type="spellEnd"/>
+    </w:p>
+    <w:p>
+      <w:pPr>
+        <w:pStyle w:val="p1"/>
+      </w:pPr>
+      <w:r>
+        <w:t>prop_no, maint</w:t>
+      </w:r>
+      <w:r>
+        <w:t>_</w:t>
+      </w:r>
+      <w:r>
+        <w:t xml:space="preserve">datetime → </w:t>
+      </w:r>
+      <w:proofErr w:type="spellStart"/>
+      <w:r>
+        <w:t>maint</w:t>
+      </w:r>
+      <w:r>
+        <w:t>_</w:t>
+      </w:r>
+      <w:r>
+        <w:t>desc</w:t>
+      </w:r>
+      <w:proofErr w:type="spellEnd"/>
+      <w:r>
+        <w:t>, maint</w:t>
+      </w:r>
+      <w:r>
+        <w:t>_</w:t>
+      </w:r>
+      <w:r>
+        <w:t>cost</w:t>
+      </w:r>
+    </w:p>
+    <w:p>
+      <w:pPr>
+        <w:rPr>
+          <w:lang w:val="en-US"/>
+        </w:rPr>
+      </w:pPr>
     </w:p>
     <w:sectPr>
       <w:pgSz w:w="11906" w:h="16838"/>
@@ -23,6 +908,127 @@
     </w:sectPr>
   </w:body>
 </w:document>
+</file>
+
+<file path=word/numbering.xml><?xml version="1.0" encoding="utf-8"?>
+<w:numbering xmlns:wpc="http://schemas.microsoft.com/office/word/2010/wordprocessingCanvas" xmlns:cx="http://schemas.microsoft.com/office/drawing/2014/chartex" xmlns:cx1="http://schemas.microsoft.com/office/drawing/2015/9/8/chartex" xmlns:cx2="http://schemas.microsoft.com/office/drawing/2015/10/21/chartex" xmlns:cx3="http://schemas.microsoft.com/office/drawing/2016/5/9/chartex" xmlns:cx4="http://schemas.microsoft.com/office/drawing/2016/5/10/chartex" xmlns:cx5="http://schemas.microsoft.com/office/drawing/2016/5/11/chartex" xmlns:cx6="http://schemas.microsoft.com/office/drawing/2016/5/12/chartex" xmlns:cx7="http://schemas.microsoft.com/office/drawing/2016/5/13/chartex" xmlns:cx8="http://schemas.microsoft.com/office/drawing/2016/5/14/chartex" xmlns:mc="http://schemas.openxmlformats.org/markup-compatibility/2006" xmlns:aink="http://schemas.microsoft.com/office/drawing/2016/ink" xmlns:am3d="http://schemas.microsoft.com/office/drawing/2017/model3d" xmlns:o="urn:schemas-microsoft-com:office:office" xmlns:oel="http://schemas.microsoft.com/office/2019/extlst" xmlns:r="http://schemas.openxmlformats.org/officeDocument/2006/relationships" xmlns:m="http://schemas.openxmlformats.org/officeDocument/2006/math" xmlns:v="urn:schemas-microsoft-com:vml" xmlns:wp14="http://schemas.microsoft.com/office/word/2010/wordprocessingDrawing" xmlns:wp="http://schemas.openxmlformats.org/drawingml/2006/wordprocessingDrawing" xmlns:w10="urn:schemas-microsoft-com:office:word" xmlns:w="http://schemas.openxmlformats.org/wordprocessingml/2006/main" xmlns:w14="http://schemas.microsoft.com/office/word/2010/wordml" xmlns:w15="http://schemas.microsoft.com/office/word/2012/wordml" xmlns:w16cex="http://schemas.microsoft.com/office/word/2018/wordml/cex" xmlns:w16cid="http://schemas.microsoft.com/office/word/2016/wordml/cid" xmlns:w16="http://schemas.microsoft.com/office/word/2018/wordml" xmlns:w16du="http://schemas.microsoft.com/office/word/2023/wordml/word16du" xmlns:w16sdtdh="http://schemas.microsoft.com/office/word/2020/wordml/sdtdatahash" xmlns:w16sdtfl="http://schemas.microsoft.com/office/word/2024/wordml/sdtformatlock" xmlns:w16se="http://schemas.microsoft.com/office/word/2015/wordml/symex" xmlns:wpg="http://schemas.microsoft.com/office/word/2010/wordprocessingGroup" xmlns:wpi="http://schemas.microsoft.com/office/word/2010/wordprocessingInk" xmlns:wne="http://schemas.microsoft.com/office/word/2006/wordml" xmlns:wps="http://schemas.microsoft.com/office/word/2010/wordprocessingShape" mc:Ignorable="w14 w15 w16se w16cid w16 w16cex w16sdtdh w16sdtfl w16du wp14">
+  <w:abstractNum w:abstractNumId="0" w15:restartNumberingAfterBreak="0">
+    <w:nsid w:val="5E717208"/>
+    <w:multiLevelType w:val="hybridMultilevel"/>
+    <w:tmpl w:val="E2162510"/>
+    <w:lvl w:ilvl="0" w:tplc="08090001">
+      <w:start w:val="1"/>
+      <w:numFmt w:val="bullet"/>
+      <w:lvlText w:val=""/>
+      <w:lvlJc w:val="left"/>
+      <w:pPr>
+        <w:ind w:left="720" w:hanging="360"/>
+      </w:pPr>
+      <w:rPr>
+        <w:rFonts w:ascii="Symbol" w:hAnsi="Symbol" w:hint="default"/>
+      </w:rPr>
+    </w:lvl>
+    <w:lvl w:ilvl="1" w:tplc="08090003" w:tentative="1">
+      <w:start w:val="1"/>
+      <w:numFmt w:val="bullet"/>
+      <w:lvlText w:val="o"/>
+      <w:lvlJc w:val="left"/>
+      <w:pPr>
+        <w:ind w:left="1440" w:hanging="360"/>
+      </w:pPr>
+      <w:rPr>
+        <w:rFonts w:ascii="Courier New" w:hAnsi="Courier New" w:cs="Courier New" w:hint="default"/>
+      </w:rPr>
+    </w:lvl>
+    <w:lvl w:ilvl="2" w:tplc="08090005" w:tentative="1">
+      <w:start w:val="1"/>
+      <w:numFmt w:val="bullet"/>
+      <w:lvlText w:val=""/>
+      <w:lvlJc w:val="left"/>
+      <w:pPr>
+        <w:ind w:left="2160" w:hanging="360"/>
+      </w:pPr>
+      <w:rPr>
+        <w:rFonts w:ascii="Wingdings" w:hAnsi="Wingdings" w:hint="default"/>
+      </w:rPr>
+    </w:lvl>
+    <w:lvl w:ilvl="3" w:tplc="08090001" w:tentative="1">
+      <w:start w:val="1"/>
+      <w:numFmt w:val="bullet"/>
+      <w:lvlText w:val=""/>
+      <w:lvlJc w:val="left"/>
+      <w:pPr>
+        <w:ind w:left="2880" w:hanging="360"/>
+      </w:pPr>
+      <w:rPr>
+        <w:rFonts w:ascii="Symbol" w:hAnsi="Symbol" w:hint="default"/>
+      </w:rPr>
+    </w:lvl>
+    <w:lvl w:ilvl="4" w:tplc="08090003" w:tentative="1">
+      <w:start w:val="1"/>
+      <w:numFmt w:val="bullet"/>
+      <w:lvlText w:val="o"/>
+      <w:lvlJc w:val="left"/>
+      <w:pPr>
+        <w:ind w:left="3600" w:hanging="360"/>
+      </w:pPr>
+      <w:rPr>
+        <w:rFonts w:ascii="Courier New" w:hAnsi="Courier New" w:cs="Courier New" w:hint="default"/>
+      </w:rPr>
+    </w:lvl>
+    <w:lvl w:ilvl="5" w:tplc="08090005" w:tentative="1">
+      <w:start w:val="1"/>
+      <w:numFmt w:val="bullet"/>
+      <w:lvlText w:val=""/>
+      <w:lvlJc w:val="left"/>
+      <w:pPr>
+        <w:ind w:left="4320" w:hanging="360"/>
+      </w:pPr>
+      <w:rPr>
+        <w:rFonts w:ascii="Wingdings" w:hAnsi="Wingdings" w:hint="default"/>
+      </w:rPr>
+    </w:lvl>
+    <w:lvl w:ilvl="6" w:tplc="08090001" w:tentative="1">
+      <w:start w:val="1"/>
+      <w:numFmt w:val="bullet"/>
+      <w:lvlText w:val=""/>
+      <w:lvlJc w:val="left"/>
+      <w:pPr>
+        <w:ind w:left="5040" w:hanging="360"/>
+      </w:pPr>
+      <w:rPr>
+        <w:rFonts w:ascii="Symbol" w:hAnsi="Symbol" w:hint="default"/>
+      </w:rPr>
+    </w:lvl>
+    <w:lvl w:ilvl="7" w:tplc="08090003" w:tentative="1">
+      <w:start w:val="1"/>
+      <w:numFmt w:val="bullet"/>
+      <w:lvlText w:val="o"/>
+      <w:lvlJc w:val="left"/>
+      <w:pPr>
+        <w:ind w:left="5760" w:hanging="360"/>
+      </w:pPr>
+      <w:rPr>
+        <w:rFonts w:ascii="Courier New" w:hAnsi="Courier New" w:cs="Courier New" w:hint="default"/>
+      </w:rPr>
+    </w:lvl>
+    <w:lvl w:ilvl="8" w:tplc="08090005" w:tentative="1">
+      <w:start w:val="1"/>
+      <w:numFmt w:val="bullet"/>
+      <w:lvlText w:val=""/>
+      <w:lvlJc w:val="left"/>
+      <w:pPr>
+        <w:ind w:left="6480" w:hanging="360"/>
+      </w:pPr>
+      <w:rPr>
+        <w:rFonts w:ascii="Wingdings" w:hAnsi="Wingdings" w:hint="default"/>
+      </w:rPr>
+    </w:lvl>
+  </w:abstractNum>
+  <w:num w:numId="1" w16cid:durableId="270552267">
+    <w:abstractNumId w:val="0"/>
+  </w:num>
+</w:numbering>
 </file>
 
 <file path=word/styles.xml><?xml version="1.0" encoding="utf-8"?>
@@ -942,6 +1948,23 @@
       <w:spacing w:val="5"/>
     </w:rPr>
   </w:style>
+  <w:style w:type="paragraph" w:customStyle="1" w:styleId="p1">
+    <w:name w:val="p1"/>
+    <w:basedOn w:val="Normal"/>
+    <w:rsid w:val="00D04560"/>
+    <w:pPr>
+      <w:spacing w:after="0" w:line="240" w:lineRule="auto"/>
+    </w:pPr>
+    <w:rPr>
+      <w:rFonts w:ascii="Arial" w:eastAsia="Times New Roman" w:hAnsi="Arial" w:cs="Arial"/>
+      <w:color w:val="000000"/>
+      <w:kern w:val="0"/>
+      <w:sz w:val="17"/>
+      <w:szCs w:val="17"/>
+      <w:lang w:eastAsia="en-GB"/>
+      <w14:ligatures w14:val="none"/>
+    </w:rPr>
+  </w:style>
 </w:styles>
 </file>
 

</xml_diff>

<commit_message>
Converted 1NF to 2NF – removed partial dependencies and created new relations
</commit_message>
<xml_diff>
--- a/Applied/App04/A4-2 NORMALISATION.docx
+++ b/Applied/App04/A4-2 NORMALISATION.docx
@@ -38,118 +38,249 @@
     <w:p>
       <w:pPr>
         <w:pStyle w:val="p1"/>
-      </w:pPr>
-      <w:r>
         <w:rPr>
           <w:b/>
           <w:bCs/>
-        </w:rPr>
-        <w:t>UNF</w:t>
-      </w:r>
+          <w:sz w:val="21"/>
+          <w:szCs w:val="21"/>
+        </w:rPr>
+      </w:pPr>
     </w:p>
     <w:p>
       <w:pPr>
         <w:pStyle w:val="p1"/>
-      </w:pPr>
-      <w:r>
-        <w:t xml:space="preserve">PROPERTY (prop_no, prop_address, </w:t>
-      </w:r>
-      <w:proofErr w:type="spellStart"/>
-      <w:r>
-        <w:t>owner</w:t>
-      </w:r>
-      <w:r>
-        <w:t>_</w:t>
-      </w:r>
-      <w:r>
-        <w:t>no</w:t>
-      </w:r>
-      <w:proofErr w:type="spellEnd"/>
-      <w:r>
-        <w:t xml:space="preserve">, </w:t>
-      </w:r>
-      <w:proofErr w:type="spellStart"/>
-      <w:r>
-        <w:t>owner_givname</w:t>
-      </w:r>
-      <w:proofErr w:type="spellEnd"/>
-      <w:r>
-        <w:t xml:space="preserve">, </w:t>
-      </w:r>
-      <w:proofErr w:type="spellStart"/>
-      <w:r>
-        <w:t>owner</w:t>
-      </w:r>
-      <w:r>
-        <w:t>_</w:t>
-      </w:r>
-      <w:r>
-        <w:t>famname</w:t>
-      </w:r>
-      <w:proofErr w:type="spellEnd"/>
-      <w:r>
-        <w:t>,</w:t>
-      </w:r>
-      <w:r>
-        <w:t xml:space="preserve"> </w:t>
-      </w:r>
-      <w:proofErr w:type="spellStart"/>
-      <w:r>
-        <w:t>owner</w:t>
-      </w:r>
-      <w:r>
-        <w:t>_</w:t>
-      </w:r>
-      <w:r>
-        <w:t>address</w:t>
-      </w:r>
-      <w:proofErr w:type="spellEnd"/>
-      <w:r>
-        <w:t>, (maint</w:t>
-      </w:r>
-      <w:r>
-        <w:t>_</w:t>
-      </w:r>
-      <w:r>
-        <w:t>datetime,</w:t>
-      </w:r>
-      <w:r>
-        <w:t xml:space="preserve"> </w:t>
-      </w:r>
-      <w:proofErr w:type="spellStart"/>
-      <w:r>
-        <w:t>maint</w:t>
-      </w:r>
-      <w:r>
-        <w:t>_</w:t>
-      </w:r>
-      <w:r>
-        <w:t>desc</w:t>
-      </w:r>
-      <w:proofErr w:type="spellEnd"/>
-      <w:r>
-        <w:t>, maint</w:t>
-      </w:r>
-      <w:r>
-        <w:t>_</w:t>
-      </w:r>
-      <w:r>
-        <w:t>cost))</w:t>
-      </w:r>
-    </w:p>
-    <w:p>
-      <w:pPr>
-        <w:pStyle w:val="p1"/>
-      </w:pPr>
-    </w:p>
-    <w:p>
-      <w:pPr>
-        <w:pStyle w:val="p1"/>
+        <w:rPr>
+          <w:sz w:val="21"/>
+          <w:szCs w:val="21"/>
+        </w:rPr>
       </w:pPr>
       <w:r>
         <w:rPr>
           <w:b/>
           <w:bCs/>
+          <w:sz w:val="21"/>
+          <w:szCs w:val="21"/>
+        </w:rPr>
+        <w:t>UNF</w:t>
+      </w:r>
+    </w:p>
+    <w:p>
+      <w:pPr>
+        <w:pStyle w:val="p1"/>
+        <w:rPr>
+          <w:sz w:val="21"/>
+          <w:szCs w:val="21"/>
+        </w:rPr>
+      </w:pPr>
+      <w:r>
+        <w:rPr>
+          <w:sz w:val="21"/>
+          <w:szCs w:val="21"/>
+        </w:rPr>
+        <w:t xml:space="preserve">PROPERTY (prop_no, prop_address, </w:t>
+      </w:r>
+      <w:proofErr w:type="spellStart"/>
+      <w:r>
+        <w:rPr>
+          <w:sz w:val="21"/>
+          <w:szCs w:val="21"/>
+        </w:rPr>
+        <w:t>owner</w:t>
+      </w:r>
+      <w:r>
+        <w:rPr>
+          <w:sz w:val="21"/>
+          <w:szCs w:val="21"/>
+        </w:rPr>
+        <w:t>_</w:t>
+      </w:r>
+      <w:r>
+        <w:rPr>
+          <w:sz w:val="21"/>
+          <w:szCs w:val="21"/>
+        </w:rPr>
+        <w:t>no</w:t>
+      </w:r>
+      <w:proofErr w:type="spellEnd"/>
+      <w:r>
+        <w:rPr>
+          <w:sz w:val="21"/>
+          <w:szCs w:val="21"/>
+        </w:rPr>
+        <w:t xml:space="preserve">, </w:t>
+      </w:r>
+      <w:proofErr w:type="spellStart"/>
+      <w:r>
+        <w:rPr>
+          <w:sz w:val="21"/>
+          <w:szCs w:val="21"/>
+        </w:rPr>
+        <w:t>owner_givname</w:t>
+      </w:r>
+      <w:proofErr w:type="spellEnd"/>
+      <w:r>
+        <w:rPr>
+          <w:sz w:val="21"/>
+          <w:szCs w:val="21"/>
+        </w:rPr>
+        <w:t xml:space="preserve">, </w:t>
+      </w:r>
+      <w:proofErr w:type="spellStart"/>
+      <w:r>
+        <w:rPr>
+          <w:sz w:val="21"/>
+          <w:szCs w:val="21"/>
+        </w:rPr>
+        <w:t>owner</w:t>
+      </w:r>
+      <w:r>
+        <w:rPr>
+          <w:sz w:val="21"/>
+          <w:szCs w:val="21"/>
+        </w:rPr>
+        <w:t>_</w:t>
+      </w:r>
+      <w:r>
+        <w:rPr>
+          <w:sz w:val="21"/>
+          <w:szCs w:val="21"/>
+        </w:rPr>
+        <w:t>famname</w:t>
+      </w:r>
+      <w:proofErr w:type="spellEnd"/>
+      <w:r>
+        <w:rPr>
+          <w:sz w:val="21"/>
+          <w:szCs w:val="21"/>
+        </w:rPr>
+        <w:t>,</w:t>
+      </w:r>
+      <w:r>
+        <w:rPr>
+          <w:sz w:val="21"/>
+          <w:szCs w:val="21"/>
+        </w:rPr>
+        <w:t xml:space="preserve"> </w:t>
+      </w:r>
+      <w:proofErr w:type="spellStart"/>
+      <w:r>
+        <w:rPr>
+          <w:sz w:val="21"/>
+          <w:szCs w:val="21"/>
+        </w:rPr>
+        <w:t>owner</w:t>
+      </w:r>
+      <w:r>
+        <w:rPr>
+          <w:sz w:val="21"/>
+          <w:szCs w:val="21"/>
+        </w:rPr>
+        <w:t>_</w:t>
+      </w:r>
+      <w:r>
+        <w:rPr>
+          <w:sz w:val="21"/>
+          <w:szCs w:val="21"/>
+        </w:rPr>
+        <w:t>address</w:t>
+      </w:r>
+      <w:proofErr w:type="spellEnd"/>
+      <w:r>
+        <w:rPr>
+          <w:sz w:val="21"/>
+          <w:szCs w:val="21"/>
+        </w:rPr>
+        <w:t>, (maint</w:t>
+      </w:r>
+      <w:r>
+        <w:rPr>
+          <w:sz w:val="21"/>
+          <w:szCs w:val="21"/>
+        </w:rPr>
+        <w:t>_</w:t>
+      </w:r>
+      <w:r>
+        <w:rPr>
+          <w:sz w:val="21"/>
+          <w:szCs w:val="21"/>
+        </w:rPr>
+        <w:t>datetime,</w:t>
+      </w:r>
+      <w:r>
+        <w:rPr>
+          <w:sz w:val="21"/>
+          <w:szCs w:val="21"/>
+        </w:rPr>
+        <w:t xml:space="preserve"> </w:t>
+      </w:r>
+      <w:proofErr w:type="spellStart"/>
+      <w:r>
+        <w:rPr>
+          <w:sz w:val="21"/>
+          <w:szCs w:val="21"/>
+        </w:rPr>
+        <w:t>maint</w:t>
+      </w:r>
+      <w:r>
+        <w:rPr>
+          <w:sz w:val="21"/>
+          <w:szCs w:val="21"/>
+        </w:rPr>
+        <w:t>_</w:t>
+      </w:r>
+      <w:r>
+        <w:rPr>
+          <w:sz w:val="21"/>
+          <w:szCs w:val="21"/>
+        </w:rPr>
+        <w:t>desc</w:t>
+      </w:r>
+      <w:proofErr w:type="spellEnd"/>
+      <w:r>
+        <w:rPr>
+          <w:sz w:val="21"/>
+          <w:szCs w:val="21"/>
+        </w:rPr>
+        <w:t>, maint</w:t>
+      </w:r>
+      <w:r>
+        <w:rPr>
+          <w:sz w:val="21"/>
+          <w:szCs w:val="21"/>
+        </w:rPr>
+        <w:t>_</w:t>
+      </w:r>
+      <w:r>
+        <w:rPr>
+          <w:sz w:val="21"/>
+          <w:szCs w:val="21"/>
+        </w:rPr>
+        <w:t>cost))</w:t>
+      </w:r>
+    </w:p>
+    <w:p>
+      <w:pPr>
+        <w:pStyle w:val="p1"/>
+        <w:rPr>
+          <w:sz w:val="21"/>
+          <w:szCs w:val="21"/>
+        </w:rPr>
+      </w:pPr>
+    </w:p>
+    <w:p>
+      <w:pPr>
+        <w:pStyle w:val="p1"/>
+        <w:rPr>
+          <w:sz w:val="21"/>
+          <w:szCs w:val="21"/>
+        </w:rPr>
+      </w:pPr>
+      <w:r>
+        <w:rPr>
+          <w:b/>
+          <w:bCs/>
+          <w:sz w:val="21"/>
+          <w:szCs w:val="21"/>
         </w:rPr>
         <w:t>1NF</w:t>
       </w:r>
@@ -157,72 +288,146 @@
     <w:p>
       <w:pPr>
         <w:pStyle w:val="p1"/>
-      </w:pPr>
-      <w:r>
+        <w:rPr>
+          <w:sz w:val="21"/>
+          <w:szCs w:val="21"/>
+        </w:rPr>
+      </w:pPr>
+      <w:r>
+        <w:rPr>
+          <w:sz w:val="21"/>
+          <w:szCs w:val="21"/>
+        </w:rPr>
         <w:t>PROPERTY (</w:t>
       </w:r>
       <w:r>
         <w:rPr>
+          <w:sz w:val="21"/>
+          <w:szCs w:val="21"/>
           <w:u w:val="single"/>
         </w:rPr>
         <w:t>prop_no</w:t>
       </w:r>
       <w:r>
+        <w:rPr>
+          <w:sz w:val="21"/>
+          <w:szCs w:val="21"/>
+        </w:rPr>
         <w:t xml:space="preserve">, prop_address, </w:t>
       </w:r>
       <w:proofErr w:type="spellStart"/>
       <w:r>
+        <w:rPr>
+          <w:sz w:val="21"/>
+          <w:szCs w:val="21"/>
+        </w:rPr>
         <w:t>owner</w:t>
       </w:r>
       <w:r>
+        <w:rPr>
+          <w:sz w:val="21"/>
+          <w:szCs w:val="21"/>
+        </w:rPr>
         <w:t>_</w:t>
       </w:r>
       <w:r>
+        <w:rPr>
+          <w:sz w:val="21"/>
+          <w:szCs w:val="21"/>
+        </w:rPr>
         <w:t>no</w:t>
       </w:r>
       <w:proofErr w:type="spellEnd"/>
       <w:r>
+        <w:rPr>
+          <w:sz w:val="21"/>
+          <w:szCs w:val="21"/>
+        </w:rPr>
         <w:t xml:space="preserve">, </w:t>
       </w:r>
       <w:proofErr w:type="spellStart"/>
       <w:r>
+        <w:rPr>
+          <w:sz w:val="21"/>
+          <w:szCs w:val="21"/>
+        </w:rPr>
         <w:t>owner_givname</w:t>
       </w:r>
       <w:proofErr w:type="spellEnd"/>
       <w:r>
+        <w:rPr>
+          <w:sz w:val="21"/>
+          <w:szCs w:val="21"/>
+        </w:rPr>
         <w:t xml:space="preserve">, </w:t>
       </w:r>
       <w:proofErr w:type="spellStart"/>
       <w:r>
+        <w:rPr>
+          <w:sz w:val="21"/>
+          <w:szCs w:val="21"/>
+        </w:rPr>
         <w:t>owner</w:t>
       </w:r>
       <w:r>
+        <w:rPr>
+          <w:sz w:val="21"/>
+          <w:szCs w:val="21"/>
+        </w:rPr>
         <w:t>_</w:t>
       </w:r>
       <w:proofErr w:type="gramStart"/>
       <w:r>
+        <w:rPr>
+          <w:sz w:val="21"/>
+          <w:szCs w:val="21"/>
+        </w:rPr>
         <w:t>f</w:t>
       </w:r>
       <w:r>
+        <w:rPr>
+          <w:sz w:val="21"/>
+          <w:szCs w:val="21"/>
+        </w:rPr>
         <w:t>amname,owner</w:t>
       </w:r>
       <w:proofErr w:type="gramEnd"/>
       <w:r>
+        <w:rPr>
+          <w:sz w:val="21"/>
+          <w:szCs w:val="21"/>
+        </w:rPr>
         <w:t>_</w:t>
       </w:r>
       <w:r>
+        <w:rPr>
+          <w:sz w:val="21"/>
+          <w:szCs w:val="21"/>
+        </w:rPr>
         <w:t>address</w:t>
       </w:r>
       <w:proofErr w:type="spellEnd"/>
       <w:r>
+        <w:rPr>
+          <w:sz w:val="21"/>
+          <w:szCs w:val="21"/>
+        </w:rPr>
         <w:t>)</w:t>
       </w:r>
     </w:p>
     <w:p>
       <w:pPr>
         <w:pStyle w:val="p1"/>
-      </w:pPr>
-      <w:r>
+        <w:rPr>
+          <w:sz w:val="21"/>
+          <w:szCs w:val="21"/>
+        </w:rPr>
+      </w:pPr>
+      <w:r>
+        <w:rPr>
+          <w:sz w:val="21"/>
+          <w:szCs w:val="21"/>
+        </w:rPr>
         <w:t>CK:</w:t>
       </w:r>
     </w:p>
@@ -233,78 +438,142 @@
           <w:ilvl w:val="0"/>
           <w:numId w:val="1"/>
         </w:numPr>
-      </w:pPr>
-      <w:r>
+        <w:rPr>
+          <w:sz w:val="21"/>
+          <w:szCs w:val="21"/>
+        </w:rPr>
+      </w:pPr>
+      <w:r>
+        <w:rPr>
+          <w:sz w:val="21"/>
+          <w:szCs w:val="21"/>
+        </w:rPr>
         <w:t>prop_no</w:t>
       </w:r>
     </w:p>
     <w:p>
       <w:pPr>
         <w:pStyle w:val="p1"/>
+        <w:rPr>
+          <w:sz w:val="21"/>
+          <w:szCs w:val="21"/>
+        </w:rPr>
       </w:pPr>
     </w:p>
     <w:p>
       <w:pPr>
         <w:pStyle w:val="p1"/>
-      </w:pPr>
-      <w:r>
+        <w:rPr>
+          <w:sz w:val="21"/>
+          <w:szCs w:val="21"/>
+        </w:rPr>
+      </w:pPr>
+      <w:r>
+        <w:rPr>
+          <w:sz w:val="21"/>
+          <w:szCs w:val="21"/>
+        </w:rPr>
         <w:t>MAINTENANCE (</w:t>
       </w:r>
       <w:r>
         <w:rPr>
+          <w:sz w:val="21"/>
+          <w:szCs w:val="21"/>
           <w:u w:val="single"/>
         </w:rPr>
         <w:t>prop_no</w:t>
       </w:r>
       <w:r>
+        <w:rPr>
+          <w:sz w:val="21"/>
+          <w:szCs w:val="21"/>
+        </w:rPr>
         <w:t xml:space="preserve">, </w:t>
       </w:r>
       <w:r>
         <w:rPr>
+          <w:sz w:val="21"/>
+          <w:szCs w:val="21"/>
           <w:u w:val="single"/>
         </w:rPr>
         <w:t>maint</w:t>
       </w:r>
       <w:r>
         <w:rPr>
+          <w:sz w:val="21"/>
+          <w:szCs w:val="21"/>
           <w:u w:val="single"/>
         </w:rPr>
         <w:t>_</w:t>
       </w:r>
       <w:r>
         <w:rPr>
+          <w:sz w:val="21"/>
+          <w:szCs w:val="21"/>
           <w:u w:val="single"/>
         </w:rPr>
         <w:t>datetime,</w:t>
       </w:r>
       <w:r>
+        <w:rPr>
+          <w:sz w:val="21"/>
+          <w:szCs w:val="21"/>
+        </w:rPr>
         <w:t xml:space="preserve"> </w:t>
       </w:r>
       <w:proofErr w:type="spellStart"/>
       <w:r>
+        <w:rPr>
+          <w:sz w:val="21"/>
+          <w:szCs w:val="21"/>
+        </w:rPr>
         <w:t>maint</w:t>
       </w:r>
       <w:r>
+        <w:rPr>
+          <w:sz w:val="21"/>
+          <w:szCs w:val="21"/>
+        </w:rPr>
         <w:t>_</w:t>
       </w:r>
       <w:r>
+        <w:rPr>
+          <w:sz w:val="21"/>
+          <w:szCs w:val="21"/>
+        </w:rPr>
         <w:t>desc</w:t>
       </w:r>
       <w:proofErr w:type="spellEnd"/>
       <w:r>
+        <w:rPr>
+          <w:sz w:val="21"/>
+          <w:szCs w:val="21"/>
+        </w:rPr>
         <w:t>, maint_cost)</w:t>
       </w:r>
     </w:p>
     <w:p>
       <w:pPr>
         <w:pStyle w:val="p1"/>
+        <w:rPr>
+          <w:sz w:val="21"/>
+          <w:szCs w:val="21"/>
+        </w:rPr>
       </w:pPr>
     </w:p>
     <w:p>
       <w:pPr>
         <w:pStyle w:val="p1"/>
-      </w:pPr>
-      <w:r>
+        <w:rPr>
+          <w:sz w:val="21"/>
+          <w:szCs w:val="21"/>
+        </w:rPr>
+      </w:pPr>
+      <w:r>
+        <w:rPr>
+          <w:sz w:val="21"/>
+          <w:szCs w:val="21"/>
+        </w:rPr>
         <w:t>CK:</w:t>
       </w:r>
     </w:p>
@@ -315,39 +584,83 @@
           <w:ilvl w:val="0"/>
           <w:numId w:val="1"/>
         </w:numPr>
-      </w:pPr>
-      <w:r>
+        <w:rPr>
+          <w:sz w:val="21"/>
+          <w:szCs w:val="21"/>
+        </w:rPr>
+      </w:pPr>
+      <w:r>
+        <w:rPr>
+          <w:sz w:val="21"/>
+          <w:szCs w:val="21"/>
+        </w:rPr>
         <w:t>prop_no, maint</w:t>
       </w:r>
       <w:r>
+        <w:rPr>
+          <w:sz w:val="21"/>
+          <w:szCs w:val="21"/>
+        </w:rPr>
         <w:t>_</w:t>
       </w:r>
       <w:r>
+        <w:rPr>
+          <w:sz w:val="21"/>
+          <w:szCs w:val="21"/>
+        </w:rPr>
         <w:t>d</w:t>
       </w:r>
       <w:r>
+        <w:rPr>
+          <w:sz w:val="21"/>
+          <w:szCs w:val="21"/>
+        </w:rPr>
         <w:t>a</w:t>
       </w:r>
       <w:r>
+        <w:rPr>
+          <w:sz w:val="21"/>
+          <w:szCs w:val="21"/>
+        </w:rPr>
         <w:t>tetime</w:t>
       </w:r>
     </w:p>
     <w:p>
       <w:pPr>
         <w:pStyle w:val="p1"/>
+        <w:rPr>
+          <w:sz w:val="21"/>
+          <w:szCs w:val="21"/>
+        </w:rPr>
       </w:pPr>
     </w:p>
     <w:p>
       <w:pPr>
         <w:pStyle w:val="p1"/>
-      </w:pPr>
-      <w:r>
+        <w:rPr>
+          <w:sz w:val="21"/>
+          <w:szCs w:val="21"/>
+        </w:rPr>
+      </w:pPr>
+      <w:r>
+        <w:rPr>
+          <w:sz w:val="21"/>
+          <w:szCs w:val="21"/>
+        </w:rPr>
         <w:t>Partial Dependencies:</w:t>
       </w:r>
       <w:r>
+        <w:rPr>
+          <w:sz w:val="21"/>
+          <w:szCs w:val="21"/>
+        </w:rPr>
         <w:t xml:space="preserve"> </w:t>
       </w:r>
       <w:r>
+        <w:rPr>
+          <w:sz w:val="21"/>
+          <w:szCs w:val="21"/>
+        </w:rPr>
         <w:t>None</w:t>
       </w:r>
     </w:p>
@@ -366,11 +679,17 @@
     <w:p>
       <w:pPr>
         <w:pStyle w:val="p1"/>
+        <w:rPr>
+          <w:sz w:val="21"/>
+          <w:szCs w:val="21"/>
+        </w:rPr>
       </w:pPr>
       <w:r>
         <w:rPr>
           <w:b/>
           <w:bCs/>
+          <w:sz w:val="21"/>
+          <w:szCs w:val="21"/>
         </w:rPr>
         <w:t>2NF</w:t>
       </w:r>
@@ -378,187 +697,371 @@
     <w:p>
       <w:pPr>
         <w:pStyle w:val="p1"/>
+        <w:rPr>
+          <w:sz w:val="21"/>
+          <w:szCs w:val="21"/>
+        </w:rPr>
       </w:pPr>
     </w:p>
     <w:p>
       <w:pPr>
         <w:pStyle w:val="p1"/>
-      </w:pPr>
-      <w:r>
+        <w:rPr>
+          <w:sz w:val="21"/>
+          <w:szCs w:val="21"/>
+        </w:rPr>
+      </w:pPr>
+      <w:r>
+        <w:rPr>
+          <w:sz w:val="21"/>
+          <w:szCs w:val="21"/>
+        </w:rPr>
         <w:t>PROPERTY (</w:t>
       </w:r>
       <w:r>
         <w:rPr>
+          <w:sz w:val="21"/>
+          <w:szCs w:val="21"/>
           <w:u w:val="single"/>
         </w:rPr>
         <w:t>prop_no</w:t>
       </w:r>
       <w:r>
+        <w:rPr>
+          <w:sz w:val="21"/>
+          <w:szCs w:val="21"/>
+        </w:rPr>
         <w:t xml:space="preserve">, prop_address, </w:t>
       </w:r>
       <w:proofErr w:type="spellStart"/>
       <w:r>
+        <w:rPr>
+          <w:sz w:val="21"/>
+          <w:szCs w:val="21"/>
+        </w:rPr>
         <w:t>owner</w:t>
       </w:r>
       <w:r>
+        <w:rPr>
+          <w:sz w:val="21"/>
+          <w:szCs w:val="21"/>
+        </w:rPr>
         <w:t>_</w:t>
       </w:r>
       <w:r>
+        <w:rPr>
+          <w:sz w:val="21"/>
+          <w:szCs w:val="21"/>
+        </w:rPr>
         <w:t>no</w:t>
       </w:r>
       <w:proofErr w:type="spellEnd"/>
       <w:r>
+        <w:rPr>
+          <w:sz w:val="21"/>
+          <w:szCs w:val="21"/>
+        </w:rPr>
         <w:t xml:space="preserve">, </w:t>
       </w:r>
       <w:proofErr w:type="spellStart"/>
       <w:r>
+        <w:rPr>
+          <w:sz w:val="21"/>
+          <w:szCs w:val="21"/>
+        </w:rPr>
         <w:t>owner_givname</w:t>
       </w:r>
       <w:proofErr w:type="spellEnd"/>
       <w:r>
+        <w:rPr>
+          <w:sz w:val="21"/>
+          <w:szCs w:val="21"/>
+        </w:rPr>
         <w:t xml:space="preserve">, </w:t>
       </w:r>
       <w:proofErr w:type="spellStart"/>
       <w:r>
+        <w:rPr>
+          <w:sz w:val="21"/>
+          <w:szCs w:val="21"/>
+        </w:rPr>
         <w:t>owner</w:t>
       </w:r>
       <w:r>
+        <w:rPr>
+          <w:sz w:val="21"/>
+          <w:szCs w:val="21"/>
+        </w:rPr>
         <w:t>_</w:t>
       </w:r>
       <w:proofErr w:type="gramStart"/>
       <w:r>
+        <w:rPr>
+          <w:sz w:val="21"/>
+          <w:szCs w:val="21"/>
+        </w:rPr>
         <w:t>famname,owner</w:t>
       </w:r>
       <w:proofErr w:type="gramEnd"/>
       <w:r>
+        <w:rPr>
+          <w:sz w:val="21"/>
+          <w:szCs w:val="21"/>
+        </w:rPr>
         <w:t>_a</w:t>
       </w:r>
       <w:r>
+        <w:rPr>
+          <w:sz w:val="21"/>
+          <w:szCs w:val="21"/>
+        </w:rPr>
         <w:t>ddress</w:t>
       </w:r>
       <w:proofErr w:type="spellEnd"/>
       <w:r>
+        <w:rPr>
+          <w:sz w:val="21"/>
+          <w:szCs w:val="21"/>
+        </w:rPr>
         <w:t>)</w:t>
       </w:r>
     </w:p>
     <w:p>
       <w:pPr>
         <w:pStyle w:val="p1"/>
+        <w:rPr>
+          <w:sz w:val="21"/>
+          <w:szCs w:val="21"/>
+        </w:rPr>
       </w:pPr>
     </w:p>
     <w:p>
       <w:pPr>
         <w:pStyle w:val="p1"/>
-      </w:pPr>
-      <w:r>
+        <w:rPr>
+          <w:sz w:val="21"/>
+          <w:szCs w:val="21"/>
+        </w:rPr>
+      </w:pPr>
+      <w:r>
+        <w:rPr>
+          <w:sz w:val="21"/>
+          <w:szCs w:val="21"/>
+        </w:rPr>
         <w:t>MAINTENANCE (</w:t>
       </w:r>
       <w:r>
         <w:rPr>
+          <w:sz w:val="21"/>
+          <w:szCs w:val="21"/>
           <w:u w:val="single"/>
         </w:rPr>
         <w:t>prop_no, maint</w:t>
       </w:r>
       <w:r>
         <w:rPr>
+          <w:sz w:val="21"/>
+          <w:szCs w:val="21"/>
           <w:u w:val="single"/>
         </w:rPr>
         <w:t>_</w:t>
       </w:r>
       <w:r>
         <w:rPr>
+          <w:sz w:val="21"/>
+          <w:szCs w:val="21"/>
           <w:u w:val="single"/>
         </w:rPr>
         <w:t>datetime</w:t>
       </w:r>
       <w:r>
+        <w:rPr>
+          <w:sz w:val="21"/>
+          <w:szCs w:val="21"/>
+        </w:rPr>
         <w:t xml:space="preserve">, </w:t>
       </w:r>
       <w:proofErr w:type="spellStart"/>
       <w:r>
+        <w:rPr>
+          <w:sz w:val="21"/>
+          <w:szCs w:val="21"/>
+        </w:rPr>
         <w:t>maint</w:t>
       </w:r>
       <w:r>
+        <w:rPr>
+          <w:sz w:val="21"/>
+          <w:szCs w:val="21"/>
+        </w:rPr>
         <w:t>_</w:t>
       </w:r>
       <w:r>
+        <w:rPr>
+          <w:sz w:val="21"/>
+          <w:szCs w:val="21"/>
+        </w:rPr>
         <w:t>desc</w:t>
       </w:r>
       <w:proofErr w:type="spellEnd"/>
       <w:r>
+        <w:rPr>
+          <w:sz w:val="21"/>
+          <w:szCs w:val="21"/>
+        </w:rPr>
         <w:t>, maint</w:t>
       </w:r>
       <w:r>
+        <w:rPr>
+          <w:sz w:val="21"/>
+          <w:szCs w:val="21"/>
+        </w:rPr>
         <w:t>_</w:t>
       </w:r>
       <w:r>
+        <w:rPr>
+          <w:sz w:val="21"/>
+          <w:szCs w:val="21"/>
+        </w:rPr>
         <w:t>cost)</w:t>
       </w:r>
     </w:p>
     <w:p>
       <w:pPr>
         <w:pStyle w:val="p1"/>
+        <w:rPr>
+          <w:sz w:val="21"/>
+          <w:szCs w:val="21"/>
+        </w:rPr>
       </w:pPr>
     </w:p>
     <w:p>
       <w:pPr>
         <w:pStyle w:val="p1"/>
-      </w:pPr>
-      <w:r>
+        <w:rPr>
+          <w:sz w:val="21"/>
+          <w:szCs w:val="21"/>
+        </w:rPr>
+      </w:pPr>
+      <w:r>
+        <w:rPr>
+          <w:sz w:val="21"/>
+          <w:szCs w:val="21"/>
+        </w:rPr>
         <w:t>Transitive dependencies:</w:t>
       </w:r>
     </w:p>
     <w:p>
       <w:pPr>
         <w:pStyle w:val="p1"/>
+        <w:rPr>
+          <w:sz w:val="21"/>
+          <w:szCs w:val="21"/>
+        </w:rPr>
       </w:pPr>
       <w:proofErr w:type="spellStart"/>
       <w:r>
+        <w:rPr>
+          <w:sz w:val="21"/>
+          <w:szCs w:val="21"/>
+        </w:rPr>
         <w:t>o</w:t>
       </w:r>
       <w:r>
+        <w:rPr>
+          <w:sz w:val="21"/>
+          <w:szCs w:val="21"/>
+        </w:rPr>
         <w:t>wner</w:t>
       </w:r>
       <w:r>
+        <w:rPr>
+          <w:sz w:val="21"/>
+          <w:szCs w:val="21"/>
+        </w:rPr>
         <w:t>_</w:t>
       </w:r>
       <w:r>
+        <w:rPr>
+          <w:sz w:val="21"/>
+          <w:szCs w:val="21"/>
+        </w:rPr>
         <w:t>no</w:t>
       </w:r>
       <w:proofErr w:type="spellEnd"/>
       <w:r>
+        <w:rPr>
+          <w:sz w:val="21"/>
+          <w:szCs w:val="21"/>
+        </w:rPr>
         <w:t xml:space="preserve"> → </w:t>
       </w:r>
       <w:proofErr w:type="spellStart"/>
       <w:r>
+        <w:rPr>
+          <w:sz w:val="21"/>
+          <w:szCs w:val="21"/>
+        </w:rPr>
         <w:t>owner_givname</w:t>
       </w:r>
       <w:proofErr w:type="spellEnd"/>
       <w:r>
+        <w:rPr>
+          <w:sz w:val="21"/>
+          <w:szCs w:val="21"/>
+        </w:rPr>
         <w:t xml:space="preserve">, </w:t>
       </w:r>
       <w:proofErr w:type="spellStart"/>
       <w:r>
+        <w:rPr>
+          <w:sz w:val="21"/>
+          <w:szCs w:val="21"/>
+        </w:rPr>
         <w:t>owner</w:t>
       </w:r>
       <w:r>
+        <w:rPr>
+          <w:sz w:val="21"/>
+          <w:szCs w:val="21"/>
+        </w:rPr>
         <w:t>_f</w:t>
       </w:r>
       <w:r>
+        <w:rPr>
+          <w:sz w:val="21"/>
+          <w:szCs w:val="21"/>
+        </w:rPr>
         <w:t>amname</w:t>
       </w:r>
       <w:proofErr w:type="spellEnd"/>
       <w:r>
+        <w:rPr>
+          <w:sz w:val="21"/>
+          <w:szCs w:val="21"/>
+        </w:rPr>
         <w:t xml:space="preserve">, </w:t>
       </w:r>
       <w:proofErr w:type="spellStart"/>
       <w:r>
+        <w:rPr>
+          <w:sz w:val="21"/>
+          <w:szCs w:val="21"/>
+        </w:rPr>
         <w:t>owner</w:t>
       </w:r>
       <w:r>
+        <w:rPr>
+          <w:sz w:val="21"/>
+          <w:szCs w:val="21"/>
+        </w:rPr>
         <w:t>_</w:t>
       </w:r>
       <w:r>
+        <w:rPr>
+          <w:sz w:val="21"/>
+          <w:szCs w:val="21"/>
+        </w:rPr>
         <w:t>address</w:t>
       </w:r>
       <w:proofErr w:type="spellEnd"/>
@@ -566,18 +1069,24 @@
     <w:p>
       <w:pPr>
         <w:rPr>
-          <w:lang w:val="en-US"/>
-        </w:rPr>
-      </w:pPr>
-    </w:p>
-    <w:p>
-      <w:pPr>
-        <w:rPr>
-          <w:lang w:val="en-US"/>
-        </w:rPr>
-      </w:pPr>
-      <w:r>
-        <w:rPr>
+          <w:sz w:val="21"/>
+          <w:szCs w:val="21"/>
+          <w:lang w:val="en-US"/>
+        </w:rPr>
+      </w:pPr>
+    </w:p>
+    <w:p>
+      <w:pPr>
+        <w:rPr>
+          <w:b/>
+          <w:bCs/>
+          <w:lang w:val="en-US"/>
+        </w:rPr>
+      </w:pPr>
+      <w:r>
+        <w:rPr>
+          <w:b/>
+          <w:bCs/>
           <w:lang w:val="en-US"/>
         </w:rPr>
         <w:t>3NF</w:t>
@@ -586,27 +1095,203 @@
     <w:p>
       <w:pPr>
         <w:rPr>
+          <w:sz w:val="21"/>
+          <w:szCs w:val="21"/>
           <w:lang w:val="en-US"/>
         </w:rPr>
       </w:pPr>
       <w:proofErr w:type="gramStart"/>
       <w:r>
         <w:rPr>
+          <w:sz w:val="21"/>
+          <w:szCs w:val="21"/>
           <w:lang w:val="en-US"/>
         </w:rPr>
         <w:t>OWNER(</w:t>
       </w:r>
+      <w:proofErr w:type="gramEnd"/>
+      <w:r>
+        <w:rPr>
+          <w:sz w:val="21"/>
+          <w:szCs w:val="21"/>
+          <w:u w:val="single"/>
+          <w:lang w:val="en-US"/>
+        </w:rPr>
+        <w:t xml:space="preserve">owner_no, </w:t>
+      </w:r>
       <w:proofErr w:type="spellStart"/>
+      <w:r>
+        <w:rPr>
+          <w:sz w:val="21"/>
+          <w:szCs w:val="21"/>
+          <w:lang w:val="en-US"/>
+        </w:rPr>
+        <w:t>owner_givname</w:t>
+      </w:r>
+      <w:proofErr w:type="spellEnd"/>
+      <w:r>
+        <w:rPr>
+          <w:sz w:val="21"/>
+          <w:szCs w:val="21"/>
+          <w:lang w:val="en-US"/>
+        </w:rPr>
+        <w:t xml:space="preserve">, </w:t>
+      </w:r>
+      <w:proofErr w:type="spellStart"/>
+      <w:r>
+        <w:rPr>
+          <w:sz w:val="21"/>
+          <w:szCs w:val="21"/>
+          <w:lang w:val="en-US"/>
+        </w:rPr>
+        <w:t>owner_famname</w:t>
+      </w:r>
+      <w:proofErr w:type="spellEnd"/>
+      <w:r>
+        <w:rPr>
+          <w:sz w:val="21"/>
+          <w:szCs w:val="21"/>
+          <w:lang w:val="en-US"/>
+        </w:rPr>
+        <w:t xml:space="preserve">, </w:t>
+      </w:r>
+      <w:proofErr w:type="spellStart"/>
+      <w:r>
+        <w:rPr>
+          <w:sz w:val="21"/>
+          <w:szCs w:val="21"/>
+          <w:lang w:val="en-US"/>
+        </w:rPr>
+        <w:t>owner_address</w:t>
+      </w:r>
+      <w:proofErr w:type="spellEnd"/>
+      <w:r>
+        <w:rPr>
+          <w:sz w:val="21"/>
+          <w:szCs w:val="21"/>
+          <w:lang w:val="en-US"/>
+        </w:rPr>
+        <w:t>)</w:t>
+      </w:r>
+    </w:p>
+    <w:p>
+      <w:pPr>
+        <w:rPr>
+          <w:sz w:val="21"/>
+          <w:szCs w:val="21"/>
+          <w:lang w:val="en-US"/>
+        </w:rPr>
+      </w:pPr>
+      <w:r>
+        <w:rPr>
+          <w:sz w:val="21"/>
+          <w:szCs w:val="21"/>
+          <w:lang w:val="en-US"/>
+        </w:rPr>
+        <w:t>PROPERTY (</w:t>
+      </w:r>
+      <w:r>
+        <w:rPr>
+          <w:sz w:val="21"/>
+          <w:szCs w:val="21"/>
+          <w:u w:val="single"/>
+          <w:lang w:val="en-US"/>
+        </w:rPr>
+        <w:t>prop_no</w:t>
+      </w:r>
+      <w:r>
+        <w:rPr>
+          <w:sz w:val="21"/>
+          <w:szCs w:val="21"/>
+          <w:lang w:val="en-US"/>
+        </w:rPr>
+        <w:t xml:space="preserve">, </w:t>
+      </w:r>
+      <w:proofErr w:type="spellStart"/>
+      <w:r>
+        <w:rPr>
+          <w:sz w:val="21"/>
+          <w:szCs w:val="21"/>
+          <w:lang w:val="en-US"/>
+        </w:rPr>
+        <w:t>prop_address</w:t>
+      </w:r>
+      <w:proofErr w:type="spellEnd"/>
+      <w:r>
+        <w:rPr>
+          <w:sz w:val="21"/>
+          <w:szCs w:val="21"/>
+          <w:lang w:val="en-US"/>
+        </w:rPr>
+        <w:t>, owner_no)</w:t>
+      </w:r>
+    </w:p>
+    <w:p>
+      <w:pPr>
+        <w:rPr>
+          <w:sz w:val="21"/>
+          <w:szCs w:val="21"/>
+          <w:lang w:val="en-US"/>
+        </w:rPr>
+      </w:pPr>
+      <w:proofErr w:type="gramStart"/>
+      <w:r>
+        <w:rPr>
+          <w:sz w:val="21"/>
+          <w:szCs w:val="21"/>
+          <w:lang w:val="en-US"/>
+        </w:rPr>
+        <w:t>MAINTAINENCE(</w:t>
+      </w:r>
       <w:proofErr w:type="gramEnd"/>
       <w:r>
         <w:rPr>
-          <w:lang w:val="en-US"/>
-        </w:rPr>
-        <w:t>owner_no</w:t>
+          <w:sz w:val="21"/>
+          <w:szCs w:val="21"/>
+          <w:u w:val="single"/>
+          <w:lang w:val="en-US"/>
+        </w:rPr>
+        <w:t>prop_no</w:t>
+      </w:r>
+      <w:r>
+        <w:rPr>
+          <w:sz w:val="21"/>
+          <w:szCs w:val="21"/>
+          <w:lang w:val="en-US"/>
+        </w:rPr>
+        <w:t xml:space="preserve">, </w:t>
+      </w:r>
+      <w:r>
+        <w:rPr>
+          <w:sz w:val="21"/>
+          <w:szCs w:val="21"/>
+          <w:u w:val="single"/>
+          <w:lang w:val="en-US"/>
+        </w:rPr>
+        <w:t>maint_datetime</w:t>
+      </w:r>
+      <w:r>
+        <w:rPr>
+          <w:sz w:val="21"/>
+          <w:szCs w:val="21"/>
+          <w:lang w:val="en-US"/>
+        </w:rPr>
+        <w:t xml:space="preserve">, </w:t>
+      </w:r>
+      <w:proofErr w:type="spellStart"/>
+      <w:r>
+        <w:rPr>
+          <w:sz w:val="21"/>
+          <w:szCs w:val="21"/>
+          <w:lang w:val="en-US"/>
+        </w:rPr>
+        <w:t>maint_desc</w:t>
       </w:r>
       <w:proofErr w:type="spellEnd"/>
       <w:r>
         <w:rPr>
+          <w:sz w:val="21"/>
+          <w:szCs w:val="21"/>
           <w:lang w:val="en-US"/>
         </w:rPr>
         <w:t xml:space="preserve">, </w:t>
@@ -614,288 +1299,264 @@
       <w:proofErr w:type="spellStart"/>
       <w:r>
         <w:rPr>
-          <w:lang w:val="en-US"/>
+          <w:sz w:val="21"/>
+          <w:szCs w:val="21"/>
+          <w:lang w:val="en-US"/>
+        </w:rPr>
+        <w:t>maint_cost</w:t>
+      </w:r>
+      <w:proofErr w:type="spellEnd"/>
+      <w:r>
+        <w:rPr>
+          <w:sz w:val="21"/>
+          <w:szCs w:val="21"/>
+          <w:lang w:val="en-US"/>
+        </w:rPr>
+        <w:t>)</w:t>
+      </w:r>
+    </w:p>
+    <w:p>
+      <w:pPr>
+        <w:pStyle w:val="p1"/>
+        <w:rPr>
+          <w:sz w:val="21"/>
+          <w:szCs w:val="21"/>
+        </w:rPr>
+      </w:pPr>
+      <w:r>
+        <w:rPr>
+          <w:sz w:val="21"/>
+          <w:szCs w:val="21"/>
+        </w:rPr>
+        <w:t>Full Dependencies:</w:t>
+      </w:r>
+    </w:p>
+    <w:p>
+      <w:pPr>
+        <w:pStyle w:val="p1"/>
+        <w:rPr>
+          <w:sz w:val="21"/>
+          <w:szCs w:val="21"/>
+        </w:rPr>
+      </w:pPr>
+      <w:proofErr w:type="spellStart"/>
+      <w:r>
+        <w:rPr>
+          <w:sz w:val="21"/>
+          <w:szCs w:val="21"/>
+        </w:rPr>
+        <w:t>o</w:t>
+      </w:r>
+      <w:r>
+        <w:rPr>
+          <w:sz w:val="21"/>
+          <w:szCs w:val="21"/>
+        </w:rPr>
+        <w:t>wner</w:t>
+      </w:r>
+      <w:r>
+        <w:rPr>
+          <w:sz w:val="21"/>
+          <w:szCs w:val="21"/>
+        </w:rPr>
+        <w:t>_</w:t>
+      </w:r>
+      <w:r>
+        <w:rPr>
+          <w:sz w:val="21"/>
+          <w:szCs w:val="21"/>
+        </w:rPr>
+        <w:t>no</w:t>
+      </w:r>
+      <w:proofErr w:type="spellEnd"/>
+      <w:r>
+        <w:rPr>
+          <w:sz w:val="21"/>
+          <w:szCs w:val="21"/>
+        </w:rPr>
+        <w:t xml:space="preserve"> → </w:t>
+      </w:r>
+      <w:proofErr w:type="spellStart"/>
+      <w:r>
+        <w:rPr>
+          <w:sz w:val="21"/>
+          <w:szCs w:val="21"/>
         </w:rPr>
         <w:t>owner_givname</w:t>
       </w:r>
       <w:proofErr w:type="spellEnd"/>
       <w:r>
         <w:rPr>
-          <w:lang w:val="en-US"/>
+          <w:sz w:val="21"/>
+          <w:szCs w:val="21"/>
         </w:rPr>
         <w:t xml:space="preserve">, </w:t>
       </w:r>
       <w:proofErr w:type="spellStart"/>
       <w:r>
         <w:rPr>
-          <w:lang w:val="en-US"/>
-        </w:rPr>
-        <w:t>owner_famname</w:t>
+          <w:sz w:val="21"/>
+          <w:szCs w:val="21"/>
+        </w:rPr>
+        <w:t>owner</w:t>
+      </w:r>
+      <w:r>
+        <w:rPr>
+          <w:sz w:val="21"/>
+          <w:szCs w:val="21"/>
+        </w:rPr>
+        <w:t>_</w:t>
+      </w:r>
+      <w:r>
+        <w:rPr>
+          <w:sz w:val="21"/>
+          <w:szCs w:val="21"/>
+        </w:rPr>
+        <w:t>famname</w:t>
       </w:r>
       <w:proofErr w:type="spellEnd"/>
       <w:r>
         <w:rPr>
-          <w:lang w:val="en-US"/>
+          <w:sz w:val="21"/>
+          <w:szCs w:val="21"/>
         </w:rPr>
         <w:t xml:space="preserve">, </w:t>
       </w:r>
       <w:proofErr w:type="spellStart"/>
       <w:r>
         <w:rPr>
-          <w:lang w:val="en-US"/>
-        </w:rPr>
-        <w:t>owner_address</w:t>
+          <w:sz w:val="21"/>
+          <w:szCs w:val="21"/>
+        </w:rPr>
+        <w:t>owner</w:t>
+      </w:r>
+      <w:r>
+        <w:rPr>
+          <w:sz w:val="21"/>
+          <w:szCs w:val="21"/>
+        </w:rPr>
+        <w:t>_addess</w:t>
       </w:r>
       <w:proofErr w:type="spellEnd"/>
-      <w:r>
-        <w:rPr>
-          <w:lang w:val="en-US"/>
-        </w:rPr>
-        <w:t>)</w:t>
-      </w:r>
-    </w:p>
-    <w:p>
-      <w:pPr>
-        <w:rPr>
-          <w:lang w:val="en-US"/>
-        </w:rPr>
-      </w:pPr>
-      <w:r>
-        <w:rPr>
-          <w:lang w:val="en-US"/>
-        </w:rPr>
-        <w:t>PROPERTY (</w:t>
+    </w:p>
+    <w:p>
+      <w:pPr>
+        <w:pStyle w:val="p1"/>
+        <w:rPr>
+          <w:sz w:val="21"/>
+          <w:szCs w:val="21"/>
+        </w:rPr>
+      </w:pPr>
+      <w:r>
+        <w:rPr>
+          <w:sz w:val="21"/>
+          <w:szCs w:val="21"/>
+        </w:rPr>
+        <w:t xml:space="preserve">prop_no → prop_address, </w:t>
       </w:r>
       <w:proofErr w:type="spellStart"/>
       <w:r>
         <w:rPr>
-          <w:lang w:val="en-US"/>
-        </w:rPr>
-        <w:t>prop_no</w:t>
+          <w:sz w:val="21"/>
+          <w:szCs w:val="21"/>
+        </w:rPr>
+        <w:t>owner</w:t>
+      </w:r>
+      <w:r>
+        <w:rPr>
+          <w:sz w:val="21"/>
+          <w:szCs w:val="21"/>
+        </w:rPr>
+        <w:t>_</w:t>
+      </w:r>
+      <w:r>
+        <w:rPr>
+          <w:sz w:val="21"/>
+          <w:szCs w:val="21"/>
+        </w:rPr>
+        <w:t>no</w:t>
       </w:r>
       <w:proofErr w:type="spellEnd"/>
-      <w:r>
-        <w:rPr>
-          <w:lang w:val="en-US"/>
-        </w:rPr>
-        <w:t xml:space="preserve">, </w:t>
+    </w:p>
+    <w:p>
+      <w:pPr>
+        <w:pStyle w:val="p1"/>
+        <w:rPr>
+          <w:sz w:val="21"/>
+          <w:szCs w:val="21"/>
+        </w:rPr>
+      </w:pPr>
+      <w:r>
+        <w:rPr>
+          <w:sz w:val="21"/>
+          <w:szCs w:val="21"/>
+        </w:rPr>
+        <w:t>prop_no, maint</w:t>
+      </w:r>
+      <w:r>
+        <w:rPr>
+          <w:sz w:val="21"/>
+          <w:szCs w:val="21"/>
+        </w:rPr>
+        <w:t>_</w:t>
+      </w:r>
+      <w:r>
+        <w:rPr>
+          <w:sz w:val="21"/>
+          <w:szCs w:val="21"/>
+        </w:rPr>
+        <w:t xml:space="preserve">datetime → </w:t>
       </w:r>
       <w:proofErr w:type="spellStart"/>
       <w:r>
         <w:rPr>
-          <w:lang w:val="en-US"/>
-        </w:rPr>
-        <w:t>prop_address</w:t>
+          <w:sz w:val="21"/>
+          <w:szCs w:val="21"/>
+        </w:rPr>
+        <w:t>maint</w:t>
+      </w:r>
+      <w:r>
+        <w:rPr>
+          <w:sz w:val="21"/>
+          <w:szCs w:val="21"/>
+        </w:rPr>
+        <w:t>_</w:t>
+      </w:r>
+      <w:r>
+        <w:rPr>
+          <w:sz w:val="21"/>
+          <w:szCs w:val="21"/>
+        </w:rPr>
+        <w:t>desc</w:t>
       </w:r>
       <w:proofErr w:type="spellEnd"/>
       <w:r>
         <w:rPr>
-          <w:lang w:val="en-US"/>
-        </w:rPr>
-        <w:t xml:space="preserve">, </w:t>
-      </w:r>
-      <w:proofErr w:type="spellStart"/>
-      <w:r>
-        <w:rPr>
-          <w:lang w:val="en-US"/>
-        </w:rPr>
-        <w:t>owner_no</w:t>
-      </w:r>
-      <w:proofErr w:type="spellEnd"/>
-      <w:r>
-        <w:rPr>
-          <w:lang w:val="en-US"/>
-        </w:rPr>
-        <w:t>)</w:t>
-      </w:r>
-    </w:p>
-    <w:p>
-      <w:pPr>
-        <w:rPr>
-          <w:lang w:val="en-US"/>
-        </w:rPr>
-      </w:pPr>
-      <w:proofErr w:type="gramStart"/>
-      <w:r>
-        <w:rPr>
-          <w:lang w:val="en-US"/>
-        </w:rPr>
-        <w:t>MAINTAINENCE(</w:t>
-      </w:r>
-      <w:proofErr w:type="spellStart"/>
-      <w:proofErr w:type="gramEnd"/>
-      <w:r>
-        <w:rPr>
-          <w:lang w:val="en-US"/>
-        </w:rPr>
-        <w:t>prop_no</w:t>
-      </w:r>
-      <w:proofErr w:type="spellEnd"/>
-      <w:r>
-        <w:rPr>
-          <w:lang w:val="en-US"/>
-        </w:rPr>
-        <w:t xml:space="preserve">, </w:t>
-      </w:r>
-      <w:proofErr w:type="spellStart"/>
-      <w:r>
-        <w:rPr>
-          <w:lang w:val="en-US"/>
-        </w:rPr>
-        <w:t>maint_datetime</w:t>
-      </w:r>
-      <w:proofErr w:type="spellEnd"/>
-      <w:r>
-        <w:rPr>
-          <w:lang w:val="en-US"/>
-        </w:rPr>
-        <w:t xml:space="preserve">, </w:t>
-      </w:r>
-      <w:proofErr w:type="spellStart"/>
-      <w:r>
-        <w:rPr>
-          <w:lang w:val="en-US"/>
-        </w:rPr>
-        <w:t>maint_desc</w:t>
-      </w:r>
-      <w:proofErr w:type="spellEnd"/>
-      <w:r>
-        <w:rPr>
-          <w:lang w:val="en-US"/>
-        </w:rPr>
-        <w:t xml:space="preserve">, </w:t>
-      </w:r>
-      <w:proofErr w:type="spellStart"/>
-      <w:r>
-        <w:rPr>
-          <w:lang w:val="en-US"/>
-        </w:rPr>
-        <w:t>maint_cost</w:t>
-      </w:r>
-      <w:proofErr w:type="spellEnd"/>
-      <w:r>
-        <w:rPr>
-          <w:lang w:val="en-US"/>
-        </w:rPr>
-        <w:t>)</w:t>
-      </w:r>
-    </w:p>
-    <w:p>
-      <w:pPr>
-        <w:pStyle w:val="p1"/>
-      </w:pPr>
-      <w:r>
-        <w:t>Full Dependencies:</w:t>
-      </w:r>
-    </w:p>
-    <w:p>
-      <w:pPr>
-        <w:pStyle w:val="p1"/>
-      </w:pPr>
-      <w:proofErr w:type="spellStart"/>
-      <w:r>
-        <w:t>o</w:t>
-      </w:r>
-      <w:r>
-        <w:t>wner</w:t>
-      </w:r>
-      <w:r>
+          <w:sz w:val="21"/>
+          <w:szCs w:val="21"/>
+        </w:rPr>
+        <w:t>, maint</w:t>
+      </w:r>
+      <w:r>
+        <w:rPr>
+          <w:sz w:val="21"/>
+          <w:szCs w:val="21"/>
+        </w:rPr>
         <w:t>_</w:t>
       </w:r>
       <w:r>
-        <w:t>no</w:t>
-      </w:r>
-      <w:proofErr w:type="spellEnd"/>
-      <w:r>
-        <w:t xml:space="preserve"> → </w:t>
-      </w:r>
-      <w:proofErr w:type="spellStart"/>
-      <w:r>
-        <w:t>owner_givname</w:t>
-      </w:r>
-      <w:proofErr w:type="spellEnd"/>
-      <w:r>
-        <w:t xml:space="preserve">, </w:t>
-      </w:r>
-      <w:proofErr w:type="spellStart"/>
-      <w:r>
-        <w:t>owner</w:t>
-      </w:r>
-      <w:r>
-        <w:t>_</w:t>
-      </w:r>
-      <w:r>
-        <w:t>famname</w:t>
-      </w:r>
-      <w:proofErr w:type="spellEnd"/>
-      <w:r>
-        <w:t xml:space="preserve">, </w:t>
-      </w:r>
-      <w:proofErr w:type="spellStart"/>
-      <w:r>
-        <w:t>owner</w:t>
-      </w:r>
-      <w:r>
-        <w:t>_addess</w:t>
-      </w:r>
-      <w:proofErr w:type="spellEnd"/>
-    </w:p>
-    <w:p>
-      <w:pPr>
-        <w:pStyle w:val="p1"/>
-      </w:pPr>
-      <w:r>
-        <w:t xml:space="preserve">prop_no → prop_address, </w:t>
-      </w:r>
-      <w:proofErr w:type="spellStart"/>
-      <w:r>
-        <w:t>owner</w:t>
-      </w:r>
-      <w:r>
-        <w:t>_</w:t>
-      </w:r>
-      <w:r>
-        <w:t>no</w:t>
-      </w:r>
-      <w:proofErr w:type="spellEnd"/>
-    </w:p>
-    <w:p>
-      <w:pPr>
-        <w:pStyle w:val="p1"/>
-      </w:pPr>
-      <w:r>
-        <w:t>prop_no, maint</w:t>
-      </w:r>
-      <w:r>
-        <w:t>_</w:t>
-      </w:r>
-      <w:r>
-        <w:t xml:space="preserve">datetime → </w:t>
-      </w:r>
-      <w:proofErr w:type="spellStart"/>
-      <w:r>
-        <w:t>maint</w:t>
-      </w:r>
-      <w:r>
-        <w:t>_</w:t>
-      </w:r>
-      <w:r>
-        <w:t>desc</w:t>
-      </w:r>
-      <w:proofErr w:type="spellEnd"/>
-      <w:r>
-        <w:t>, maint</w:t>
-      </w:r>
-      <w:r>
-        <w:t>_</w:t>
-      </w:r>
-      <w:r>
+        <w:rPr>
+          <w:sz w:val="21"/>
+          <w:szCs w:val="21"/>
+        </w:rPr>
         <w:t>cost</w:t>
       </w:r>
     </w:p>
     <w:p>
       <w:pPr>
         <w:rPr>
+          <w:sz w:val="21"/>
+          <w:szCs w:val="21"/>
           <w:lang w:val="en-US"/>
         </w:rPr>
       </w:pPr>

</xml_diff>

<commit_message>
Converted 2NF to 3NF – removed transitive dependencies
</commit_message>
<xml_diff>
--- a/Applied/App04/A4-2 NORMALISATION.docx
+++ b/Applied/App04/A4-2 NORMALISATION.docx
@@ -18,18 +18,27 @@
         <w:rPr>
           <w:lang w:val="en-US"/>
         </w:rPr>
-        <w:t xml:space="preserve">.1- Property </w:t>
-      </w:r>
-      <w:proofErr w:type="spellStart"/>
-      <w:r>
-        <w:rPr>
+        <w:t xml:space="preserve">.1- </w:t>
+      </w:r>
+      <w:r>
+        <w:rPr>
+          <w:u w:val="single"/>
           <w:lang w:val="en-US"/>
         </w:rPr>
+        <w:t xml:space="preserve">Property </w:t>
+      </w:r>
+      <w:proofErr w:type="spellStart"/>
+      <w:r>
+        <w:rPr>
+          <w:u w:val="single"/>
+          <w:lang w:val="en-US"/>
+        </w:rPr>
         <w:t>Maintainence</w:t>
       </w:r>
       <w:proofErr w:type="spellEnd"/>
       <w:r>
         <w:rPr>
+          <w:u w:val="single"/>
           <w:lang w:val="en-US"/>
         </w:rPr>
         <w:t xml:space="preserve"> report</w:t>
@@ -1551,6 +1560,1468 @@
         </w:rPr>
         <w:t>cost</w:t>
       </w:r>
+    </w:p>
+    <w:p>
+      <w:pPr>
+        <w:pStyle w:val="p1"/>
+        <w:rPr>
+          <w:sz w:val="21"/>
+          <w:szCs w:val="21"/>
+        </w:rPr>
+      </w:pPr>
+    </w:p>
+    <w:p>
+      <w:pPr>
+        <w:pStyle w:val="p1"/>
+        <w:rPr>
+          <w:sz w:val="21"/>
+          <w:szCs w:val="21"/>
+        </w:rPr>
+      </w:pPr>
+    </w:p>
+    <w:p>
+      <w:pPr>
+        <w:pStyle w:val="p1"/>
+        <w:rPr>
+          <w:sz w:val="21"/>
+          <w:szCs w:val="21"/>
+        </w:rPr>
+      </w:pPr>
+    </w:p>
+    <w:p>
+      <w:pPr>
+        <w:pStyle w:val="p1"/>
+        <w:rPr>
+          <w:sz w:val="21"/>
+          <w:szCs w:val="21"/>
+        </w:rPr>
+      </w:pPr>
+    </w:p>
+    <w:p>
+      <w:pPr>
+        <w:pStyle w:val="p1"/>
+        <w:rPr>
+          <w:sz w:val="24"/>
+          <w:szCs w:val="24"/>
+          <w:u w:val="single"/>
+        </w:rPr>
+      </w:pPr>
+      <w:r>
+        <w:rPr>
+          <w:sz w:val="24"/>
+          <w:szCs w:val="24"/>
+          <w:u w:val="single"/>
+        </w:rPr>
+        <w:t>PROPERTY TENANT LEDGER REPORT</w:t>
+      </w:r>
+    </w:p>
+    <w:p>
+      <w:pPr>
+        <w:pStyle w:val="p1"/>
+        <w:rPr>
+          <w:sz w:val="21"/>
+          <w:szCs w:val="21"/>
+          <w:u w:val="single"/>
+        </w:rPr>
+      </w:pPr>
+    </w:p>
+    <w:p>
+      <w:pPr>
+        <w:pStyle w:val="p1"/>
+        <w:rPr>
+          <w:b/>
+          <w:bCs/>
+          <w:sz w:val="21"/>
+          <w:szCs w:val="21"/>
+        </w:rPr>
+      </w:pPr>
+      <w:r>
+        <w:rPr>
+          <w:b/>
+          <w:bCs/>
+          <w:sz w:val="21"/>
+          <w:szCs w:val="21"/>
+        </w:rPr>
+        <w:t xml:space="preserve">UNF </w:t>
+      </w:r>
+    </w:p>
+    <w:p>
+      <w:pPr>
+        <w:pStyle w:val="p1"/>
+        <w:rPr>
+          <w:b/>
+          <w:bCs/>
+          <w:sz w:val="21"/>
+          <w:szCs w:val="21"/>
+        </w:rPr>
+      </w:pPr>
+    </w:p>
+    <w:p>
+      <w:pPr>
+        <w:pStyle w:val="p1"/>
+        <w:rPr>
+          <w:sz w:val="21"/>
+          <w:szCs w:val="21"/>
+        </w:rPr>
+      </w:pPr>
+      <w:r>
+        <w:rPr>
+          <w:sz w:val="21"/>
+          <w:szCs w:val="21"/>
+        </w:rPr>
+        <w:t>PROPERTY_</w:t>
+      </w:r>
+      <w:proofErr w:type="gramStart"/>
+      <w:r>
+        <w:rPr>
+          <w:sz w:val="21"/>
+          <w:szCs w:val="21"/>
+        </w:rPr>
+        <w:t>TENANT(</w:t>
+      </w:r>
+      <w:proofErr w:type="gramEnd"/>
+      <w:r>
+        <w:rPr>
+          <w:sz w:val="21"/>
+          <w:szCs w:val="21"/>
+        </w:rPr>
+        <w:t>prop_no, prop_address, rent_lease_startdate, rent_weekly_</w:t>
+      </w:r>
+      <w:proofErr w:type="gramStart"/>
+      <w:r>
+        <w:rPr>
+          <w:sz w:val="21"/>
+          <w:szCs w:val="21"/>
+        </w:rPr>
+        <w:t>rate,</w:t>
+      </w:r>
+      <w:r>
+        <w:rPr>
+          <w:sz w:val="21"/>
+          <w:szCs w:val="21"/>
+        </w:rPr>
+        <w:t>rent</w:t>
+      </w:r>
+      <w:proofErr w:type="gramEnd"/>
+      <w:r>
+        <w:rPr>
+          <w:sz w:val="21"/>
+          <w:szCs w:val="21"/>
+        </w:rPr>
+        <w:t xml:space="preserve">_bond, </w:t>
+      </w:r>
+      <w:proofErr w:type="spellStart"/>
+      <w:r>
+        <w:rPr>
+          <w:sz w:val="21"/>
+          <w:szCs w:val="21"/>
+        </w:rPr>
+        <w:t>tenant_no</w:t>
+      </w:r>
+      <w:proofErr w:type="spellEnd"/>
+      <w:r>
+        <w:rPr>
+          <w:sz w:val="21"/>
+          <w:szCs w:val="21"/>
+        </w:rPr>
+        <w:t xml:space="preserve">, </w:t>
+      </w:r>
+      <w:proofErr w:type="spellStart"/>
+      <w:r>
+        <w:rPr>
+          <w:sz w:val="21"/>
+          <w:szCs w:val="21"/>
+        </w:rPr>
+        <w:t>tenant_givname</w:t>
+      </w:r>
+      <w:proofErr w:type="spellEnd"/>
+      <w:r>
+        <w:rPr>
+          <w:sz w:val="21"/>
+          <w:szCs w:val="21"/>
+        </w:rPr>
+        <w:t xml:space="preserve">, </w:t>
+      </w:r>
+      <w:proofErr w:type="spellStart"/>
+      <w:r>
+        <w:rPr>
+          <w:sz w:val="21"/>
+          <w:szCs w:val="21"/>
+        </w:rPr>
+        <w:t>tenant_</w:t>
+      </w:r>
+      <w:proofErr w:type="gramStart"/>
+      <w:r>
+        <w:rPr>
+          <w:sz w:val="21"/>
+          <w:szCs w:val="21"/>
+        </w:rPr>
+        <w:t>famname</w:t>
+      </w:r>
+      <w:proofErr w:type="spellEnd"/>
+      <w:r>
+        <w:rPr>
+          <w:sz w:val="21"/>
+          <w:szCs w:val="21"/>
+        </w:rPr>
+        <w:t>,(</w:t>
+      </w:r>
+      <w:proofErr w:type="spellStart"/>
+      <w:proofErr w:type="gramEnd"/>
+      <w:r>
+        <w:rPr>
+          <w:sz w:val="21"/>
+          <w:szCs w:val="21"/>
+        </w:rPr>
+        <w:t>pay_</w:t>
+      </w:r>
+      <w:proofErr w:type="gramStart"/>
+      <w:r>
+        <w:rPr>
+          <w:sz w:val="21"/>
+          <w:szCs w:val="21"/>
+        </w:rPr>
+        <w:t>no,pay</w:t>
+      </w:r>
+      <w:proofErr w:type="gramEnd"/>
+      <w:r>
+        <w:rPr>
+          <w:sz w:val="21"/>
+          <w:szCs w:val="21"/>
+        </w:rPr>
+        <w:t>_</w:t>
+      </w:r>
+      <w:proofErr w:type="gramStart"/>
+      <w:r>
+        <w:rPr>
+          <w:sz w:val="21"/>
+          <w:szCs w:val="21"/>
+        </w:rPr>
+        <w:t>date,pay</w:t>
+      </w:r>
+      <w:proofErr w:type="gramEnd"/>
+      <w:r>
+        <w:rPr>
+          <w:sz w:val="21"/>
+          <w:szCs w:val="21"/>
+        </w:rPr>
+        <w:t>_</w:t>
+      </w:r>
+      <w:proofErr w:type="gramStart"/>
+      <w:r>
+        <w:rPr>
+          <w:sz w:val="21"/>
+          <w:szCs w:val="21"/>
+        </w:rPr>
+        <w:t>type,pay</w:t>
+      </w:r>
+      <w:proofErr w:type="gramEnd"/>
+      <w:r>
+        <w:rPr>
+          <w:sz w:val="21"/>
+          <w:szCs w:val="21"/>
+        </w:rPr>
+        <w:t>_</w:t>
+      </w:r>
+      <w:proofErr w:type="gramStart"/>
+      <w:r>
+        <w:rPr>
+          <w:sz w:val="21"/>
+          <w:szCs w:val="21"/>
+        </w:rPr>
+        <w:t>amount,pay</w:t>
+      </w:r>
+      <w:proofErr w:type="gramEnd"/>
+      <w:r>
+        <w:rPr>
+          <w:sz w:val="21"/>
+          <w:szCs w:val="21"/>
+        </w:rPr>
+        <w:t>_paidby</w:t>
+      </w:r>
+      <w:proofErr w:type="spellEnd"/>
+      <w:r>
+        <w:rPr>
+          <w:sz w:val="21"/>
+          <w:szCs w:val="21"/>
+        </w:rPr>
+        <w:t>))</w:t>
+      </w:r>
+    </w:p>
+    <w:p>
+      <w:pPr>
+        <w:rPr>
+          <w:sz w:val="21"/>
+          <w:szCs w:val="21"/>
+          <w:lang w:val="en-US"/>
+        </w:rPr>
+      </w:pPr>
+    </w:p>
+    <w:p>
+      <w:pPr>
+        <w:rPr>
+          <w:b/>
+          <w:bCs/>
+          <w:sz w:val="21"/>
+          <w:szCs w:val="21"/>
+          <w:lang w:val="en-US"/>
+        </w:rPr>
+      </w:pPr>
+      <w:r>
+        <w:rPr>
+          <w:b/>
+          <w:bCs/>
+          <w:sz w:val="21"/>
+          <w:szCs w:val="21"/>
+          <w:lang w:val="en-US"/>
+        </w:rPr>
+        <w:lastRenderedPageBreak/>
+        <w:t>1NF</w:t>
+      </w:r>
+    </w:p>
+    <w:p>
+      <w:pPr>
+        <w:pStyle w:val="p1"/>
+        <w:rPr>
+          <w:sz w:val="21"/>
+          <w:szCs w:val="21"/>
+        </w:rPr>
+      </w:pPr>
+      <w:r>
+        <w:rPr>
+          <w:sz w:val="21"/>
+          <w:szCs w:val="21"/>
+        </w:rPr>
+        <w:t>PROPERTY_</w:t>
+      </w:r>
+      <w:proofErr w:type="gramStart"/>
+      <w:r>
+        <w:rPr>
+          <w:sz w:val="21"/>
+          <w:szCs w:val="21"/>
+        </w:rPr>
+        <w:t>TENANT(</w:t>
+      </w:r>
+      <w:proofErr w:type="gramEnd"/>
+      <w:r>
+        <w:rPr>
+          <w:sz w:val="21"/>
+          <w:szCs w:val="21"/>
+          <w:u w:val="single"/>
+        </w:rPr>
+        <w:t>prop_no</w:t>
+      </w:r>
+      <w:r>
+        <w:rPr>
+          <w:sz w:val="21"/>
+          <w:szCs w:val="21"/>
+        </w:rPr>
+        <w:t xml:space="preserve">, </w:t>
+      </w:r>
+      <w:r>
+        <w:rPr>
+          <w:sz w:val="21"/>
+          <w:szCs w:val="21"/>
+          <w:u w:val="single"/>
+        </w:rPr>
+        <w:t>rent_lease_startdate</w:t>
+      </w:r>
+      <w:r>
+        <w:rPr>
+          <w:sz w:val="21"/>
+          <w:szCs w:val="21"/>
+        </w:rPr>
+        <w:t>, prop_address, rent_weekly_</w:t>
+      </w:r>
+      <w:proofErr w:type="gramStart"/>
+      <w:r>
+        <w:rPr>
+          <w:sz w:val="21"/>
+          <w:szCs w:val="21"/>
+        </w:rPr>
+        <w:t>rate,rent</w:t>
+      </w:r>
+      <w:proofErr w:type="gramEnd"/>
+      <w:r>
+        <w:rPr>
+          <w:sz w:val="21"/>
+          <w:szCs w:val="21"/>
+        </w:rPr>
+        <w:t xml:space="preserve">_bond, </w:t>
+      </w:r>
+      <w:proofErr w:type="spellStart"/>
+      <w:r>
+        <w:rPr>
+          <w:sz w:val="21"/>
+          <w:szCs w:val="21"/>
+        </w:rPr>
+        <w:t>tenant_no</w:t>
+      </w:r>
+      <w:proofErr w:type="spellEnd"/>
+      <w:r>
+        <w:rPr>
+          <w:sz w:val="21"/>
+          <w:szCs w:val="21"/>
+        </w:rPr>
+        <w:t xml:space="preserve">, </w:t>
+      </w:r>
+      <w:proofErr w:type="spellStart"/>
+      <w:r>
+        <w:rPr>
+          <w:sz w:val="21"/>
+          <w:szCs w:val="21"/>
+        </w:rPr>
+        <w:t>tenant_givname</w:t>
+      </w:r>
+      <w:proofErr w:type="spellEnd"/>
+      <w:r>
+        <w:rPr>
+          <w:sz w:val="21"/>
+          <w:szCs w:val="21"/>
+        </w:rPr>
+        <w:t xml:space="preserve">, </w:t>
+      </w:r>
+      <w:proofErr w:type="spellStart"/>
+      <w:r>
+        <w:rPr>
+          <w:sz w:val="21"/>
+          <w:szCs w:val="21"/>
+        </w:rPr>
+        <w:t>tenant_famname</w:t>
+      </w:r>
+      <w:proofErr w:type="spellEnd"/>
+      <w:r>
+        <w:rPr>
+          <w:sz w:val="21"/>
+          <w:szCs w:val="21"/>
+        </w:rPr>
+        <w:t>)</w:t>
+      </w:r>
+    </w:p>
+    <w:p>
+      <w:pPr>
+        <w:pStyle w:val="p1"/>
+        <w:rPr>
+          <w:sz w:val="21"/>
+          <w:szCs w:val="21"/>
+        </w:rPr>
+      </w:pPr>
+    </w:p>
+    <w:p>
+      <w:pPr>
+        <w:pStyle w:val="p1"/>
+        <w:rPr>
+          <w:sz w:val="21"/>
+          <w:szCs w:val="21"/>
+        </w:rPr>
+      </w:pPr>
+      <w:r>
+        <w:rPr>
+          <w:sz w:val="21"/>
+          <w:szCs w:val="21"/>
+        </w:rPr>
+        <w:t>CK:</w:t>
+      </w:r>
+    </w:p>
+    <w:p>
+      <w:pPr>
+        <w:pStyle w:val="p1"/>
+        <w:numPr>
+          <w:ilvl w:val="0"/>
+          <w:numId w:val="1"/>
+        </w:numPr>
+        <w:rPr>
+          <w:sz w:val="21"/>
+          <w:szCs w:val="21"/>
+        </w:rPr>
+      </w:pPr>
+      <w:r>
+        <w:rPr>
+          <w:sz w:val="21"/>
+          <w:szCs w:val="21"/>
+        </w:rPr>
+        <w:t xml:space="preserve">prop_no, </w:t>
+      </w:r>
+      <w:r>
+        <w:rPr>
+          <w:sz w:val="21"/>
+          <w:szCs w:val="21"/>
+        </w:rPr>
+        <w:t>rent_lease_startdate</w:t>
+      </w:r>
+    </w:p>
+    <w:p>
+      <w:pPr>
+        <w:pStyle w:val="p1"/>
+        <w:rPr>
+          <w:sz w:val="21"/>
+          <w:szCs w:val="21"/>
+        </w:rPr>
+      </w:pPr>
+    </w:p>
+    <w:p>
+      <w:pPr>
+        <w:pStyle w:val="p1"/>
+        <w:rPr>
+          <w:sz w:val="21"/>
+          <w:szCs w:val="21"/>
+        </w:rPr>
+      </w:pPr>
+      <w:proofErr w:type="gramStart"/>
+      <w:r>
+        <w:rPr>
+          <w:sz w:val="21"/>
+          <w:szCs w:val="21"/>
+        </w:rPr>
+        <w:t>PAYMENT(</w:t>
+      </w:r>
+      <w:proofErr w:type="gramEnd"/>
+      <w:r>
+        <w:rPr>
+          <w:sz w:val="21"/>
+          <w:szCs w:val="21"/>
+          <w:u w:val="single"/>
+        </w:rPr>
+        <w:t>pay_no</w:t>
+      </w:r>
+      <w:r>
+        <w:rPr>
+          <w:sz w:val="21"/>
+          <w:szCs w:val="21"/>
+        </w:rPr>
+        <w:t xml:space="preserve">, </w:t>
+      </w:r>
+      <w:proofErr w:type="spellStart"/>
+      <w:r>
+        <w:rPr>
+          <w:sz w:val="21"/>
+          <w:szCs w:val="21"/>
+        </w:rPr>
+        <w:t>pay_</w:t>
+      </w:r>
+      <w:proofErr w:type="gramStart"/>
+      <w:r>
+        <w:rPr>
+          <w:sz w:val="21"/>
+          <w:szCs w:val="21"/>
+        </w:rPr>
+        <w:t>date</w:t>
+      </w:r>
+      <w:r>
+        <w:rPr>
+          <w:sz w:val="21"/>
+          <w:szCs w:val="21"/>
+        </w:rPr>
+        <w:t>,pay</w:t>
+      </w:r>
+      <w:proofErr w:type="gramEnd"/>
+      <w:r>
+        <w:rPr>
+          <w:sz w:val="21"/>
+          <w:szCs w:val="21"/>
+        </w:rPr>
+        <w:t>_type</w:t>
+      </w:r>
+      <w:proofErr w:type="spellEnd"/>
+      <w:r>
+        <w:rPr>
+          <w:sz w:val="21"/>
+          <w:szCs w:val="21"/>
+        </w:rPr>
+        <w:t xml:space="preserve">, </w:t>
+      </w:r>
+      <w:proofErr w:type="spellStart"/>
+      <w:r>
+        <w:rPr>
+          <w:sz w:val="21"/>
+          <w:szCs w:val="21"/>
+        </w:rPr>
+        <w:t>pay_amount</w:t>
+      </w:r>
+      <w:proofErr w:type="spellEnd"/>
+      <w:r>
+        <w:rPr>
+          <w:sz w:val="21"/>
+          <w:szCs w:val="21"/>
+        </w:rPr>
+        <w:t xml:space="preserve">, </w:t>
+      </w:r>
+      <w:proofErr w:type="spellStart"/>
+      <w:r>
+        <w:rPr>
+          <w:sz w:val="21"/>
+          <w:szCs w:val="21"/>
+        </w:rPr>
+        <w:t>pay_</w:t>
+      </w:r>
+      <w:proofErr w:type="gramStart"/>
+      <w:r>
+        <w:rPr>
+          <w:sz w:val="21"/>
+          <w:szCs w:val="21"/>
+        </w:rPr>
+        <w:t>paidby,prop</w:t>
+      </w:r>
+      <w:proofErr w:type="gramEnd"/>
+      <w:r>
+        <w:rPr>
+          <w:sz w:val="21"/>
+          <w:szCs w:val="21"/>
+        </w:rPr>
+        <w:t>_no</w:t>
+      </w:r>
+      <w:proofErr w:type="spellEnd"/>
+      <w:r>
+        <w:rPr>
+          <w:sz w:val="21"/>
+          <w:szCs w:val="21"/>
+        </w:rPr>
+        <w:t>, rent_lease_startdate)</w:t>
+      </w:r>
+    </w:p>
+    <w:p>
+      <w:pPr>
+        <w:pStyle w:val="p1"/>
+        <w:rPr>
+          <w:sz w:val="21"/>
+          <w:szCs w:val="21"/>
+        </w:rPr>
+      </w:pPr>
+    </w:p>
+    <w:p>
+      <w:pPr>
+        <w:pStyle w:val="p1"/>
+        <w:rPr>
+          <w:sz w:val="21"/>
+          <w:szCs w:val="21"/>
+        </w:rPr>
+      </w:pPr>
+      <w:r>
+        <w:rPr>
+          <w:sz w:val="21"/>
+          <w:szCs w:val="21"/>
+        </w:rPr>
+        <w:t>CK:</w:t>
+      </w:r>
+    </w:p>
+    <w:p>
+      <w:pPr>
+        <w:pStyle w:val="p1"/>
+        <w:numPr>
+          <w:ilvl w:val="0"/>
+          <w:numId w:val="1"/>
+        </w:numPr>
+        <w:rPr>
+          <w:sz w:val="21"/>
+          <w:szCs w:val="21"/>
+        </w:rPr>
+      </w:pPr>
+      <w:r>
+        <w:rPr>
+          <w:sz w:val="21"/>
+          <w:szCs w:val="21"/>
+        </w:rPr>
+        <w:t>pay_no</w:t>
+      </w:r>
+    </w:p>
+    <w:p>
+      <w:pPr>
+        <w:pStyle w:val="p1"/>
+        <w:rPr>
+          <w:sz w:val="21"/>
+          <w:szCs w:val="21"/>
+        </w:rPr>
+      </w:pPr>
+    </w:p>
+    <w:p>
+      <w:pPr>
+        <w:pStyle w:val="p1"/>
+        <w:rPr>
+          <w:sz w:val="21"/>
+          <w:szCs w:val="21"/>
+        </w:rPr>
+      </w:pPr>
+      <w:r>
+        <w:rPr>
+          <w:sz w:val="21"/>
+          <w:szCs w:val="21"/>
+        </w:rPr>
+        <w:t>Partial dependencies:</w:t>
+      </w:r>
+    </w:p>
+    <w:p>
+      <w:pPr>
+        <w:pStyle w:val="p1"/>
+        <w:rPr>
+          <w:sz w:val="21"/>
+          <w:szCs w:val="21"/>
+        </w:rPr>
+      </w:pPr>
+      <w:r>
+        <w:rPr>
+          <w:sz w:val="21"/>
+          <w:szCs w:val="21"/>
+        </w:rPr>
+        <w:t>prop_no → prop_address</w:t>
+      </w:r>
+    </w:p>
+    <w:p>
+      <w:pPr>
+        <w:pStyle w:val="p1"/>
+        <w:rPr>
+          <w:sz w:val="21"/>
+          <w:szCs w:val="21"/>
+        </w:rPr>
+      </w:pPr>
+    </w:p>
+    <w:p>
+      <w:pPr>
+        <w:pStyle w:val="p1"/>
+        <w:rPr>
+          <w:sz w:val="21"/>
+          <w:szCs w:val="21"/>
+        </w:rPr>
+      </w:pPr>
+    </w:p>
+    <w:p>
+      <w:pPr>
+        <w:pStyle w:val="p1"/>
+        <w:rPr>
+          <w:b/>
+          <w:bCs/>
+          <w:sz w:val="21"/>
+          <w:szCs w:val="21"/>
+        </w:rPr>
+      </w:pPr>
+      <w:r>
+        <w:rPr>
+          <w:b/>
+          <w:bCs/>
+          <w:sz w:val="21"/>
+          <w:szCs w:val="21"/>
+        </w:rPr>
+        <w:t>2NF</w:t>
+      </w:r>
+    </w:p>
+    <w:p>
+      <w:pPr>
+        <w:pStyle w:val="p1"/>
+        <w:rPr>
+          <w:sz w:val="21"/>
+          <w:szCs w:val="21"/>
+        </w:rPr>
+      </w:pPr>
+    </w:p>
+    <w:p>
+      <w:pPr>
+        <w:pStyle w:val="p1"/>
+        <w:rPr>
+          <w:sz w:val="21"/>
+          <w:szCs w:val="21"/>
+        </w:rPr>
+      </w:pPr>
+      <w:r>
+        <w:rPr>
+          <w:sz w:val="21"/>
+          <w:szCs w:val="21"/>
+        </w:rPr>
+        <w:t>PROPERTY (</w:t>
+      </w:r>
+      <w:r>
+        <w:rPr>
+          <w:sz w:val="21"/>
+          <w:szCs w:val="21"/>
+          <w:u w:val="single"/>
+        </w:rPr>
+        <w:t>prop_no</w:t>
+      </w:r>
+      <w:r>
+        <w:rPr>
+          <w:sz w:val="21"/>
+          <w:szCs w:val="21"/>
+        </w:rPr>
+        <w:t>, prop_address)</w:t>
+      </w:r>
+    </w:p>
+    <w:p>
+      <w:pPr>
+        <w:pStyle w:val="p1"/>
+        <w:rPr>
+          <w:sz w:val="21"/>
+          <w:szCs w:val="21"/>
+        </w:rPr>
+      </w:pPr>
+    </w:p>
+    <w:p>
+      <w:pPr>
+        <w:pStyle w:val="p1"/>
+        <w:rPr>
+          <w:sz w:val="21"/>
+          <w:szCs w:val="21"/>
+        </w:rPr>
+      </w:pPr>
+      <w:r>
+        <w:rPr>
+          <w:sz w:val="21"/>
+          <w:szCs w:val="21"/>
+        </w:rPr>
+        <w:t>PROPERTY_</w:t>
+      </w:r>
+      <w:r>
+        <w:rPr>
+          <w:sz w:val="21"/>
+          <w:szCs w:val="21"/>
+        </w:rPr>
+        <w:t>TENANT (</w:t>
+      </w:r>
+      <w:r>
+        <w:rPr>
+          <w:sz w:val="21"/>
+          <w:szCs w:val="21"/>
+          <w:u w:val="single"/>
+        </w:rPr>
+        <w:t>prop_no</w:t>
+      </w:r>
+      <w:r>
+        <w:rPr>
+          <w:sz w:val="21"/>
+          <w:szCs w:val="21"/>
+        </w:rPr>
+        <w:t xml:space="preserve">, </w:t>
+      </w:r>
+      <w:r>
+        <w:rPr>
+          <w:sz w:val="21"/>
+          <w:szCs w:val="21"/>
+          <w:u w:val="single"/>
+        </w:rPr>
+        <w:t>rent_lease_startdate</w:t>
+      </w:r>
+      <w:r>
+        <w:rPr>
+          <w:sz w:val="21"/>
+          <w:szCs w:val="21"/>
+        </w:rPr>
+        <w:t>, rent_weekly_</w:t>
+      </w:r>
+      <w:proofErr w:type="gramStart"/>
+      <w:r>
+        <w:rPr>
+          <w:sz w:val="21"/>
+          <w:szCs w:val="21"/>
+        </w:rPr>
+        <w:t>rate,rent</w:t>
+      </w:r>
+      <w:proofErr w:type="gramEnd"/>
+      <w:r>
+        <w:rPr>
+          <w:sz w:val="21"/>
+          <w:szCs w:val="21"/>
+        </w:rPr>
+        <w:t xml:space="preserve">_bond, </w:t>
+      </w:r>
+      <w:proofErr w:type="spellStart"/>
+      <w:r>
+        <w:rPr>
+          <w:sz w:val="21"/>
+          <w:szCs w:val="21"/>
+        </w:rPr>
+        <w:t>tenant_no</w:t>
+      </w:r>
+      <w:proofErr w:type="spellEnd"/>
+      <w:r>
+        <w:rPr>
+          <w:sz w:val="21"/>
+          <w:szCs w:val="21"/>
+        </w:rPr>
+        <w:t xml:space="preserve">, </w:t>
+      </w:r>
+      <w:proofErr w:type="spellStart"/>
+      <w:r>
+        <w:rPr>
+          <w:sz w:val="21"/>
+          <w:szCs w:val="21"/>
+        </w:rPr>
+        <w:t>tenant_givname</w:t>
+      </w:r>
+      <w:proofErr w:type="spellEnd"/>
+      <w:r>
+        <w:rPr>
+          <w:sz w:val="21"/>
+          <w:szCs w:val="21"/>
+        </w:rPr>
+        <w:t xml:space="preserve">, </w:t>
+      </w:r>
+      <w:proofErr w:type="spellStart"/>
+      <w:r>
+        <w:rPr>
+          <w:sz w:val="21"/>
+          <w:szCs w:val="21"/>
+        </w:rPr>
+        <w:t>tenant_famname</w:t>
+      </w:r>
+      <w:proofErr w:type="spellEnd"/>
+      <w:r>
+        <w:rPr>
+          <w:sz w:val="21"/>
+          <w:szCs w:val="21"/>
+        </w:rPr>
+        <w:t>)</w:t>
+      </w:r>
+    </w:p>
+    <w:p>
+      <w:pPr>
+        <w:pStyle w:val="p1"/>
+        <w:rPr>
+          <w:sz w:val="21"/>
+          <w:szCs w:val="21"/>
+        </w:rPr>
+      </w:pPr>
+    </w:p>
+    <w:p>
+      <w:pPr>
+        <w:pStyle w:val="p1"/>
+        <w:rPr>
+          <w:sz w:val="21"/>
+          <w:szCs w:val="21"/>
+        </w:rPr>
+      </w:pPr>
+    </w:p>
+    <w:p>
+      <w:pPr>
+        <w:pStyle w:val="p1"/>
+        <w:rPr>
+          <w:sz w:val="21"/>
+          <w:szCs w:val="21"/>
+        </w:rPr>
+      </w:pPr>
+      <w:r>
+        <w:rPr>
+          <w:sz w:val="21"/>
+          <w:szCs w:val="21"/>
+        </w:rPr>
+        <w:t>PAYMENT (</w:t>
+      </w:r>
+      <w:r>
+        <w:rPr>
+          <w:sz w:val="21"/>
+          <w:szCs w:val="21"/>
+          <w:u w:val="single"/>
+        </w:rPr>
+        <w:t>pay_no</w:t>
+      </w:r>
+      <w:r>
+        <w:rPr>
+          <w:sz w:val="21"/>
+          <w:szCs w:val="21"/>
+        </w:rPr>
+        <w:t xml:space="preserve">, </w:t>
+      </w:r>
+      <w:proofErr w:type="spellStart"/>
+      <w:r>
+        <w:rPr>
+          <w:sz w:val="21"/>
+          <w:szCs w:val="21"/>
+        </w:rPr>
+        <w:t>pay_</w:t>
+      </w:r>
+      <w:proofErr w:type="gramStart"/>
+      <w:r>
+        <w:rPr>
+          <w:sz w:val="21"/>
+          <w:szCs w:val="21"/>
+        </w:rPr>
+        <w:t>date</w:t>
+      </w:r>
+      <w:r>
+        <w:rPr>
+          <w:sz w:val="21"/>
+          <w:szCs w:val="21"/>
+        </w:rPr>
+        <w:t>,pay</w:t>
+      </w:r>
+      <w:proofErr w:type="gramEnd"/>
+      <w:r>
+        <w:rPr>
+          <w:sz w:val="21"/>
+          <w:szCs w:val="21"/>
+        </w:rPr>
+        <w:t>_type</w:t>
+      </w:r>
+      <w:proofErr w:type="spellEnd"/>
+      <w:r>
+        <w:rPr>
+          <w:sz w:val="21"/>
+          <w:szCs w:val="21"/>
+        </w:rPr>
+        <w:t xml:space="preserve">, </w:t>
+      </w:r>
+      <w:proofErr w:type="spellStart"/>
+      <w:r>
+        <w:rPr>
+          <w:sz w:val="21"/>
+          <w:szCs w:val="21"/>
+        </w:rPr>
+        <w:t>pay_amount</w:t>
+      </w:r>
+      <w:proofErr w:type="spellEnd"/>
+      <w:r>
+        <w:rPr>
+          <w:sz w:val="21"/>
+          <w:szCs w:val="21"/>
+        </w:rPr>
+        <w:t xml:space="preserve">, </w:t>
+      </w:r>
+      <w:proofErr w:type="spellStart"/>
+      <w:r>
+        <w:rPr>
+          <w:sz w:val="21"/>
+          <w:szCs w:val="21"/>
+        </w:rPr>
+        <w:t>pay_</w:t>
+      </w:r>
+      <w:proofErr w:type="gramStart"/>
+      <w:r>
+        <w:rPr>
+          <w:sz w:val="21"/>
+          <w:szCs w:val="21"/>
+        </w:rPr>
+        <w:t>paidby,prop</w:t>
+      </w:r>
+      <w:proofErr w:type="gramEnd"/>
+      <w:r>
+        <w:rPr>
+          <w:sz w:val="21"/>
+          <w:szCs w:val="21"/>
+        </w:rPr>
+        <w:t>_no</w:t>
+      </w:r>
+      <w:proofErr w:type="spellEnd"/>
+      <w:r>
+        <w:rPr>
+          <w:sz w:val="21"/>
+          <w:szCs w:val="21"/>
+        </w:rPr>
+        <w:t>, rent_lease_startdate)</w:t>
+      </w:r>
+    </w:p>
+    <w:p>
+      <w:pPr>
+        <w:pStyle w:val="p1"/>
+        <w:rPr>
+          <w:sz w:val="21"/>
+          <w:szCs w:val="21"/>
+        </w:rPr>
+      </w:pPr>
+    </w:p>
+    <w:p>
+      <w:pPr>
+        <w:pStyle w:val="p1"/>
+        <w:rPr>
+          <w:sz w:val="21"/>
+          <w:szCs w:val="21"/>
+        </w:rPr>
+      </w:pPr>
+      <w:r>
+        <w:rPr>
+          <w:sz w:val="21"/>
+          <w:szCs w:val="21"/>
+        </w:rPr>
+        <w:t>Transitive dependencies:</w:t>
+      </w:r>
+    </w:p>
+    <w:p>
+      <w:pPr>
+        <w:pStyle w:val="p1"/>
+        <w:rPr>
+          <w:sz w:val="21"/>
+          <w:szCs w:val="21"/>
+        </w:rPr>
+      </w:pPr>
+      <w:proofErr w:type="spellStart"/>
+      <w:r>
+        <w:rPr>
+          <w:sz w:val="21"/>
+          <w:szCs w:val="21"/>
+        </w:rPr>
+        <w:t>t</w:t>
+      </w:r>
+      <w:r>
+        <w:rPr>
+          <w:sz w:val="21"/>
+          <w:szCs w:val="21"/>
+        </w:rPr>
+        <w:t>enant</w:t>
+      </w:r>
+      <w:r>
+        <w:rPr>
+          <w:sz w:val="21"/>
+          <w:szCs w:val="21"/>
+        </w:rPr>
+        <w:t>_</w:t>
+      </w:r>
+      <w:r>
+        <w:rPr>
+          <w:sz w:val="21"/>
+          <w:szCs w:val="21"/>
+        </w:rPr>
+        <w:t>no</w:t>
+      </w:r>
+      <w:proofErr w:type="spellEnd"/>
+      <w:r>
+        <w:rPr>
+          <w:sz w:val="21"/>
+          <w:szCs w:val="21"/>
+        </w:rPr>
+        <w:t xml:space="preserve"> → </w:t>
+      </w:r>
+      <w:proofErr w:type="spellStart"/>
+      <w:r>
+        <w:rPr>
+          <w:sz w:val="21"/>
+          <w:szCs w:val="21"/>
+        </w:rPr>
+        <w:t>tenant_givname</w:t>
+      </w:r>
+      <w:proofErr w:type="spellEnd"/>
+      <w:r>
+        <w:rPr>
+          <w:sz w:val="21"/>
+          <w:szCs w:val="21"/>
+        </w:rPr>
+        <w:t xml:space="preserve">, </w:t>
+      </w:r>
+      <w:proofErr w:type="spellStart"/>
+      <w:r>
+        <w:rPr>
+          <w:sz w:val="21"/>
+          <w:szCs w:val="21"/>
+        </w:rPr>
+        <w:t>tenant</w:t>
+      </w:r>
+      <w:r>
+        <w:rPr>
+          <w:sz w:val="21"/>
+          <w:szCs w:val="21"/>
+        </w:rPr>
+        <w:t>_</w:t>
+      </w:r>
+      <w:r>
+        <w:rPr>
+          <w:sz w:val="21"/>
+          <w:szCs w:val="21"/>
+        </w:rPr>
+        <w:t>famname</w:t>
+      </w:r>
+      <w:proofErr w:type="spellEnd"/>
+    </w:p>
+    <w:p>
+      <w:pPr>
+        <w:pStyle w:val="p1"/>
+        <w:rPr>
+          <w:sz w:val="21"/>
+          <w:szCs w:val="21"/>
+        </w:rPr>
+      </w:pPr>
+    </w:p>
+    <w:p>
+      <w:pPr>
+        <w:pStyle w:val="p1"/>
+        <w:rPr>
+          <w:b/>
+          <w:bCs/>
+          <w:sz w:val="21"/>
+          <w:szCs w:val="21"/>
+        </w:rPr>
+      </w:pPr>
+    </w:p>
+    <w:p>
+      <w:pPr>
+        <w:pStyle w:val="p1"/>
+        <w:rPr>
+          <w:b/>
+          <w:bCs/>
+          <w:sz w:val="21"/>
+          <w:szCs w:val="21"/>
+        </w:rPr>
+      </w:pPr>
+      <w:r>
+        <w:rPr>
+          <w:b/>
+          <w:bCs/>
+          <w:sz w:val="21"/>
+          <w:szCs w:val="21"/>
+        </w:rPr>
+        <w:t>3NF</w:t>
+      </w:r>
+    </w:p>
+    <w:p>
+      <w:pPr>
+        <w:pStyle w:val="p1"/>
+        <w:rPr>
+          <w:sz w:val="21"/>
+          <w:szCs w:val="21"/>
+        </w:rPr>
+      </w:pPr>
+      <w:r>
+        <w:rPr>
+          <w:sz w:val="21"/>
+          <w:szCs w:val="21"/>
+        </w:rPr>
+        <w:t>PROPERTY (</w:t>
+      </w:r>
+      <w:r>
+        <w:rPr>
+          <w:sz w:val="21"/>
+          <w:szCs w:val="21"/>
+          <w:u w:val="single"/>
+        </w:rPr>
+        <w:t>prop_no</w:t>
+      </w:r>
+      <w:r>
+        <w:rPr>
+          <w:sz w:val="21"/>
+          <w:szCs w:val="21"/>
+        </w:rPr>
+        <w:t>, prop_address)</w:t>
+      </w:r>
+    </w:p>
+    <w:p>
+      <w:pPr>
+        <w:pStyle w:val="p1"/>
+        <w:rPr>
+          <w:b/>
+          <w:bCs/>
+          <w:sz w:val="21"/>
+          <w:szCs w:val="21"/>
+        </w:rPr>
+      </w:pPr>
+    </w:p>
+    <w:p>
+      <w:pPr>
+        <w:pStyle w:val="p1"/>
+        <w:rPr>
+          <w:sz w:val="21"/>
+          <w:szCs w:val="21"/>
+        </w:rPr>
+      </w:pPr>
+      <w:r>
+        <w:rPr>
+          <w:sz w:val="21"/>
+          <w:szCs w:val="21"/>
+        </w:rPr>
+        <w:t>TENANT (</w:t>
+      </w:r>
+      <w:proofErr w:type="spellStart"/>
+      <w:r>
+        <w:rPr>
+          <w:sz w:val="21"/>
+          <w:szCs w:val="21"/>
+          <w:u w:val="single"/>
+        </w:rPr>
+        <w:t>tenant_</w:t>
+      </w:r>
+      <w:proofErr w:type="gramStart"/>
+      <w:r>
+        <w:rPr>
+          <w:sz w:val="21"/>
+          <w:szCs w:val="21"/>
+          <w:u w:val="single"/>
+        </w:rPr>
+        <w:t>no</w:t>
+      </w:r>
+      <w:r>
+        <w:rPr>
+          <w:sz w:val="21"/>
+          <w:szCs w:val="21"/>
+        </w:rPr>
+        <w:t>,tenant</w:t>
+      </w:r>
+      <w:proofErr w:type="gramEnd"/>
+      <w:r>
+        <w:rPr>
+          <w:sz w:val="21"/>
+          <w:szCs w:val="21"/>
+        </w:rPr>
+        <w:t>_</w:t>
+      </w:r>
+      <w:proofErr w:type="gramStart"/>
+      <w:r>
+        <w:rPr>
+          <w:sz w:val="21"/>
+          <w:szCs w:val="21"/>
+        </w:rPr>
+        <w:t>givname,tenant</w:t>
+      </w:r>
+      <w:proofErr w:type="gramEnd"/>
+      <w:r>
+        <w:rPr>
+          <w:sz w:val="21"/>
+          <w:szCs w:val="21"/>
+        </w:rPr>
+        <w:t>_famname</w:t>
+      </w:r>
+      <w:proofErr w:type="spellEnd"/>
+      <w:r>
+        <w:rPr>
+          <w:sz w:val="21"/>
+          <w:szCs w:val="21"/>
+        </w:rPr>
+        <w:t>)</w:t>
+      </w:r>
+    </w:p>
+    <w:p>
+      <w:pPr>
+        <w:pStyle w:val="p1"/>
+        <w:rPr>
+          <w:sz w:val="21"/>
+          <w:szCs w:val="21"/>
+        </w:rPr>
+      </w:pPr>
+    </w:p>
+    <w:p>
+      <w:pPr>
+        <w:pStyle w:val="p1"/>
+        <w:rPr>
+          <w:sz w:val="21"/>
+          <w:szCs w:val="21"/>
+        </w:rPr>
+      </w:pPr>
+      <w:r>
+        <w:rPr>
+          <w:sz w:val="21"/>
+          <w:szCs w:val="21"/>
+        </w:rPr>
+        <w:t>PROPERTY_TENANT (</w:t>
+      </w:r>
+      <w:r>
+        <w:rPr>
+          <w:sz w:val="21"/>
+          <w:szCs w:val="21"/>
+          <w:u w:val="single"/>
+        </w:rPr>
+        <w:t>prop_no</w:t>
+      </w:r>
+      <w:r>
+        <w:rPr>
+          <w:sz w:val="21"/>
+          <w:szCs w:val="21"/>
+        </w:rPr>
+        <w:t xml:space="preserve">, </w:t>
+      </w:r>
+      <w:r>
+        <w:rPr>
+          <w:sz w:val="21"/>
+          <w:szCs w:val="21"/>
+          <w:u w:val="single"/>
+        </w:rPr>
+        <w:t>rent_lease_startdate</w:t>
+      </w:r>
+      <w:r>
+        <w:rPr>
+          <w:sz w:val="21"/>
+          <w:szCs w:val="21"/>
+        </w:rPr>
+        <w:t xml:space="preserve">, </w:t>
+      </w:r>
+      <w:proofErr w:type="spellStart"/>
+      <w:r>
+        <w:rPr>
+          <w:sz w:val="21"/>
+          <w:szCs w:val="21"/>
+        </w:rPr>
+        <w:t>rent_weekly_</w:t>
+      </w:r>
+      <w:r>
+        <w:rPr>
+          <w:sz w:val="21"/>
+          <w:szCs w:val="21"/>
+        </w:rPr>
+        <w:t>rate</w:t>
+      </w:r>
+      <w:proofErr w:type="spellEnd"/>
+      <w:r>
+        <w:rPr>
+          <w:sz w:val="21"/>
+          <w:szCs w:val="21"/>
+        </w:rPr>
+        <w:t xml:space="preserve">, </w:t>
+      </w:r>
+      <w:proofErr w:type="spellStart"/>
+      <w:r>
+        <w:rPr>
+          <w:sz w:val="21"/>
+          <w:szCs w:val="21"/>
+        </w:rPr>
+        <w:t>rent</w:t>
+      </w:r>
+      <w:r>
+        <w:rPr>
+          <w:sz w:val="21"/>
+          <w:szCs w:val="21"/>
+        </w:rPr>
+        <w:t>_bond</w:t>
+      </w:r>
+      <w:proofErr w:type="spellEnd"/>
+      <w:r>
+        <w:rPr>
+          <w:sz w:val="21"/>
+          <w:szCs w:val="21"/>
+        </w:rPr>
+        <w:t>, tenant_no</w:t>
+      </w:r>
+      <w:r>
+        <w:rPr>
+          <w:sz w:val="21"/>
+          <w:szCs w:val="21"/>
+        </w:rPr>
+        <w:t>)</w:t>
+      </w:r>
+    </w:p>
+    <w:p>
+      <w:pPr>
+        <w:pStyle w:val="p1"/>
+        <w:rPr>
+          <w:sz w:val="21"/>
+          <w:szCs w:val="21"/>
+        </w:rPr>
+      </w:pPr>
+    </w:p>
+    <w:p>
+      <w:pPr>
+        <w:pStyle w:val="p1"/>
+        <w:rPr>
+          <w:sz w:val="21"/>
+          <w:szCs w:val="21"/>
+        </w:rPr>
+      </w:pPr>
+    </w:p>
+    <w:p>
+      <w:pPr>
+        <w:pStyle w:val="p1"/>
+        <w:rPr>
+          <w:sz w:val="21"/>
+          <w:szCs w:val="21"/>
+        </w:rPr>
+      </w:pPr>
+    </w:p>
+    <w:p>
+      <w:pPr>
+        <w:rPr>
+          <w:sz w:val="21"/>
+          <w:szCs w:val="21"/>
+          <w:lang w:val="en-US"/>
+        </w:rPr>
+      </w:pPr>
+    </w:p>
+    <w:p>
+      <w:pPr>
+        <w:rPr>
+          <w:sz w:val="21"/>
+          <w:szCs w:val="21"/>
+          <w:lang w:val="en-US"/>
+        </w:rPr>
+      </w:pPr>
     </w:p>
     <w:p>
       <w:pPr>
@@ -1576,7 +3047,7 @@
   <w:abstractNum w:abstractNumId="0" w15:restartNumberingAfterBreak="0">
     <w:nsid w:val="5E717208"/>
     <w:multiLevelType w:val="hybridMultilevel"/>
-    <w:tmpl w:val="E2162510"/>
+    <w:tmpl w:val="1DD4B912"/>
     <w:lvl w:ilvl="0" w:tplc="08090001">
       <w:start w:val="1"/>
       <w:numFmt w:val="bullet"/>

</xml_diff>

<commit_message>
Applied business rules – updated keys for RENT and DAMAGE relations
</commit_message>
<xml_diff>
--- a/Applied/App04/A4-2 NORMALISATION.docx
+++ b/Applied/App04/A4-2 NORMALISATION.docx
@@ -2968,8 +2968,17 @@
           <w:sz w:val="21"/>
           <w:szCs w:val="21"/>
         </w:rPr>
-        <w:t>, tenant_no</w:t>
-      </w:r>
+        <w:t xml:space="preserve">, </w:t>
+      </w:r>
+      <w:proofErr w:type="spellStart"/>
+      <w:r>
+        <w:rPr>
+          <w:sz w:val="21"/>
+          <w:szCs w:val="21"/>
+        </w:rPr>
+        <w:t>tenant_no</w:t>
+      </w:r>
+      <w:proofErr w:type="spellEnd"/>
       <w:r>
         <w:rPr>
           <w:sz w:val="21"/>
@@ -2995,13 +3004,1441 @@
           <w:szCs w:val="21"/>
         </w:rPr>
       </w:pPr>
-    </w:p>
-    <w:p>
-      <w:pPr>
-        <w:pStyle w:val="p1"/>
-        <w:rPr>
-          <w:sz w:val="21"/>
-          <w:szCs w:val="21"/>
+      <w:r>
+        <w:rPr>
+          <w:sz w:val="21"/>
+          <w:szCs w:val="21"/>
+        </w:rPr>
+        <w:t>PAYMENT (</w:t>
+      </w:r>
+      <w:r>
+        <w:rPr>
+          <w:sz w:val="21"/>
+          <w:szCs w:val="21"/>
+          <w:u w:val="single"/>
+        </w:rPr>
+        <w:t>pay_no</w:t>
+      </w:r>
+      <w:r>
+        <w:rPr>
+          <w:sz w:val="21"/>
+          <w:szCs w:val="21"/>
+        </w:rPr>
+        <w:t xml:space="preserve">, </w:t>
+      </w:r>
+      <w:proofErr w:type="spellStart"/>
+      <w:r>
+        <w:rPr>
+          <w:sz w:val="21"/>
+          <w:szCs w:val="21"/>
+        </w:rPr>
+        <w:t>pay_</w:t>
+      </w:r>
+      <w:proofErr w:type="gramStart"/>
+      <w:r>
+        <w:rPr>
+          <w:sz w:val="21"/>
+          <w:szCs w:val="21"/>
+        </w:rPr>
+        <w:t>date</w:t>
+      </w:r>
+      <w:r>
+        <w:rPr>
+          <w:sz w:val="21"/>
+          <w:szCs w:val="21"/>
+        </w:rPr>
+        <w:t>,pay</w:t>
+      </w:r>
+      <w:proofErr w:type="gramEnd"/>
+      <w:r>
+        <w:rPr>
+          <w:sz w:val="21"/>
+          <w:szCs w:val="21"/>
+        </w:rPr>
+        <w:t>_type</w:t>
+      </w:r>
+      <w:proofErr w:type="spellEnd"/>
+      <w:r>
+        <w:rPr>
+          <w:sz w:val="21"/>
+          <w:szCs w:val="21"/>
+        </w:rPr>
+        <w:t xml:space="preserve">, </w:t>
+      </w:r>
+      <w:proofErr w:type="spellStart"/>
+      <w:r>
+        <w:rPr>
+          <w:sz w:val="21"/>
+          <w:szCs w:val="21"/>
+        </w:rPr>
+        <w:t>pay_amount</w:t>
+      </w:r>
+      <w:proofErr w:type="spellEnd"/>
+      <w:r>
+        <w:rPr>
+          <w:sz w:val="21"/>
+          <w:szCs w:val="21"/>
+        </w:rPr>
+        <w:t xml:space="preserve">, </w:t>
+      </w:r>
+      <w:proofErr w:type="spellStart"/>
+      <w:r>
+        <w:rPr>
+          <w:sz w:val="21"/>
+          <w:szCs w:val="21"/>
+        </w:rPr>
+        <w:t>pay_</w:t>
+      </w:r>
+      <w:proofErr w:type="gramStart"/>
+      <w:r>
+        <w:rPr>
+          <w:sz w:val="21"/>
+          <w:szCs w:val="21"/>
+        </w:rPr>
+        <w:t>paidby,prop</w:t>
+      </w:r>
+      <w:proofErr w:type="gramEnd"/>
+      <w:r>
+        <w:rPr>
+          <w:sz w:val="21"/>
+          <w:szCs w:val="21"/>
+        </w:rPr>
+        <w:t>_no</w:t>
+      </w:r>
+      <w:proofErr w:type="spellEnd"/>
+      <w:r>
+        <w:rPr>
+          <w:sz w:val="21"/>
+          <w:szCs w:val="21"/>
+        </w:rPr>
+        <w:t>, rent_lease_startdate)</w:t>
+      </w:r>
+    </w:p>
+    <w:p>
+      <w:pPr>
+        <w:pStyle w:val="p1"/>
+        <w:rPr>
+          <w:sz w:val="21"/>
+          <w:szCs w:val="21"/>
+        </w:rPr>
+      </w:pPr>
+    </w:p>
+    <w:p>
+      <w:pPr>
+        <w:pStyle w:val="p1"/>
+        <w:rPr>
+          <w:sz w:val="21"/>
+          <w:szCs w:val="21"/>
+        </w:rPr>
+      </w:pPr>
+      <w:r>
+        <w:rPr>
+          <w:sz w:val="21"/>
+          <w:szCs w:val="21"/>
+        </w:rPr>
+        <w:t>Full dependencies:</w:t>
+      </w:r>
+    </w:p>
+    <w:p>
+      <w:pPr>
+        <w:pStyle w:val="p1"/>
+        <w:rPr>
+          <w:sz w:val="21"/>
+          <w:szCs w:val="21"/>
+        </w:rPr>
+      </w:pPr>
+      <w:r>
+        <w:rPr>
+          <w:sz w:val="21"/>
+          <w:szCs w:val="21"/>
+        </w:rPr>
+        <w:t>prop_no → prop_address</w:t>
+      </w:r>
+    </w:p>
+    <w:p>
+      <w:pPr>
+        <w:pStyle w:val="p1"/>
+        <w:rPr>
+          <w:sz w:val="21"/>
+          <w:szCs w:val="21"/>
+        </w:rPr>
+      </w:pPr>
+      <w:proofErr w:type="spellStart"/>
+      <w:r>
+        <w:rPr>
+          <w:sz w:val="21"/>
+          <w:szCs w:val="21"/>
+        </w:rPr>
+        <w:t>tenant</w:t>
+      </w:r>
+      <w:r>
+        <w:rPr>
+          <w:sz w:val="21"/>
+          <w:szCs w:val="21"/>
+        </w:rPr>
+        <w:t>_</w:t>
+      </w:r>
+      <w:r>
+        <w:rPr>
+          <w:sz w:val="21"/>
+          <w:szCs w:val="21"/>
+        </w:rPr>
+        <w:t>no</w:t>
+      </w:r>
+      <w:proofErr w:type="spellEnd"/>
+      <w:r>
+        <w:rPr>
+          <w:sz w:val="21"/>
+          <w:szCs w:val="21"/>
+        </w:rPr>
+        <w:t xml:space="preserve"> → </w:t>
+      </w:r>
+      <w:proofErr w:type="spellStart"/>
+      <w:r>
+        <w:rPr>
+          <w:sz w:val="21"/>
+          <w:szCs w:val="21"/>
+        </w:rPr>
+        <w:t>tenant_givname</w:t>
+      </w:r>
+      <w:proofErr w:type="spellEnd"/>
+      <w:r>
+        <w:rPr>
+          <w:sz w:val="21"/>
+          <w:szCs w:val="21"/>
+        </w:rPr>
+        <w:t xml:space="preserve">, </w:t>
+      </w:r>
+      <w:proofErr w:type="spellStart"/>
+      <w:r>
+        <w:rPr>
+          <w:sz w:val="21"/>
+          <w:szCs w:val="21"/>
+        </w:rPr>
+        <w:t>tenant</w:t>
+      </w:r>
+      <w:r>
+        <w:rPr>
+          <w:sz w:val="21"/>
+          <w:szCs w:val="21"/>
+        </w:rPr>
+        <w:t>_f</w:t>
+      </w:r>
+      <w:r>
+        <w:rPr>
+          <w:sz w:val="21"/>
+          <w:szCs w:val="21"/>
+        </w:rPr>
+        <w:t>amname</w:t>
+      </w:r>
+      <w:proofErr w:type="spellEnd"/>
+    </w:p>
+    <w:p>
+      <w:pPr>
+        <w:pStyle w:val="p1"/>
+        <w:rPr>
+          <w:sz w:val="21"/>
+          <w:szCs w:val="21"/>
+        </w:rPr>
+      </w:pPr>
+      <w:r>
+        <w:rPr>
+          <w:sz w:val="21"/>
+          <w:szCs w:val="21"/>
+        </w:rPr>
+        <w:t>prop_no, rent</w:t>
+      </w:r>
+      <w:r>
+        <w:rPr>
+          <w:sz w:val="21"/>
+          <w:szCs w:val="21"/>
+        </w:rPr>
+        <w:t>_</w:t>
+      </w:r>
+      <w:r>
+        <w:rPr>
+          <w:sz w:val="21"/>
+          <w:szCs w:val="21"/>
+        </w:rPr>
+        <w:t>lease</w:t>
+      </w:r>
+      <w:r>
+        <w:rPr>
+          <w:sz w:val="21"/>
+          <w:szCs w:val="21"/>
+        </w:rPr>
+        <w:t>_</w:t>
+      </w:r>
+      <w:r>
+        <w:rPr>
+          <w:sz w:val="21"/>
+          <w:szCs w:val="21"/>
+        </w:rPr>
+        <w:t xml:space="preserve">startdate → </w:t>
+      </w:r>
+      <w:proofErr w:type="spellStart"/>
+      <w:r>
+        <w:rPr>
+          <w:sz w:val="21"/>
+          <w:szCs w:val="21"/>
+        </w:rPr>
+        <w:t>rent</w:t>
+      </w:r>
+      <w:r>
+        <w:rPr>
+          <w:sz w:val="21"/>
+          <w:szCs w:val="21"/>
+        </w:rPr>
+        <w:t>_</w:t>
+      </w:r>
+      <w:r>
+        <w:rPr>
+          <w:sz w:val="21"/>
+          <w:szCs w:val="21"/>
+        </w:rPr>
+        <w:t>weekly</w:t>
+      </w:r>
+      <w:r>
+        <w:rPr>
+          <w:sz w:val="21"/>
+          <w:szCs w:val="21"/>
+        </w:rPr>
+        <w:t>_</w:t>
+      </w:r>
+      <w:r>
+        <w:rPr>
+          <w:sz w:val="21"/>
+          <w:szCs w:val="21"/>
+        </w:rPr>
+        <w:t>rate</w:t>
+      </w:r>
+      <w:proofErr w:type="spellEnd"/>
+      <w:r>
+        <w:rPr>
+          <w:sz w:val="21"/>
+          <w:szCs w:val="21"/>
+        </w:rPr>
+        <w:t xml:space="preserve">, </w:t>
+      </w:r>
+      <w:proofErr w:type="spellStart"/>
+      <w:r>
+        <w:rPr>
+          <w:sz w:val="21"/>
+          <w:szCs w:val="21"/>
+        </w:rPr>
+        <w:t>rent</w:t>
+      </w:r>
+      <w:r>
+        <w:rPr>
+          <w:sz w:val="21"/>
+          <w:szCs w:val="21"/>
+        </w:rPr>
+        <w:t>_</w:t>
+      </w:r>
+      <w:r>
+        <w:rPr>
+          <w:sz w:val="21"/>
+          <w:szCs w:val="21"/>
+        </w:rPr>
+        <w:t>bond</w:t>
+      </w:r>
+      <w:proofErr w:type="spellEnd"/>
+      <w:r>
+        <w:rPr>
+          <w:sz w:val="21"/>
+          <w:szCs w:val="21"/>
+        </w:rPr>
+        <w:t xml:space="preserve">, </w:t>
+      </w:r>
+      <w:proofErr w:type="spellStart"/>
+      <w:r>
+        <w:rPr>
+          <w:sz w:val="21"/>
+          <w:szCs w:val="21"/>
+        </w:rPr>
+        <w:t>tenant</w:t>
+      </w:r>
+      <w:r>
+        <w:rPr>
+          <w:sz w:val="21"/>
+          <w:szCs w:val="21"/>
+        </w:rPr>
+        <w:t>_</w:t>
+      </w:r>
+      <w:r>
+        <w:rPr>
+          <w:sz w:val="21"/>
+          <w:szCs w:val="21"/>
+        </w:rPr>
+        <w:t>no</w:t>
+      </w:r>
+      <w:proofErr w:type="spellEnd"/>
+    </w:p>
+    <w:p>
+      <w:pPr>
+        <w:pStyle w:val="p1"/>
+        <w:rPr>
+          <w:sz w:val="21"/>
+          <w:szCs w:val="21"/>
+        </w:rPr>
+      </w:pPr>
+      <w:r>
+        <w:rPr>
+          <w:sz w:val="21"/>
+          <w:szCs w:val="21"/>
+        </w:rPr>
+        <w:t xml:space="preserve">pay_no → </w:t>
+      </w:r>
+      <w:proofErr w:type="spellStart"/>
+      <w:r>
+        <w:rPr>
+          <w:sz w:val="21"/>
+          <w:szCs w:val="21"/>
+        </w:rPr>
+        <w:t>pay_date</w:t>
+      </w:r>
+      <w:proofErr w:type="spellEnd"/>
+      <w:r>
+        <w:rPr>
+          <w:sz w:val="21"/>
+          <w:szCs w:val="21"/>
+        </w:rPr>
+        <w:t xml:space="preserve">, </w:t>
+      </w:r>
+      <w:proofErr w:type="spellStart"/>
+      <w:r>
+        <w:rPr>
+          <w:sz w:val="21"/>
+          <w:szCs w:val="21"/>
+        </w:rPr>
+        <w:t>pay_type</w:t>
+      </w:r>
+      <w:proofErr w:type="spellEnd"/>
+      <w:r>
+        <w:rPr>
+          <w:sz w:val="21"/>
+          <w:szCs w:val="21"/>
+        </w:rPr>
+        <w:t xml:space="preserve">, </w:t>
+      </w:r>
+      <w:proofErr w:type="spellStart"/>
+      <w:r>
+        <w:rPr>
+          <w:sz w:val="21"/>
+          <w:szCs w:val="21"/>
+        </w:rPr>
+        <w:t>pay_amount</w:t>
+      </w:r>
+      <w:proofErr w:type="spellEnd"/>
+      <w:r>
+        <w:rPr>
+          <w:sz w:val="21"/>
+          <w:szCs w:val="21"/>
+        </w:rPr>
+        <w:t xml:space="preserve">, </w:t>
+      </w:r>
+      <w:proofErr w:type="spellStart"/>
+      <w:r>
+        <w:rPr>
+          <w:sz w:val="21"/>
+          <w:szCs w:val="21"/>
+        </w:rPr>
+        <w:t>pay_paidby</w:t>
+      </w:r>
+      <w:proofErr w:type="spellEnd"/>
+      <w:r>
+        <w:rPr>
+          <w:sz w:val="21"/>
+          <w:szCs w:val="21"/>
+        </w:rPr>
+        <w:t>, prop_no, rent</w:t>
+      </w:r>
+      <w:r>
+        <w:rPr>
+          <w:sz w:val="21"/>
+          <w:szCs w:val="21"/>
+        </w:rPr>
+        <w:t>_</w:t>
+      </w:r>
+      <w:r>
+        <w:rPr>
+          <w:sz w:val="21"/>
+          <w:szCs w:val="21"/>
+        </w:rPr>
+        <w:t>lease</w:t>
+      </w:r>
+      <w:r>
+        <w:rPr>
+          <w:sz w:val="21"/>
+          <w:szCs w:val="21"/>
+        </w:rPr>
+        <w:t>_</w:t>
+      </w:r>
+      <w:r>
+        <w:rPr>
+          <w:sz w:val="21"/>
+          <w:szCs w:val="21"/>
+        </w:rPr>
+        <w:t>startdate</w:t>
+      </w:r>
+    </w:p>
+    <w:p>
+      <w:pPr>
+        <w:pStyle w:val="p1"/>
+        <w:rPr>
+          <w:sz w:val="21"/>
+          <w:szCs w:val="21"/>
+        </w:rPr>
+      </w:pPr>
+    </w:p>
+    <w:p>
+      <w:pPr>
+        <w:pStyle w:val="p1"/>
+        <w:rPr>
+          <w:sz w:val="21"/>
+          <w:szCs w:val="21"/>
+        </w:rPr>
+      </w:pPr>
+    </w:p>
+    <w:p>
+      <w:pPr>
+        <w:pStyle w:val="p1"/>
+        <w:rPr>
+          <w:sz w:val="21"/>
+          <w:szCs w:val="21"/>
+        </w:rPr>
+      </w:pPr>
+    </w:p>
+    <w:p>
+      <w:pPr>
+        <w:spacing w:after="0" w:line="240" w:lineRule="auto"/>
+        <w:rPr>
+          <w:rFonts w:ascii="Arial" w:eastAsia="Times New Roman" w:hAnsi="Arial" w:cs="Arial"/>
+          <w:color w:val="000000" w:themeColor="text1"/>
+          <w:kern w:val="0"/>
+          <w:sz w:val="21"/>
+          <w:szCs w:val="21"/>
+          <w:lang w:eastAsia="en-GB"/>
+          <w14:ligatures w14:val="none"/>
+        </w:rPr>
+      </w:pPr>
+      <w:r>
+        <w:rPr>
+          <w:rFonts w:ascii="Arial" w:eastAsia="Times New Roman" w:hAnsi="Arial" w:cs="Arial"/>
+          <w:color w:val="000000" w:themeColor="text1"/>
+          <w:kern w:val="0"/>
+          <w:sz w:val="21"/>
+          <w:szCs w:val="21"/>
+          <w:lang w:eastAsia="en-GB"/>
+          <w14:ligatures w14:val="none"/>
+        </w:rPr>
+        <w:t>COLLECTED 3NF RELATIONS:</w:t>
+      </w:r>
+    </w:p>
+    <w:p>
+      <w:pPr>
+        <w:spacing w:after="0" w:line="240" w:lineRule="auto"/>
+        <w:rPr>
+          <w:rFonts w:ascii="Arial" w:eastAsia="Times New Roman" w:hAnsi="Arial" w:cs="Arial"/>
+          <w:color w:val="265473"/>
+          <w:kern w:val="0"/>
+          <w:sz w:val="21"/>
+          <w:szCs w:val="21"/>
+          <w:lang w:eastAsia="en-GB"/>
+          <w14:ligatures w14:val="none"/>
+        </w:rPr>
+      </w:pPr>
+    </w:p>
+    <w:p>
+      <w:pPr>
+        <w:pStyle w:val="ListParagraph"/>
+        <w:numPr>
+          <w:ilvl w:val="0"/>
+          <w:numId w:val="2"/>
+        </w:numPr>
+        <w:spacing w:after="0" w:line="240" w:lineRule="auto"/>
+        <w:rPr>
+          <w:rFonts w:ascii="Arial" w:eastAsia="Times New Roman" w:hAnsi="Arial" w:cs="Arial"/>
+          <w:color w:val="000000"/>
+          <w:kern w:val="0"/>
+          <w:sz w:val="21"/>
+          <w:szCs w:val="21"/>
+          <w:lang w:eastAsia="en-GB"/>
+          <w14:ligatures w14:val="none"/>
+        </w:rPr>
+      </w:pPr>
+      <w:r>
+        <w:rPr>
+          <w:rFonts w:ascii="Arial" w:eastAsia="Times New Roman" w:hAnsi="Arial" w:cs="Arial"/>
+          <w:color w:val="000000"/>
+          <w:kern w:val="0"/>
+          <w:sz w:val="21"/>
+          <w:szCs w:val="21"/>
+          <w:lang w:eastAsia="en-GB"/>
+          <w14:ligatures w14:val="none"/>
+        </w:rPr>
+        <w:t>OWNER (</w:t>
+      </w:r>
+      <w:proofErr w:type="spellStart"/>
+      <w:r>
+        <w:rPr>
+          <w:rFonts w:ascii="Arial" w:eastAsia="Times New Roman" w:hAnsi="Arial" w:cs="Arial"/>
+          <w:color w:val="000000"/>
+          <w:kern w:val="0"/>
+          <w:sz w:val="21"/>
+          <w:szCs w:val="21"/>
+          <w:u w:val="single"/>
+          <w:lang w:eastAsia="en-GB"/>
+          <w14:ligatures w14:val="none"/>
+        </w:rPr>
+        <w:t>owner</w:t>
+      </w:r>
+      <w:r>
+        <w:rPr>
+          <w:rFonts w:ascii="Arial" w:eastAsia="Times New Roman" w:hAnsi="Arial" w:cs="Arial"/>
+          <w:color w:val="000000"/>
+          <w:kern w:val="0"/>
+          <w:sz w:val="21"/>
+          <w:szCs w:val="21"/>
+          <w:u w:val="single"/>
+          <w:lang w:eastAsia="en-GB"/>
+          <w14:ligatures w14:val="none"/>
+        </w:rPr>
+        <w:t>_</w:t>
+      </w:r>
+      <w:r>
+        <w:rPr>
+          <w:rFonts w:ascii="Arial" w:eastAsia="Times New Roman" w:hAnsi="Arial" w:cs="Arial"/>
+          <w:color w:val="000000"/>
+          <w:kern w:val="0"/>
+          <w:sz w:val="21"/>
+          <w:szCs w:val="21"/>
+          <w:u w:val="single"/>
+          <w:lang w:eastAsia="en-GB"/>
+          <w14:ligatures w14:val="none"/>
+        </w:rPr>
+        <w:t>no</w:t>
+      </w:r>
+      <w:proofErr w:type="spellEnd"/>
+      <w:r>
+        <w:rPr>
+          <w:rFonts w:ascii="Arial" w:eastAsia="Times New Roman" w:hAnsi="Arial" w:cs="Arial"/>
+          <w:color w:val="000000"/>
+          <w:kern w:val="0"/>
+          <w:sz w:val="21"/>
+          <w:szCs w:val="21"/>
+          <w:lang w:eastAsia="en-GB"/>
+          <w14:ligatures w14:val="none"/>
+        </w:rPr>
+        <w:t xml:space="preserve">, </w:t>
+      </w:r>
+      <w:proofErr w:type="spellStart"/>
+      <w:r>
+        <w:rPr>
+          <w:rFonts w:ascii="Arial" w:eastAsia="Times New Roman" w:hAnsi="Arial" w:cs="Arial"/>
+          <w:color w:val="000000"/>
+          <w:kern w:val="0"/>
+          <w:sz w:val="21"/>
+          <w:szCs w:val="21"/>
+          <w:lang w:eastAsia="en-GB"/>
+          <w14:ligatures w14:val="none"/>
+        </w:rPr>
+        <w:t>owner_givname</w:t>
+      </w:r>
+      <w:proofErr w:type="spellEnd"/>
+      <w:r>
+        <w:rPr>
+          <w:rFonts w:ascii="Arial" w:eastAsia="Times New Roman" w:hAnsi="Arial" w:cs="Arial"/>
+          <w:color w:val="000000"/>
+          <w:kern w:val="0"/>
+          <w:sz w:val="21"/>
+          <w:szCs w:val="21"/>
+          <w:lang w:eastAsia="en-GB"/>
+          <w14:ligatures w14:val="none"/>
+        </w:rPr>
+        <w:t xml:space="preserve">, </w:t>
+      </w:r>
+      <w:proofErr w:type="spellStart"/>
+      <w:r>
+        <w:rPr>
+          <w:rFonts w:ascii="Arial" w:eastAsia="Times New Roman" w:hAnsi="Arial" w:cs="Arial"/>
+          <w:color w:val="000000"/>
+          <w:kern w:val="0"/>
+          <w:sz w:val="21"/>
+          <w:szCs w:val="21"/>
+          <w:lang w:eastAsia="en-GB"/>
+          <w14:ligatures w14:val="none"/>
+        </w:rPr>
+        <w:t>owner</w:t>
+      </w:r>
+      <w:r>
+        <w:rPr>
+          <w:rFonts w:ascii="Arial" w:eastAsia="Times New Roman" w:hAnsi="Arial" w:cs="Arial"/>
+          <w:color w:val="000000"/>
+          <w:kern w:val="0"/>
+          <w:sz w:val="21"/>
+          <w:szCs w:val="21"/>
+          <w:lang w:eastAsia="en-GB"/>
+          <w14:ligatures w14:val="none"/>
+        </w:rPr>
+        <w:t>_</w:t>
+      </w:r>
+      <w:r>
+        <w:rPr>
+          <w:rFonts w:ascii="Arial" w:eastAsia="Times New Roman" w:hAnsi="Arial" w:cs="Arial"/>
+          <w:color w:val="000000"/>
+          <w:kern w:val="0"/>
+          <w:sz w:val="21"/>
+          <w:szCs w:val="21"/>
+          <w:lang w:eastAsia="en-GB"/>
+          <w14:ligatures w14:val="none"/>
+        </w:rPr>
+        <w:t>famname</w:t>
+      </w:r>
+      <w:proofErr w:type="spellEnd"/>
+      <w:r>
+        <w:rPr>
+          <w:rFonts w:ascii="Arial" w:eastAsia="Times New Roman" w:hAnsi="Arial" w:cs="Arial"/>
+          <w:color w:val="000000"/>
+          <w:kern w:val="0"/>
+          <w:sz w:val="21"/>
+          <w:szCs w:val="21"/>
+          <w:lang w:eastAsia="en-GB"/>
+          <w14:ligatures w14:val="none"/>
+        </w:rPr>
+        <w:t xml:space="preserve">, </w:t>
+      </w:r>
+      <w:proofErr w:type="spellStart"/>
+      <w:r>
+        <w:rPr>
+          <w:rFonts w:ascii="Arial" w:eastAsia="Times New Roman" w:hAnsi="Arial" w:cs="Arial"/>
+          <w:color w:val="000000"/>
+          <w:kern w:val="0"/>
+          <w:sz w:val="21"/>
+          <w:szCs w:val="21"/>
+          <w:lang w:eastAsia="en-GB"/>
+          <w14:ligatures w14:val="none"/>
+        </w:rPr>
+        <w:t>owner</w:t>
+      </w:r>
+      <w:r>
+        <w:rPr>
+          <w:rFonts w:ascii="Arial" w:eastAsia="Times New Roman" w:hAnsi="Arial" w:cs="Arial"/>
+          <w:color w:val="000000"/>
+          <w:kern w:val="0"/>
+          <w:sz w:val="21"/>
+          <w:szCs w:val="21"/>
+          <w:lang w:eastAsia="en-GB"/>
+          <w14:ligatures w14:val="none"/>
+        </w:rPr>
+        <w:t>_</w:t>
+      </w:r>
+      <w:r>
+        <w:rPr>
+          <w:rFonts w:ascii="Arial" w:eastAsia="Times New Roman" w:hAnsi="Arial" w:cs="Arial"/>
+          <w:color w:val="000000"/>
+          <w:kern w:val="0"/>
+          <w:sz w:val="21"/>
+          <w:szCs w:val="21"/>
+          <w:lang w:eastAsia="en-GB"/>
+          <w14:ligatures w14:val="none"/>
+        </w:rPr>
+        <w:t>address</w:t>
+      </w:r>
+      <w:proofErr w:type="spellEnd"/>
+      <w:r>
+        <w:rPr>
+          <w:rFonts w:ascii="Arial" w:eastAsia="Times New Roman" w:hAnsi="Arial" w:cs="Arial"/>
+          <w:color w:val="000000"/>
+          <w:kern w:val="0"/>
+          <w:sz w:val="21"/>
+          <w:szCs w:val="21"/>
+          <w:lang w:eastAsia="en-GB"/>
+          <w14:ligatures w14:val="none"/>
+        </w:rPr>
+        <w:t>)</w:t>
+      </w:r>
+    </w:p>
+    <w:p>
+      <w:pPr>
+        <w:pStyle w:val="ListParagraph"/>
+        <w:numPr>
+          <w:ilvl w:val="0"/>
+          <w:numId w:val="2"/>
+        </w:numPr>
+        <w:spacing w:after="0" w:line="240" w:lineRule="auto"/>
+        <w:rPr>
+          <w:rFonts w:ascii="Arial" w:eastAsia="Times New Roman" w:hAnsi="Arial" w:cs="Arial"/>
+          <w:color w:val="000000"/>
+          <w:kern w:val="0"/>
+          <w:sz w:val="21"/>
+          <w:szCs w:val="21"/>
+          <w:lang w:eastAsia="en-GB"/>
+          <w14:ligatures w14:val="none"/>
+        </w:rPr>
+      </w:pPr>
+      <w:r>
+        <w:rPr>
+          <w:rFonts w:ascii="Arial" w:eastAsia="Times New Roman" w:hAnsi="Arial" w:cs="Arial"/>
+          <w:color w:val="000000"/>
+          <w:kern w:val="0"/>
+          <w:sz w:val="21"/>
+          <w:szCs w:val="21"/>
+          <w:lang w:eastAsia="en-GB"/>
+          <w14:ligatures w14:val="none"/>
+        </w:rPr>
+        <w:t>PROPERTY (</w:t>
+      </w:r>
+      <w:r>
+        <w:rPr>
+          <w:rFonts w:ascii="Arial" w:eastAsia="Times New Roman" w:hAnsi="Arial" w:cs="Arial"/>
+          <w:color w:val="000000"/>
+          <w:kern w:val="0"/>
+          <w:sz w:val="21"/>
+          <w:szCs w:val="21"/>
+          <w:u w:val="single"/>
+          <w:lang w:eastAsia="en-GB"/>
+          <w14:ligatures w14:val="none"/>
+        </w:rPr>
+        <w:t>prop_no,</w:t>
+      </w:r>
+      <w:r>
+        <w:rPr>
+          <w:rFonts w:ascii="Arial" w:eastAsia="Times New Roman" w:hAnsi="Arial" w:cs="Arial"/>
+          <w:color w:val="000000"/>
+          <w:kern w:val="0"/>
+          <w:sz w:val="21"/>
+          <w:szCs w:val="21"/>
+          <w:lang w:eastAsia="en-GB"/>
+          <w14:ligatures w14:val="none"/>
+        </w:rPr>
+        <w:t xml:space="preserve"> prop_address, </w:t>
+      </w:r>
+      <w:proofErr w:type="spellStart"/>
+      <w:r>
+        <w:rPr>
+          <w:rFonts w:ascii="Arial" w:eastAsia="Times New Roman" w:hAnsi="Arial" w:cs="Arial"/>
+          <w:color w:val="000000"/>
+          <w:kern w:val="0"/>
+          <w:sz w:val="21"/>
+          <w:szCs w:val="21"/>
+          <w:lang w:eastAsia="en-GB"/>
+          <w14:ligatures w14:val="none"/>
+        </w:rPr>
+        <w:t>owner_no</w:t>
+      </w:r>
+      <w:proofErr w:type="spellEnd"/>
+      <w:r>
+        <w:rPr>
+          <w:rFonts w:ascii="Arial" w:eastAsia="Times New Roman" w:hAnsi="Arial" w:cs="Arial"/>
+          <w:color w:val="000000"/>
+          <w:kern w:val="0"/>
+          <w:sz w:val="21"/>
+          <w:szCs w:val="21"/>
+          <w:lang w:eastAsia="en-GB"/>
+          <w14:ligatures w14:val="none"/>
+        </w:rPr>
+        <w:t>)</w:t>
+      </w:r>
+    </w:p>
+    <w:p>
+      <w:pPr>
+        <w:pStyle w:val="ListParagraph"/>
+        <w:numPr>
+          <w:ilvl w:val="0"/>
+          <w:numId w:val="2"/>
+        </w:numPr>
+        <w:spacing w:after="0" w:line="240" w:lineRule="auto"/>
+        <w:rPr>
+          <w:rFonts w:ascii="Arial" w:eastAsia="Times New Roman" w:hAnsi="Arial" w:cs="Arial"/>
+          <w:color w:val="000000"/>
+          <w:kern w:val="0"/>
+          <w:sz w:val="21"/>
+          <w:szCs w:val="21"/>
+          <w:lang w:eastAsia="en-GB"/>
+          <w14:ligatures w14:val="none"/>
+        </w:rPr>
+      </w:pPr>
+      <w:r>
+        <w:rPr>
+          <w:rFonts w:ascii="Arial" w:eastAsia="Times New Roman" w:hAnsi="Arial" w:cs="Arial"/>
+          <w:color w:val="000000"/>
+          <w:kern w:val="0"/>
+          <w:sz w:val="21"/>
+          <w:szCs w:val="21"/>
+          <w:lang w:eastAsia="en-GB"/>
+          <w14:ligatures w14:val="none"/>
+        </w:rPr>
+        <w:t>MAINTAINENCE (</w:t>
+      </w:r>
+      <w:r>
+        <w:rPr>
+          <w:rFonts w:ascii="Arial" w:eastAsia="Times New Roman" w:hAnsi="Arial" w:cs="Arial"/>
+          <w:color w:val="000000"/>
+          <w:kern w:val="0"/>
+          <w:sz w:val="21"/>
+          <w:szCs w:val="21"/>
+          <w:u w:val="single"/>
+          <w:lang w:eastAsia="en-GB"/>
+          <w14:ligatures w14:val="none"/>
+        </w:rPr>
+        <w:t>prop_no</w:t>
+      </w:r>
+      <w:r>
+        <w:rPr>
+          <w:rFonts w:ascii="Arial" w:eastAsia="Times New Roman" w:hAnsi="Arial" w:cs="Arial"/>
+          <w:color w:val="000000"/>
+          <w:kern w:val="0"/>
+          <w:sz w:val="21"/>
+          <w:szCs w:val="21"/>
+          <w:lang w:eastAsia="en-GB"/>
+          <w14:ligatures w14:val="none"/>
+        </w:rPr>
+        <w:t xml:space="preserve">, </w:t>
+      </w:r>
+      <w:r>
+        <w:rPr>
+          <w:rFonts w:ascii="Arial" w:eastAsia="Times New Roman" w:hAnsi="Arial" w:cs="Arial"/>
+          <w:color w:val="000000"/>
+          <w:kern w:val="0"/>
+          <w:sz w:val="21"/>
+          <w:szCs w:val="21"/>
+          <w:u w:val="single"/>
+          <w:lang w:eastAsia="en-GB"/>
+          <w14:ligatures w14:val="none"/>
+        </w:rPr>
+        <w:t>maint_datetime</w:t>
+      </w:r>
+      <w:r>
+        <w:rPr>
+          <w:rFonts w:ascii="Arial" w:eastAsia="Times New Roman" w:hAnsi="Arial" w:cs="Arial"/>
+          <w:color w:val="000000"/>
+          <w:kern w:val="0"/>
+          <w:sz w:val="21"/>
+          <w:szCs w:val="21"/>
+          <w:lang w:eastAsia="en-GB"/>
+          <w14:ligatures w14:val="none"/>
+        </w:rPr>
+        <w:t xml:space="preserve">, </w:t>
+      </w:r>
+      <w:proofErr w:type="spellStart"/>
+      <w:r>
+        <w:rPr>
+          <w:rFonts w:ascii="Arial" w:eastAsia="Times New Roman" w:hAnsi="Arial" w:cs="Arial"/>
+          <w:color w:val="000000"/>
+          <w:kern w:val="0"/>
+          <w:sz w:val="21"/>
+          <w:szCs w:val="21"/>
+          <w:lang w:eastAsia="en-GB"/>
+          <w14:ligatures w14:val="none"/>
+        </w:rPr>
+        <w:t>maint_desc</w:t>
+      </w:r>
+      <w:proofErr w:type="spellEnd"/>
+      <w:r>
+        <w:rPr>
+          <w:rFonts w:ascii="Arial" w:eastAsia="Times New Roman" w:hAnsi="Arial" w:cs="Arial"/>
+          <w:color w:val="000000"/>
+          <w:kern w:val="0"/>
+          <w:sz w:val="21"/>
+          <w:szCs w:val="21"/>
+          <w:lang w:eastAsia="en-GB"/>
+          <w14:ligatures w14:val="none"/>
+        </w:rPr>
+        <w:t>, maint_cost)</w:t>
+      </w:r>
+    </w:p>
+    <w:p>
+      <w:pPr>
+        <w:pStyle w:val="ListParagraph"/>
+        <w:numPr>
+          <w:ilvl w:val="0"/>
+          <w:numId w:val="2"/>
+        </w:numPr>
+        <w:spacing w:after="0" w:line="240" w:lineRule="auto"/>
+        <w:rPr>
+          <w:rFonts w:ascii="Arial" w:eastAsia="Times New Roman" w:hAnsi="Arial" w:cs="Arial"/>
+          <w:color w:val="000000"/>
+          <w:kern w:val="0"/>
+          <w:sz w:val="21"/>
+          <w:szCs w:val="21"/>
+          <w:lang w:eastAsia="en-GB"/>
+          <w14:ligatures w14:val="none"/>
+        </w:rPr>
+      </w:pPr>
+      <w:r>
+        <w:rPr>
+          <w:rFonts w:ascii="Arial" w:eastAsia="Times New Roman" w:hAnsi="Arial" w:cs="Arial"/>
+          <w:color w:val="000000"/>
+          <w:kern w:val="0"/>
+          <w:sz w:val="21"/>
+          <w:szCs w:val="21"/>
+          <w:lang w:eastAsia="en-GB"/>
+          <w14:ligatures w14:val="none"/>
+        </w:rPr>
+        <w:t>PROPERTY (</w:t>
+      </w:r>
+      <w:r>
+        <w:rPr>
+          <w:rFonts w:ascii="Arial" w:eastAsia="Times New Roman" w:hAnsi="Arial" w:cs="Arial"/>
+          <w:color w:val="000000"/>
+          <w:kern w:val="0"/>
+          <w:sz w:val="21"/>
+          <w:szCs w:val="21"/>
+          <w:u w:val="single"/>
+          <w:lang w:eastAsia="en-GB"/>
+          <w14:ligatures w14:val="none"/>
+        </w:rPr>
+        <w:t>prop_no,</w:t>
+      </w:r>
+      <w:r>
+        <w:rPr>
+          <w:rFonts w:ascii="Arial" w:eastAsia="Times New Roman" w:hAnsi="Arial" w:cs="Arial"/>
+          <w:color w:val="000000"/>
+          <w:kern w:val="0"/>
+          <w:sz w:val="21"/>
+          <w:szCs w:val="21"/>
+          <w:lang w:eastAsia="en-GB"/>
+          <w14:ligatures w14:val="none"/>
+        </w:rPr>
+        <w:t xml:space="preserve"> prop_address)</w:t>
+      </w:r>
+    </w:p>
+    <w:p>
+      <w:pPr>
+        <w:pStyle w:val="ListParagraph"/>
+        <w:numPr>
+          <w:ilvl w:val="0"/>
+          <w:numId w:val="2"/>
+        </w:numPr>
+        <w:spacing w:after="0" w:line="240" w:lineRule="auto"/>
+        <w:rPr>
+          <w:rFonts w:ascii="Arial" w:eastAsia="Times New Roman" w:hAnsi="Arial" w:cs="Arial"/>
+          <w:color w:val="000000"/>
+          <w:kern w:val="0"/>
+          <w:sz w:val="21"/>
+          <w:szCs w:val="21"/>
+          <w:lang w:eastAsia="en-GB"/>
+          <w14:ligatures w14:val="none"/>
+        </w:rPr>
+      </w:pPr>
+      <w:r>
+        <w:rPr>
+          <w:rFonts w:ascii="Arial" w:eastAsia="Times New Roman" w:hAnsi="Arial" w:cs="Arial"/>
+          <w:color w:val="000000"/>
+          <w:kern w:val="0"/>
+          <w:sz w:val="21"/>
+          <w:szCs w:val="21"/>
+          <w:lang w:eastAsia="en-GB"/>
+          <w14:ligatures w14:val="none"/>
+        </w:rPr>
+        <w:lastRenderedPageBreak/>
+        <w:t>TENANT (</w:t>
+      </w:r>
+      <w:proofErr w:type="spellStart"/>
+      <w:r>
+        <w:rPr>
+          <w:rFonts w:ascii="Arial" w:eastAsia="Times New Roman" w:hAnsi="Arial" w:cs="Arial"/>
+          <w:color w:val="000000"/>
+          <w:kern w:val="0"/>
+          <w:sz w:val="21"/>
+          <w:szCs w:val="21"/>
+          <w:u w:val="single"/>
+          <w:lang w:eastAsia="en-GB"/>
+          <w14:ligatures w14:val="none"/>
+        </w:rPr>
+        <w:t>tenant_no</w:t>
+      </w:r>
+      <w:proofErr w:type="spellEnd"/>
+      <w:r>
+        <w:rPr>
+          <w:rFonts w:ascii="Arial" w:eastAsia="Times New Roman" w:hAnsi="Arial" w:cs="Arial"/>
+          <w:color w:val="000000"/>
+          <w:kern w:val="0"/>
+          <w:sz w:val="21"/>
+          <w:szCs w:val="21"/>
+          <w:lang w:eastAsia="en-GB"/>
+          <w14:ligatures w14:val="none"/>
+        </w:rPr>
+        <w:t xml:space="preserve">, </w:t>
+      </w:r>
+      <w:proofErr w:type="spellStart"/>
+      <w:r>
+        <w:rPr>
+          <w:rFonts w:ascii="Arial" w:eastAsia="Times New Roman" w:hAnsi="Arial" w:cs="Arial"/>
+          <w:color w:val="000000"/>
+          <w:kern w:val="0"/>
+          <w:sz w:val="21"/>
+          <w:szCs w:val="21"/>
+          <w:lang w:eastAsia="en-GB"/>
+          <w14:ligatures w14:val="none"/>
+        </w:rPr>
+        <w:t>tenant_givname</w:t>
+      </w:r>
+      <w:proofErr w:type="spellEnd"/>
+      <w:r>
+        <w:rPr>
+          <w:rFonts w:ascii="Arial" w:eastAsia="Times New Roman" w:hAnsi="Arial" w:cs="Arial"/>
+          <w:color w:val="000000"/>
+          <w:kern w:val="0"/>
+          <w:sz w:val="21"/>
+          <w:szCs w:val="21"/>
+          <w:lang w:eastAsia="en-GB"/>
+          <w14:ligatures w14:val="none"/>
+        </w:rPr>
+        <w:t xml:space="preserve">, </w:t>
+      </w:r>
+      <w:proofErr w:type="spellStart"/>
+      <w:r>
+        <w:rPr>
+          <w:rFonts w:ascii="Arial" w:eastAsia="Times New Roman" w:hAnsi="Arial" w:cs="Arial"/>
+          <w:color w:val="000000"/>
+          <w:kern w:val="0"/>
+          <w:sz w:val="21"/>
+          <w:szCs w:val="21"/>
+          <w:lang w:eastAsia="en-GB"/>
+          <w14:ligatures w14:val="none"/>
+        </w:rPr>
+        <w:t>tenant_famname</w:t>
+      </w:r>
+      <w:proofErr w:type="spellEnd"/>
+      <w:r>
+        <w:rPr>
+          <w:rFonts w:ascii="Arial" w:eastAsia="Times New Roman" w:hAnsi="Arial" w:cs="Arial"/>
+          <w:color w:val="000000"/>
+          <w:kern w:val="0"/>
+          <w:sz w:val="21"/>
+          <w:szCs w:val="21"/>
+          <w:lang w:eastAsia="en-GB"/>
+          <w14:ligatures w14:val="none"/>
+        </w:rPr>
+        <w:t>)</w:t>
+      </w:r>
+    </w:p>
+    <w:p>
+      <w:pPr>
+        <w:pStyle w:val="ListParagraph"/>
+        <w:numPr>
+          <w:ilvl w:val="0"/>
+          <w:numId w:val="2"/>
+        </w:numPr>
+        <w:spacing w:after="0" w:line="240" w:lineRule="auto"/>
+        <w:rPr>
+          <w:rFonts w:ascii="Arial" w:eastAsia="Times New Roman" w:hAnsi="Arial" w:cs="Arial"/>
+          <w:color w:val="000000"/>
+          <w:kern w:val="0"/>
+          <w:sz w:val="21"/>
+          <w:szCs w:val="21"/>
+          <w:u w:val="single"/>
+          <w:lang w:eastAsia="en-GB"/>
+          <w14:ligatures w14:val="none"/>
+        </w:rPr>
+      </w:pPr>
+      <w:r>
+        <w:rPr>
+          <w:rFonts w:ascii="Arial" w:eastAsia="Times New Roman" w:hAnsi="Arial" w:cs="Arial"/>
+          <w:color w:val="000000"/>
+          <w:kern w:val="0"/>
+          <w:sz w:val="21"/>
+          <w:szCs w:val="21"/>
+          <w:lang w:eastAsia="en-GB"/>
+          <w14:ligatures w14:val="none"/>
+        </w:rPr>
+        <w:t>PROPERTY_TENANT (</w:t>
+      </w:r>
+      <w:r>
+        <w:rPr>
+          <w:rFonts w:ascii="Arial" w:eastAsia="Times New Roman" w:hAnsi="Arial" w:cs="Arial"/>
+          <w:color w:val="000000"/>
+          <w:kern w:val="0"/>
+          <w:sz w:val="21"/>
+          <w:szCs w:val="21"/>
+          <w:u w:val="single"/>
+          <w:lang w:eastAsia="en-GB"/>
+          <w14:ligatures w14:val="none"/>
+        </w:rPr>
+        <w:t>prop_no,</w:t>
+      </w:r>
+      <w:r>
+        <w:rPr>
+          <w:rFonts w:ascii="Arial" w:eastAsia="Times New Roman" w:hAnsi="Arial" w:cs="Arial"/>
+          <w:color w:val="000000"/>
+          <w:kern w:val="0"/>
+          <w:sz w:val="21"/>
+          <w:szCs w:val="21"/>
+          <w:lang w:eastAsia="en-GB"/>
+          <w14:ligatures w14:val="none"/>
+        </w:rPr>
+        <w:t xml:space="preserve"> </w:t>
+      </w:r>
+      <w:r>
+        <w:rPr>
+          <w:rFonts w:ascii="Arial" w:eastAsia="Times New Roman" w:hAnsi="Arial" w:cs="Arial"/>
+          <w:color w:val="000000"/>
+          <w:kern w:val="0"/>
+          <w:sz w:val="21"/>
+          <w:szCs w:val="21"/>
+          <w:u w:val="single"/>
+          <w:lang w:eastAsia="en-GB"/>
+          <w14:ligatures w14:val="none"/>
+        </w:rPr>
+        <w:t xml:space="preserve">rent_lease_startdate, </w:t>
+      </w:r>
+      <w:proofErr w:type="spellStart"/>
+      <w:r>
+        <w:rPr>
+          <w:rFonts w:ascii="Arial" w:eastAsia="Times New Roman" w:hAnsi="Arial" w:cs="Arial"/>
+          <w:color w:val="000000"/>
+          <w:kern w:val="0"/>
+          <w:sz w:val="21"/>
+          <w:szCs w:val="21"/>
+          <w:lang w:eastAsia="en-GB"/>
+          <w14:ligatures w14:val="none"/>
+        </w:rPr>
+        <w:t>rent_weekly_rate</w:t>
+      </w:r>
+      <w:proofErr w:type="spellEnd"/>
+      <w:r>
+        <w:rPr>
+          <w:rFonts w:ascii="Arial" w:eastAsia="Times New Roman" w:hAnsi="Arial" w:cs="Arial"/>
+          <w:color w:val="000000"/>
+          <w:kern w:val="0"/>
+          <w:sz w:val="21"/>
+          <w:szCs w:val="21"/>
+          <w:lang w:eastAsia="en-GB"/>
+          <w14:ligatures w14:val="none"/>
+        </w:rPr>
+        <w:t xml:space="preserve">, </w:t>
+      </w:r>
+      <w:proofErr w:type="spellStart"/>
+      <w:r>
+        <w:rPr>
+          <w:rFonts w:ascii="Arial" w:eastAsia="Times New Roman" w:hAnsi="Arial" w:cs="Arial"/>
+          <w:color w:val="000000"/>
+          <w:kern w:val="0"/>
+          <w:sz w:val="21"/>
+          <w:szCs w:val="21"/>
+          <w:lang w:eastAsia="en-GB"/>
+          <w14:ligatures w14:val="none"/>
+        </w:rPr>
+        <w:t>rent_bond</w:t>
+      </w:r>
+      <w:proofErr w:type="spellEnd"/>
+      <w:r>
+        <w:rPr>
+          <w:rFonts w:ascii="Arial" w:eastAsia="Times New Roman" w:hAnsi="Arial" w:cs="Arial"/>
+          <w:color w:val="000000"/>
+          <w:kern w:val="0"/>
+          <w:sz w:val="21"/>
+          <w:szCs w:val="21"/>
+          <w:lang w:eastAsia="en-GB"/>
+          <w14:ligatures w14:val="none"/>
+        </w:rPr>
+        <w:t xml:space="preserve">, </w:t>
+      </w:r>
+      <w:proofErr w:type="spellStart"/>
+      <w:r>
+        <w:rPr>
+          <w:rFonts w:ascii="Arial" w:eastAsia="Times New Roman" w:hAnsi="Arial" w:cs="Arial"/>
+          <w:color w:val="000000"/>
+          <w:kern w:val="0"/>
+          <w:sz w:val="21"/>
+          <w:szCs w:val="21"/>
+          <w:lang w:eastAsia="en-GB"/>
+          <w14:ligatures w14:val="none"/>
+        </w:rPr>
+        <w:t>tenant_no</w:t>
+      </w:r>
+      <w:proofErr w:type="spellEnd"/>
+      <w:r>
+        <w:rPr>
+          <w:rFonts w:ascii="Arial" w:eastAsia="Times New Roman" w:hAnsi="Arial" w:cs="Arial"/>
+          <w:color w:val="000000"/>
+          <w:kern w:val="0"/>
+          <w:sz w:val="21"/>
+          <w:szCs w:val="21"/>
+          <w:lang w:eastAsia="en-GB"/>
+          <w14:ligatures w14:val="none"/>
+        </w:rPr>
+        <w:t>)</w:t>
+      </w:r>
+    </w:p>
+    <w:p>
+      <w:pPr>
+        <w:pStyle w:val="ListParagraph"/>
+        <w:numPr>
+          <w:ilvl w:val="0"/>
+          <w:numId w:val="2"/>
+        </w:numPr>
+        <w:spacing w:after="0" w:line="240" w:lineRule="auto"/>
+        <w:rPr>
+          <w:rFonts w:ascii="Arial" w:eastAsia="Times New Roman" w:hAnsi="Arial" w:cs="Arial"/>
+          <w:color w:val="000000"/>
+          <w:kern w:val="0"/>
+          <w:sz w:val="21"/>
+          <w:szCs w:val="21"/>
+          <w:u w:val="single"/>
+          <w:lang w:eastAsia="en-GB"/>
+          <w14:ligatures w14:val="none"/>
+        </w:rPr>
+      </w:pPr>
+      <w:r>
+        <w:rPr>
+          <w:rFonts w:ascii="Arial" w:eastAsia="Times New Roman" w:hAnsi="Arial" w:cs="Arial"/>
+          <w:color w:val="000000"/>
+          <w:kern w:val="0"/>
+          <w:sz w:val="21"/>
+          <w:szCs w:val="21"/>
+          <w:lang w:eastAsia="en-GB"/>
+          <w14:ligatures w14:val="none"/>
+        </w:rPr>
+        <w:t>PAYMENT (</w:t>
+      </w:r>
+      <w:r>
+        <w:rPr>
+          <w:rFonts w:ascii="Arial" w:eastAsia="Times New Roman" w:hAnsi="Arial" w:cs="Arial"/>
+          <w:color w:val="000000"/>
+          <w:kern w:val="0"/>
+          <w:sz w:val="21"/>
+          <w:szCs w:val="21"/>
+          <w:u w:val="single"/>
+          <w:lang w:eastAsia="en-GB"/>
+          <w14:ligatures w14:val="none"/>
+        </w:rPr>
+        <w:t>pay_no,</w:t>
+      </w:r>
+      <w:r>
+        <w:rPr>
+          <w:rFonts w:ascii="Arial" w:eastAsia="Times New Roman" w:hAnsi="Arial" w:cs="Arial"/>
+          <w:color w:val="000000"/>
+          <w:kern w:val="0"/>
+          <w:sz w:val="21"/>
+          <w:szCs w:val="21"/>
+          <w:lang w:eastAsia="en-GB"/>
+          <w14:ligatures w14:val="none"/>
+        </w:rPr>
+        <w:t xml:space="preserve"> </w:t>
+      </w:r>
+      <w:proofErr w:type="spellStart"/>
+      <w:r>
+        <w:rPr>
+          <w:rFonts w:ascii="Arial" w:eastAsia="Times New Roman" w:hAnsi="Arial" w:cs="Arial"/>
+          <w:color w:val="000000"/>
+          <w:kern w:val="0"/>
+          <w:sz w:val="21"/>
+          <w:szCs w:val="21"/>
+          <w:lang w:eastAsia="en-GB"/>
+          <w14:ligatures w14:val="none"/>
+        </w:rPr>
+        <w:t>pay_date</w:t>
+      </w:r>
+      <w:proofErr w:type="spellEnd"/>
+      <w:r>
+        <w:rPr>
+          <w:rFonts w:ascii="Arial" w:eastAsia="Times New Roman" w:hAnsi="Arial" w:cs="Arial"/>
+          <w:color w:val="000000"/>
+          <w:kern w:val="0"/>
+          <w:sz w:val="21"/>
+          <w:szCs w:val="21"/>
+          <w:lang w:eastAsia="en-GB"/>
+          <w14:ligatures w14:val="none"/>
+        </w:rPr>
+        <w:t xml:space="preserve">, </w:t>
+      </w:r>
+      <w:proofErr w:type="spellStart"/>
+      <w:r>
+        <w:rPr>
+          <w:rFonts w:ascii="Arial" w:eastAsia="Times New Roman" w:hAnsi="Arial" w:cs="Arial"/>
+          <w:color w:val="000000"/>
+          <w:kern w:val="0"/>
+          <w:sz w:val="21"/>
+          <w:szCs w:val="21"/>
+          <w:lang w:eastAsia="en-GB"/>
+          <w14:ligatures w14:val="none"/>
+        </w:rPr>
+        <w:t>pay_type</w:t>
+      </w:r>
+      <w:proofErr w:type="spellEnd"/>
+      <w:r>
+        <w:rPr>
+          <w:rFonts w:ascii="Arial" w:eastAsia="Times New Roman" w:hAnsi="Arial" w:cs="Arial"/>
+          <w:color w:val="000000"/>
+          <w:kern w:val="0"/>
+          <w:sz w:val="21"/>
+          <w:szCs w:val="21"/>
+          <w:lang w:eastAsia="en-GB"/>
+          <w14:ligatures w14:val="none"/>
+        </w:rPr>
+        <w:t xml:space="preserve">, </w:t>
+      </w:r>
+      <w:proofErr w:type="spellStart"/>
+      <w:r>
+        <w:rPr>
+          <w:rFonts w:ascii="Arial" w:eastAsia="Times New Roman" w:hAnsi="Arial" w:cs="Arial"/>
+          <w:color w:val="000000"/>
+          <w:kern w:val="0"/>
+          <w:sz w:val="21"/>
+          <w:szCs w:val="21"/>
+          <w:lang w:eastAsia="en-GB"/>
+          <w14:ligatures w14:val="none"/>
+        </w:rPr>
+        <w:t>pay_amount</w:t>
+      </w:r>
+      <w:proofErr w:type="spellEnd"/>
+      <w:r>
+        <w:rPr>
+          <w:rFonts w:ascii="Arial" w:eastAsia="Times New Roman" w:hAnsi="Arial" w:cs="Arial"/>
+          <w:color w:val="000000"/>
+          <w:kern w:val="0"/>
+          <w:sz w:val="21"/>
+          <w:szCs w:val="21"/>
+          <w:lang w:eastAsia="en-GB"/>
+          <w14:ligatures w14:val="none"/>
+        </w:rPr>
+        <w:t xml:space="preserve">, </w:t>
+      </w:r>
+      <w:proofErr w:type="spellStart"/>
+      <w:r>
+        <w:rPr>
+          <w:rFonts w:ascii="Arial" w:eastAsia="Times New Roman" w:hAnsi="Arial" w:cs="Arial"/>
+          <w:color w:val="000000"/>
+          <w:kern w:val="0"/>
+          <w:sz w:val="21"/>
+          <w:szCs w:val="21"/>
+          <w:lang w:eastAsia="en-GB"/>
+          <w14:ligatures w14:val="none"/>
+        </w:rPr>
+        <w:t>pay_paidby</w:t>
+      </w:r>
+      <w:proofErr w:type="spellEnd"/>
+      <w:r>
+        <w:rPr>
+          <w:rFonts w:ascii="Arial" w:eastAsia="Times New Roman" w:hAnsi="Arial" w:cs="Arial"/>
+          <w:color w:val="000000"/>
+          <w:kern w:val="0"/>
+          <w:sz w:val="21"/>
+          <w:szCs w:val="21"/>
+          <w:lang w:eastAsia="en-GB"/>
+          <w14:ligatures w14:val="none"/>
+        </w:rPr>
+        <w:t>, prop_no, rent_lease_startdate)</w:t>
+      </w:r>
+    </w:p>
+    <w:p>
+      <w:pPr>
+        <w:rPr>
+          <w:sz w:val="21"/>
+          <w:szCs w:val="21"/>
+          <w:lang w:val="en-US"/>
+        </w:rPr>
+      </w:pPr>
+    </w:p>
+    <w:p>
+      <w:pPr>
+        <w:rPr>
+          <w:sz w:val="21"/>
+          <w:szCs w:val="21"/>
+          <w:lang w:val="en-US"/>
         </w:rPr>
       </w:pPr>
     </w:p>
@@ -3157,8 +4594,100 @@
       </w:rPr>
     </w:lvl>
   </w:abstractNum>
+  <w:abstractNum w:abstractNumId="1" w15:restartNumberingAfterBreak="0">
+    <w:nsid w:val="75DE159A"/>
+    <w:multiLevelType w:val="hybridMultilevel"/>
+    <w:tmpl w:val="73BA1CA6"/>
+    <w:lvl w:ilvl="0" w:tplc="0809000F">
+      <w:start w:val="1"/>
+      <w:numFmt w:val="decimal"/>
+      <w:lvlText w:val="%1."/>
+      <w:lvlJc w:val="left"/>
+      <w:pPr>
+        <w:ind w:left="720" w:hanging="360"/>
+      </w:pPr>
+      <w:rPr>
+        <w:rFonts w:hint="default"/>
+      </w:rPr>
+    </w:lvl>
+    <w:lvl w:ilvl="1" w:tplc="08090019" w:tentative="1">
+      <w:start w:val="1"/>
+      <w:numFmt w:val="lowerLetter"/>
+      <w:lvlText w:val="%2."/>
+      <w:lvlJc w:val="left"/>
+      <w:pPr>
+        <w:ind w:left="1440" w:hanging="360"/>
+      </w:pPr>
+    </w:lvl>
+    <w:lvl w:ilvl="2" w:tplc="0809001B" w:tentative="1">
+      <w:start w:val="1"/>
+      <w:numFmt w:val="lowerRoman"/>
+      <w:lvlText w:val="%3."/>
+      <w:lvlJc w:val="right"/>
+      <w:pPr>
+        <w:ind w:left="2160" w:hanging="180"/>
+      </w:pPr>
+    </w:lvl>
+    <w:lvl w:ilvl="3" w:tplc="0809000F" w:tentative="1">
+      <w:start w:val="1"/>
+      <w:numFmt w:val="decimal"/>
+      <w:lvlText w:val="%4."/>
+      <w:lvlJc w:val="left"/>
+      <w:pPr>
+        <w:ind w:left="2880" w:hanging="360"/>
+      </w:pPr>
+    </w:lvl>
+    <w:lvl w:ilvl="4" w:tplc="08090019" w:tentative="1">
+      <w:start w:val="1"/>
+      <w:numFmt w:val="lowerLetter"/>
+      <w:lvlText w:val="%5."/>
+      <w:lvlJc w:val="left"/>
+      <w:pPr>
+        <w:ind w:left="3600" w:hanging="360"/>
+      </w:pPr>
+    </w:lvl>
+    <w:lvl w:ilvl="5" w:tplc="0809001B" w:tentative="1">
+      <w:start w:val="1"/>
+      <w:numFmt w:val="lowerRoman"/>
+      <w:lvlText w:val="%6."/>
+      <w:lvlJc w:val="right"/>
+      <w:pPr>
+        <w:ind w:left="4320" w:hanging="180"/>
+      </w:pPr>
+    </w:lvl>
+    <w:lvl w:ilvl="6" w:tplc="0809000F" w:tentative="1">
+      <w:start w:val="1"/>
+      <w:numFmt w:val="decimal"/>
+      <w:lvlText w:val="%7."/>
+      <w:lvlJc w:val="left"/>
+      <w:pPr>
+        <w:ind w:left="5040" w:hanging="360"/>
+      </w:pPr>
+    </w:lvl>
+    <w:lvl w:ilvl="7" w:tplc="08090019" w:tentative="1">
+      <w:start w:val="1"/>
+      <w:numFmt w:val="lowerLetter"/>
+      <w:lvlText w:val="%8."/>
+      <w:lvlJc w:val="left"/>
+      <w:pPr>
+        <w:ind w:left="5760" w:hanging="360"/>
+      </w:pPr>
+    </w:lvl>
+    <w:lvl w:ilvl="8" w:tplc="0809001B" w:tentative="1">
+      <w:start w:val="1"/>
+      <w:numFmt w:val="lowerRoman"/>
+      <w:lvlText w:val="%9."/>
+      <w:lvlJc w:val="right"/>
+      <w:pPr>
+        <w:ind w:left="6480" w:hanging="180"/>
+      </w:pPr>
+    </w:lvl>
+  </w:abstractNum>
   <w:num w:numId="1" w16cid:durableId="270552267">
     <w:abstractNumId w:val="0"/>
+  </w:num>
+  <w:num w:numId="2" w16cid:durableId="1000157948">
+    <w:abstractNumId w:val="1"/>
   </w:num>
 </w:numbering>
 </file>
@@ -4097,6 +5626,23 @@
       <w14:ligatures w14:val="none"/>
     </w:rPr>
   </w:style>
+  <w:style w:type="paragraph" w:customStyle="1" w:styleId="p2">
+    <w:name w:val="p2"/>
+    <w:basedOn w:val="Normal"/>
+    <w:rsid w:val="00F2413B"/>
+    <w:pPr>
+      <w:spacing w:after="0" w:line="240" w:lineRule="auto"/>
+    </w:pPr>
+    <w:rPr>
+      <w:rFonts w:ascii="Arial" w:eastAsia="Times New Roman" w:hAnsi="Arial" w:cs="Arial"/>
+      <w:color w:val="000000"/>
+      <w:kern w:val="0"/>
+      <w:sz w:val="17"/>
+      <w:szCs w:val="17"/>
+      <w:lang w:eastAsia="en-GB"/>
+      <w14:ligatures w14:val="none"/>
+    </w:rPr>
+  </w:style>
 </w:styles>
 </file>
 

</xml_diff>

<commit_message>
Performed attribute synthesis – merged relations across forms into final 3NF schema
</commit_message>
<xml_diff>
--- a/Applied/App04/A4-2 NORMALISATION.docx
+++ b/Applied/App04/A4-2 NORMALISATION.docx
@@ -4445,6 +4445,903 @@
     <w:p>
       <w:pPr>
         <w:rPr>
+          <w:rFonts w:asciiTheme="minorBidi" w:hAnsiTheme="minorBidi"/>
+          <w:b/>
+          <w:bCs/>
+          <w:sz w:val="21"/>
+          <w:szCs w:val="21"/>
+          <w:u w:val="single"/>
+          <w:lang w:val="en-US"/>
+        </w:rPr>
+      </w:pPr>
+      <w:r>
+        <w:rPr>
+          <w:rFonts w:asciiTheme="minorBidi" w:hAnsiTheme="minorBidi"/>
+          <w:b/>
+          <w:bCs/>
+          <w:sz w:val="21"/>
+          <w:szCs w:val="21"/>
+          <w:u w:val="single"/>
+          <w:lang w:val="en-US"/>
+        </w:rPr>
+        <w:t>ATTRIBUTE SYNTHESIS</w:t>
+      </w:r>
+    </w:p>
+    <w:p>
+      <w:pPr>
+        <w:rPr>
+          <w:rFonts w:asciiTheme="minorBidi" w:hAnsiTheme="minorBidi"/>
+          <w:sz w:val="21"/>
+          <w:szCs w:val="21"/>
+          <w:lang w:val="en-US"/>
+        </w:rPr>
+      </w:pPr>
+      <w:r>
+        <w:rPr>
+          <w:rFonts w:asciiTheme="minorBidi" w:hAnsiTheme="minorBidi"/>
+          <w:sz w:val="21"/>
+          <w:szCs w:val="21"/>
+          <w:lang w:val="en-US"/>
+        </w:rPr>
+        <w:t>NO.</w:t>
+      </w:r>
+      <w:r>
+        <w:rPr>
+          <w:rFonts w:asciiTheme="minorBidi" w:hAnsiTheme="minorBidi"/>
+          <w:sz w:val="21"/>
+          <w:szCs w:val="21"/>
+          <w:lang w:val="en-US"/>
+        </w:rPr>
+        <w:t xml:space="preserve"> </w:t>
+      </w:r>
+      <w:r>
+        <w:rPr>
+          <w:rFonts w:asciiTheme="minorBidi" w:hAnsiTheme="minorBidi"/>
+          <w:sz w:val="21"/>
+          <w:szCs w:val="21"/>
+          <w:lang w:val="en-US"/>
+        </w:rPr>
+        <w:t>2 AND NO. 4</w:t>
+      </w:r>
+    </w:p>
+    <w:p>
+      <w:pPr>
+        <w:rPr>
+          <w:rFonts w:asciiTheme="minorBidi" w:hAnsiTheme="minorBidi"/>
+          <w:sz w:val="21"/>
+          <w:szCs w:val="21"/>
+          <w:lang w:val="en-US"/>
+        </w:rPr>
+      </w:pPr>
+      <w:r>
+        <w:rPr>
+          <w:rFonts w:asciiTheme="minorBidi" w:hAnsiTheme="minorBidi"/>
+          <w:sz w:val="21"/>
+          <w:szCs w:val="21"/>
+          <w:lang w:val="en-US"/>
+        </w:rPr>
+        <w:t>PROPERTY (</w:t>
+      </w:r>
+      <w:r>
+        <w:rPr>
+          <w:rFonts w:asciiTheme="minorBidi" w:hAnsiTheme="minorBidi"/>
+          <w:sz w:val="21"/>
+          <w:szCs w:val="21"/>
+          <w:u w:val="single"/>
+          <w:lang w:val="en-US"/>
+        </w:rPr>
+        <w:t>prop_no,</w:t>
+      </w:r>
+      <w:r>
+        <w:rPr>
+          <w:rFonts w:asciiTheme="minorBidi" w:hAnsiTheme="minorBidi"/>
+          <w:sz w:val="21"/>
+          <w:szCs w:val="21"/>
+          <w:lang w:val="en-US"/>
+        </w:rPr>
+        <w:t xml:space="preserve"> </w:t>
+      </w:r>
+      <w:proofErr w:type="spellStart"/>
+      <w:r>
+        <w:rPr>
+          <w:rFonts w:asciiTheme="minorBidi" w:hAnsiTheme="minorBidi"/>
+          <w:sz w:val="21"/>
+          <w:szCs w:val="21"/>
+          <w:lang w:val="en-US"/>
+        </w:rPr>
+        <w:t>prop_address</w:t>
+      </w:r>
+      <w:proofErr w:type="spellEnd"/>
+      <w:r>
+        <w:rPr>
+          <w:rFonts w:asciiTheme="minorBidi" w:hAnsiTheme="minorBidi"/>
+          <w:sz w:val="21"/>
+          <w:szCs w:val="21"/>
+          <w:lang w:val="en-US"/>
+        </w:rPr>
+        <w:t>, owner_no)</w:t>
+      </w:r>
+    </w:p>
+    <w:p>
+      <w:pPr>
+        <w:rPr>
+          <w:rFonts w:asciiTheme="minorBidi" w:hAnsiTheme="minorBidi"/>
+          <w:sz w:val="21"/>
+          <w:szCs w:val="21"/>
+          <w:lang w:val="en-US"/>
+        </w:rPr>
+      </w:pPr>
+    </w:p>
+    <w:p>
+      <w:pPr>
+        <w:rPr>
+          <w:rFonts w:asciiTheme="minorBidi" w:hAnsiTheme="minorBidi"/>
+          <w:sz w:val="21"/>
+          <w:szCs w:val="21"/>
+          <w:lang w:val="en-US"/>
+        </w:rPr>
+      </w:pPr>
+      <w:r>
+        <w:rPr>
+          <w:rFonts w:asciiTheme="minorBidi" w:hAnsiTheme="minorBidi"/>
+          <w:sz w:val="21"/>
+          <w:szCs w:val="21"/>
+          <w:lang w:val="en-US"/>
+        </w:rPr>
+        <w:t>FINAL 3NF RELATIONS</w:t>
+      </w:r>
+    </w:p>
+    <w:p>
+      <w:pPr>
+        <w:pStyle w:val="ListParagraph"/>
+        <w:numPr>
+          <w:ilvl w:val="0"/>
+          <w:numId w:val="3"/>
+        </w:numPr>
+        <w:spacing w:after="0" w:line="240" w:lineRule="auto"/>
+        <w:rPr>
+          <w:rFonts w:ascii="Arial" w:eastAsia="Times New Roman" w:hAnsi="Arial" w:cs="Arial"/>
+          <w:color w:val="000000"/>
+          <w:kern w:val="0"/>
+          <w:sz w:val="21"/>
+          <w:szCs w:val="21"/>
+          <w:lang w:eastAsia="en-GB"/>
+          <w14:ligatures w14:val="none"/>
+        </w:rPr>
+      </w:pPr>
+      <w:r>
+        <w:rPr>
+          <w:rFonts w:ascii="Arial" w:eastAsia="Times New Roman" w:hAnsi="Arial" w:cs="Arial"/>
+          <w:color w:val="000000"/>
+          <w:kern w:val="0"/>
+          <w:sz w:val="21"/>
+          <w:szCs w:val="21"/>
+          <w:lang w:eastAsia="en-GB"/>
+          <w14:ligatures w14:val="none"/>
+        </w:rPr>
+        <w:t>OWNER (</w:t>
+      </w:r>
+      <w:proofErr w:type="spellStart"/>
+      <w:r>
+        <w:rPr>
+          <w:rFonts w:ascii="Arial" w:eastAsia="Times New Roman" w:hAnsi="Arial" w:cs="Arial"/>
+          <w:color w:val="000000"/>
+          <w:kern w:val="0"/>
+          <w:sz w:val="21"/>
+          <w:szCs w:val="21"/>
+          <w:u w:val="single"/>
+          <w:lang w:eastAsia="en-GB"/>
+          <w14:ligatures w14:val="none"/>
+        </w:rPr>
+        <w:t>owner_no</w:t>
+      </w:r>
+      <w:proofErr w:type="spellEnd"/>
+      <w:r>
+        <w:rPr>
+          <w:rFonts w:ascii="Arial" w:eastAsia="Times New Roman" w:hAnsi="Arial" w:cs="Arial"/>
+          <w:color w:val="000000"/>
+          <w:kern w:val="0"/>
+          <w:sz w:val="21"/>
+          <w:szCs w:val="21"/>
+          <w:lang w:eastAsia="en-GB"/>
+          <w14:ligatures w14:val="none"/>
+        </w:rPr>
+        <w:t xml:space="preserve">, </w:t>
+      </w:r>
+      <w:proofErr w:type="spellStart"/>
+      <w:r>
+        <w:rPr>
+          <w:rFonts w:ascii="Arial" w:eastAsia="Times New Roman" w:hAnsi="Arial" w:cs="Arial"/>
+          <w:color w:val="000000"/>
+          <w:kern w:val="0"/>
+          <w:sz w:val="21"/>
+          <w:szCs w:val="21"/>
+          <w:lang w:eastAsia="en-GB"/>
+          <w14:ligatures w14:val="none"/>
+        </w:rPr>
+        <w:t>owner_givname</w:t>
+      </w:r>
+      <w:proofErr w:type="spellEnd"/>
+      <w:r>
+        <w:rPr>
+          <w:rFonts w:ascii="Arial" w:eastAsia="Times New Roman" w:hAnsi="Arial" w:cs="Arial"/>
+          <w:color w:val="000000"/>
+          <w:kern w:val="0"/>
+          <w:sz w:val="21"/>
+          <w:szCs w:val="21"/>
+          <w:lang w:eastAsia="en-GB"/>
+          <w14:ligatures w14:val="none"/>
+        </w:rPr>
+        <w:t xml:space="preserve">, </w:t>
+      </w:r>
+      <w:proofErr w:type="spellStart"/>
+      <w:r>
+        <w:rPr>
+          <w:rFonts w:ascii="Arial" w:eastAsia="Times New Roman" w:hAnsi="Arial" w:cs="Arial"/>
+          <w:color w:val="000000"/>
+          <w:kern w:val="0"/>
+          <w:sz w:val="21"/>
+          <w:szCs w:val="21"/>
+          <w:lang w:eastAsia="en-GB"/>
+          <w14:ligatures w14:val="none"/>
+        </w:rPr>
+        <w:t>owner_famname</w:t>
+      </w:r>
+      <w:proofErr w:type="spellEnd"/>
+      <w:r>
+        <w:rPr>
+          <w:rFonts w:ascii="Arial" w:eastAsia="Times New Roman" w:hAnsi="Arial" w:cs="Arial"/>
+          <w:color w:val="000000"/>
+          <w:kern w:val="0"/>
+          <w:sz w:val="21"/>
+          <w:szCs w:val="21"/>
+          <w:lang w:eastAsia="en-GB"/>
+          <w14:ligatures w14:val="none"/>
+        </w:rPr>
+        <w:t xml:space="preserve">, </w:t>
+      </w:r>
+      <w:proofErr w:type="spellStart"/>
+      <w:r>
+        <w:rPr>
+          <w:rFonts w:ascii="Arial" w:eastAsia="Times New Roman" w:hAnsi="Arial" w:cs="Arial"/>
+          <w:color w:val="000000"/>
+          <w:kern w:val="0"/>
+          <w:sz w:val="21"/>
+          <w:szCs w:val="21"/>
+          <w:lang w:eastAsia="en-GB"/>
+          <w14:ligatures w14:val="none"/>
+        </w:rPr>
+        <w:t>owner_address</w:t>
+      </w:r>
+      <w:proofErr w:type="spellEnd"/>
+      <w:r>
+        <w:rPr>
+          <w:rFonts w:ascii="Arial" w:eastAsia="Times New Roman" w:hAnsi="Arial" w:cs="Arial"/>
+          <w:color w:val="000000"/>
+          <w:kern w:val="0"/>
+          <w:sz w:val="21"/>
+          <w:szCs w:val="21"/>
+          <w:lang w:eastAsia="en-GB"/>
+          <w14:ligatures w14:val="none"/>
+        </w:rPr>
+        <w:t>)</w:t>
+      </w:r>
+    </w:p>
+    <w:p>
+      <w:pPr>
+        <w:pStyle w:val="ListParagraph"/>
+        <w:numPr>
+          <w:ilvl w:val="0"/>
+          <w:numId w:val="3"/>
+        </w:numPr>
+        <w:rPr>
+          <w:rFonts w:asciiTheme="minorBidi" w:hAnsiTheme="minorBidi"/>
+          <w:sz w:val="21"/>
+          <w:szCs w:val="21"/>
+          <w:lang w:val="en-US"/>
+        </w:rPr>
+      </w:pPr>
+      <w:r>
+        <w:rPr>
+          <w:rFonts w:asciiTheme="minorBidi" w:hAnsiTheme="minorBidi"/>
+          <w:sz w:val="21"/>
+          <w:szCs w:val="21"/>
+          <w:lang w:val="en-US"/>
+        </w:rPr>
+        <w:t>PROPERTY (</w:t>
+      </w:r>
+      <w:r>
+        <w:rPr>
+          <w:rFonts w:asciiTheme="minorBidi" w:hAnsiTheme="minorBidi"/>
+          <w:sz w:val="21"/>
+          <w:szCs w:val="21"/>
+          <w:u w:val="single"/>
+          <w:lang w:val="en-US"/>
+        </w:rPr>
+        <w:t>prop_no,</w:t>
+      </w:r>
+      <w:r>
+        <w:rPr>
+          <w:rFonts w:asciiTheme="minorBidi" w:hAnsiTheme="minorBidi"/>
+          <w:sz w:val="21"/>
+          <w:szCs w:val="21"/>
+          <w:lang w:val="en-US"/>
+        </w:rPr>
+        <w:t xml:space="preserve"> </w:t>
+      </w:r>
+      <w:proofErr w:type="spellStart"/>
+      <w:r>
+        <w:rPr>
+          <w:rFonts w:asciiTheme="minorBidi" w:hAnsiTheme="minorBidi"/>
+          <w:sz w:val="21"/>
+          <w:szCs w:val="21"/>
+          <w:lang w:val="en-US"/>
+        </w:rPr>
+        <w:t>prop_address</w:t>
+      </w:r>
+      <w:proofErr w:type="spellEnd"/>
+      <w:r>
+        <w:rPr>
+          <w:rFonts w:asciiTheme="minorBidi" w:hAnsiTheme="minorBidi"/>
+          <w:sz w:val="21"/>
+          <w:szCs w:val="21"/>
+          <w:lang w:val="en-US"/>
+        </w:rPr>
+        <w:t>, owner_no)</w:t>
+      </w:r>
+    </w:p>
+    <w:p>
+      <w:pPr>
+        <w:pStyle w:val="ListParagraph"/>
+        <w:numPr>
+          <w:ilvl w:val="0"/>
+          <w:numId w:val="3"/>
+        </w:numPr>
+        <w:spacing w:after="0" w:line="240" w:lineRule="auto"/>
+        <w:rPr>
+          <w:rFonts w:ascii="Arial" w:eastAsia="Times New Roman" w:hAnsi="Arial" w:cs="Arial"/>
+          <w:color w:val="000000"/>
+          <w:kern w:val="0"/>
+          <w:sz w:val="21"/>
+          <w:szCs w:val="21"/>
+          <w:lang w:eastAsia="en-GB"/>
+          <w14:ligatures w14:val="none"/>
+        </w:rPr>
+      </w:pPr>
+      <w:r>
+        <w:rPr>
+          <w:rFonts w:ascii="Arial" w:eastAsia="Times New Roman" w:hAnsi="Arial" w:cs="Arial"/>
+          <w:color w:val="000000"/>
+          <w:kern w:val="0"/>
+          <w:sz w:val="21"/>
+          <w:szCs w:val="21"/>
+          <w:lang w:eastAsia="en-GB"/>
+          <w14:ligatures w14:val="none"/>
+        </w:rPr>
+        <w:t>MAINTAINENCE (</w:t>
+      </w:r>
+      <w:r>
+        <w:rPr>
+          <w:rFonts w:ascii="Arial" w:eastAsia="Times New Roman" w:hAnsi="Arial" w:cs="Arial"/>
+          <w:color w:val="000000"/>
+          <w:kern w:val="0"/>
+          <w:sz w:val="21"/>
+          <w:szCs w:val="21"/>
+          <w:u w:val="single"/>
+          <w:lang w:eastAsia="en-GB"/>
+          <w14:ligatures w14:val="none"/>
+        </w:rPr>
+        <w:t>prop_no</w:t>
+      </w:r>
+      <w:r>
+        <w:rPr>
+          <w:rFonts w:ascii="Arial" w:eastAsia="Times New Roman" w:hAnsi="Arial" w:cs="Arial"/>
+          <w:color w:val="000000"/>
+          <w:kern w:val="0"/>
+          <w:sz w:val="21"/>
+          <w:szCs w:val="21"/>
+          <w:lang w:eastAsia="en-GB"/>
+          <w14:ligatures w14:val="none"/>
+        </w:rPr>
+        <w:t xml:space="preserve">, </w:t>
+      </w:r>
+      <w:r>
+        <w:rPr>
+          <w:rFonts w:ascii="Arial" w:eastAsia="Times New Roman" w:hAnsi="Arial" w:cs="Arial"/>
+          <w:color w:val="000000"/>
+          <w:kern w:val="0"/>
+          <w:sz w:val="21"/>
+          <w:szCs w:val="21"/>
+          <w:u w:val="single"/>
+          <w:lang w:eastAsia="en-GB"/>
+          <w14:ligatures w14:val="none"/>
+        </w:rPr>
+        <w:t>maint_datetime</w:t>
+      </w:r>
+      <w:r>
+        <w:rPr>
+          <w:rFonts w:ascii="Arial" w:eastAsia="Times New Roman" w:hAnsi="Arial" w:cs="Arial"/>
+          <w:color w:val="000000"/>
+          <w:kern w:val="0"/>
+          <w:sz w:val="21"/>
+          <w:szCs w:val="21"/>
+          <w:lang w:eastAsia="en-GB"/>
+          <w14:ligatures w14:val="none"/>
+        </w:rPr>
+        <w:t xml:space="preserve">, </w:t>
+      </w:r>
+      <w:proofErr w:type="spellStart"/>
+      <w:r>
+        <w:rPr>
+          <w:rFonts w:ascii="Arial" w:eastAsia="Times New Roman" w:hAnsi="Arial" w:cs="Arial"/>
+          <w:color w:val="000000"/>
+          <w:kern w:val="0"/>
+          <w:sz w:val="21"/>
+          <w:szCs w:val="21"/>
+          <w:lang w:eastAsia="en-GB"/>
+          <w14:ligatures w14:val="none"/>
+        </w:rPr>
+        <w:t>maint_desc</w:t>
+      </w:r>
+      <w:proofErr w:type="spellEnd"/>
+      <w:r>
+        <w:rPr>
+          <w:rFonts w:ascii="Arial" w:eastAsia="Times New Roman" w:hAnsi="Arial" w:cs="Arial"/>
+          <w:color w:val="000000"/>
+          <w:kern w:val="0"/>
+          <w:sz w:val="21"/>
+          <w:szCs w:val="21"/>
+          <w:lang w:eastAsia="en-GB"/>
+          <w14:ligatures w14:val="none"/>
+        </w:rPr>
+        <w:t>, maint_cost)</w:t>
+      </w:r>
+    </w:p>
+    <w:p>
+      <w:pPr>
+        <w:pStyle w:val="ListParagraph"/>
+        <w:numPr>
+          <w:ilvl w:val="0"/>
+          <w:numId w:val="3"/>
+        </w:numPr>
+        <w:spacing w:after="0" w:line="240" w:lineRule="auto"/>
+        <w:rPr>
+          <w:rFonts w:ascii="Arial" w:eastAsia="Times New Roman" w:hAnsi="Arial" w:cs="Arial"/>
+          <w:color w:val="000000"/>
+          <w:kern w:val="0"/>
+          <w:sz w:val="21"/>
+          <w:szCs w:val="21"/>
+          <w:lang w:eastAsia="en-GB"/>
+          <w14:ligatures w14:val="none"/>
+        </w:rPr>
+      </w:pPr>
+      <w:r>
+        <w:rPr>
+          <w:rFonts w:ascii="Arial" w:eastAsia="Times New Roman" w:hAnsi="Arial" w:cs="Arial"/>
+          <w:color w:val="000000"/>
+          <w:kern w:val="0"/>
+          <w:sz w:val="21"/>
+          <w:szCs w:val="21"/>
+          <w:lang w:eastAsia="en-GB"/>
+          <w14:ligatures w14:val="none"/>
+        </w:rPr>
+        <w:t>TENANT (</w:t>
+      </w:r>
+      <w:proofErr w:type="spellStart"/>
+      <w:r>
+        <w:rPr>
+          <w:rFonts w:ascii="Arial" w:eastAsia="Times New Roman" w:hAnsi="Arial" w:cs="Arial"/>
+          <w:color w:val="000000"/>
+          <w:kern w:val="0"/>
+          <w:sz w:val="21"/>
+          <w:szCs w:val="21"/>
+          <w:u w:val="single"/>
+          <w:lang w:eastAsia="en-GB"/>
+          <w14:ligatures w14:val="none"/>
+        </w:rPr>
+        <w:t>tenant_no</w:t>
+      </w:r>
+      <w:proofErr w:type="spellEnd"/>
+      <w:r>
+        <w:rPr>
+          <w:rFonts w:ascii="Arial" w:eastAsia="Times New Roman" w:hAnsi="Arial" w:cs="Arial"/>
+          <w:color w:val="000000"/>
+          <w:kern w:val="0"/>
+          <w:sz w:val="21"/>
+          <w:szCs w:val="21"/>
+          <w:lang w:eastAsia="en-GB"/>
+          <w14:ligatures w14:val="none"/>
+        </w:rPr>
+        <w:t xml:space="preserve">, </w:t>
+      </w:r>
+      <w:proofErr w:type="spellStart"/>
+      <w:r>
+        <w:rPr>
+          <w:rFonts w:ascii="Arial" w:eastAsia="Times New Roman" w:hAnsi="Arial" w:cs="Arial"/>
+          <w:color w:val="000000"/>
+          <w:kern w:val="0"/>
+          <w:sz w:val="21"/>
+          <w:szCs w:val="21"/>
+          <w:lang w:eastAsia="en-GB"/>
+          <w14:ligatures w14:val="none"/>
+        </w:rPr>
+        <w:t>tenant_givname</w:t>
+      </w:r>
+      <w:proofErr w:type="spellEnd"/>
+      <w:r>
+        <w:rPr>
+          <w:rFonts w:ascii="Arial" w:eastAsia="Times New Roman" w:hAnsi="Arial" w:cs="Arial"/>
+          <w:color w:val="000000"/>
+          <w:kern w:val="0"/>
+          <w:sz w:val="21"/>
+          <w:szCs w:val="21"/>
+          <w:lang w:eastAsia="en-GB"/>
+          <w14:ligatures w14:val="none"/>
+        </w:rPr>
+        <w:t xml:space="preserve">, </w:t>
+      </w:r>
+      <w:proofErr w:type="spellStart"/>
+      <w:r>
+        <w:rPr>
+          <w:rFonts w:ascii="Arial" w:eastAsia="Times New Roman" w:hAnsi="Arial" w:cs="Arial"/>
+          <w:color w:val="000000"/>
+          <w:kern w:val="0"/>
+          <w:sz w:val="21"/>
+          <w:szCs w:val="21"/>
+          <w:lang w:eastAsia="en-GB"/>
+          <w14:ligatures w14:val="none"/>
+        </w:rPr>
+        <w:t>tenant_famname</w:t>
+      </w:r>
+      <w:proofErr w:type="spellEnd"/>
+      <w:r>
+        <w:rPr>
+          <w:rFonts w:ascii="Arial" w:eastAsia="Times New Roman" w:hAnsi="Arial" w:cs="Arial"/>
+          <w:color w:val="000000"/>
+          <w:kern w:val="0"/>
+          <w:sz w:val="21"/>
+          <w:szCs w:val="21"/>
+          <w:lang w:eastAsia="en-GB"/>
+          <w14:ligatures w14:val="none"/>
+        </w:rPr>
+        <w:t>)</w:t>
+      </w:r>
+    </w:p>
+    <w:p>
+      <w:pPr>
+        <w:pStyle w:val="ListParagraph"/>
+        <w:numPr>
+          <w:ilvl w:val="0"/>
+          <w:numId w:val="3"/>
+        </w:numPr>
+        <w:spacing w:after="0" w:line="240" w:lineRule="auto"/>
+        <w:rPr>
+          <w:rFonts w:ascii="Arial" w:eastAsia="Times New Roman" w:hAnsi="Arial" w:cs="Arial"/>
+          <w:color w:val="000000"/>
+          <w:kern w:val="0"/>
+          <w:sz w:val="21"/>
+          <w:szCs w:val="21"/>
+          <w:u w:val="single"/>
+          <w:lang w:eastAsia="en-GB"/>
+          <w14:ligatures w14:val="none"/>
+        </w:rPr>
+      </w:pPr>
+      <w:r>
+        <w:rPr>
+          <w:rFonts w:ascii="Arial" w:eastAsia="Times New Roman" w:hAnsi="Arial" w:cs="Arial"/>
+          <w:color w:val="000000"/>
+          <w:kern w:val="0"/>
+          <w:sz w:val="21"/>
+          <w:szCs w:val="21"/>
+          <w:lang w:eastAsia="en-GB"/>
+          <w14:ligatures w14:val="none"/>
+        </w:rPr>
+        <w:t>PROPERTY_TENANT (</w:t>
+      </w:r>
+      <w:r>
+        <w:rPr>
+          <w:rFonts w:ascii="Arial" w:eastAsia="Times New Roman" w:hAnsi="Arial" w:cs="Arial"/>
+          <w:color w:val="000000"/>
+          <w:kern w:val="0"/>
+          <w:sz w:val="21"/>
+          <w:szCs w:val="21"/>
+          <w:u w:val="single"/>
+          <w:lang w:eastAsia="en-GB"/>
+          <w14:ligatures w14:val="none"/>
+        </w:rPr>
+        <w:t>prop_no,</w:t>
+      </w:r>
+      <w:r>
+        <w:rPr>
+          <w:rFonts w:ascii="Arial" w:eastAsia="Times New Roman" w:hAnsi="Arial" w:cs="Arial"/>
+          <w:color w:val="000000"/>
+          <w:kern w:val="0"/>
+          <w:sz w:val="21"/>
+          <w:szCs w:val="21"/>
+          <w:lang w:eastAsia="en-GB"/>
+          <w14:ligatures w14:val="none"/>
+        </w:rPr>
+        <w:t xml:space="preserve"> </w:t>
+      </w:r>
+      <w:r>
+        <w:rPr>
+          <w:rFonts w:ascii="Arial" w:eastAsia="Times New Roman" w:hAnsi="Arial" w:cs="Arial"/>
+          <w:color w:val="000000"/>
+          <w:kern w:val="0"/>
+          <w:sz w:val="21"/>
+          <w:szCs w:val="21"/>
+          <w:u w:val="single"/>
+          <w:lang w:eastAsia="en-GB"/>
+          <w14:ligatures w14:val="none"/>
+        </w:rPr>
+        <w:t xml:space="preserve">rent_lease_startdate, </w:t>
+      </w:r>
+      <w:proofErr w:type="spellStart"/>
+      <w:r>
+        <w:rPr>
+          <w:rFonts w:ascii="Arial" w:eastAsia="Times New Roman" w:hAnsi="Arial" w:cs="Arial"/>
+          <w:color w:val="000000"/>
+          <w:kern w:val="0"/>
+          <w:sz w:val="21"/>
+          <w:szCs w:val="21"/>
+          <w:lang w:eastAsia="en-GB"/>
+          <w14:ligatures w14:val="none"/>
+        </w:rPr>
+        <w:t>rent_weekly_rate</w:t>
+      </w:r>
+      <w:proofErr w:type="spellEnd"/>
+      <w:r>
+        <w:rPr>
+          <w:rFonts w:ascii="Arial" w:eastAsia="Times New Roman" w:hAnsi="Arial" w:cs="Arial"/>
+          <w:color w:val="000000"/>
+          <w:kern w:val="0"/>
+          <w:sz w:val="21"/>
+          <w:szCs w:val="21"/>
+          <w:lang w:eastAsia="en-GB"/>
+          <w14:ligatures w14:val="none"/>
+        </w:rPr>
+        <w:t xml:space="preserve">, </w:t>
+      </w:r>
+      <w:proofErr w:type="spellStart"/>
+      <w:r>
+        <w:rPr>
+          <w:rFonts w:ascii="Arial" w:eastAsia="Times New Roman" w:hAnsi="Arial" w:cs="Arial"/>
+          <w:color w:val="000000"/>
+          <w:kern w:val="0"/>
+          <w:sz w:val="21"/>
+          <w:szCs w:val="21"/>
+          <w:lang w:eastAsia="en-GB"/>
+          <w14:ligatures w14:val="none"/>
+        </w:rPr>
+        <w:t>rent_bond</w:t>
+      </w:r>
+      <w:proofErr w:type="spellEnd"/>
+      <w:r>
+        <w:rPr>
+          <w:rFonts w:ascii="Arial" w:eastAsia="Times New Roman" w:hAnsi="Arial" w:cs="Arial"/>
+          <w:color w:val="000000"/>
+          <w:kern w:val="0"/>
+          <w:sz w:val="21"/>
+          <w:szCs w:val="21"/>
+          <w:lang w:eastAsia="en-GB"/>
+          <w14:ligatures w14:val="none"/>
+        </w:rPr>
+        <w:t xml:space="preserve">, </w:t>
+      </w:r>
+      <w:proofErr w:type="spellStart"/>
+      <w:r>
+        <w:rPr>
+          <w:rFonts w:ascii="Arial" w:eastAsia="Times New Roman" w:hAnsi="Arial" w:cs="Arial"/>
+          <w:color w:val="000000"/>
+          <w:kern w:val="0"/>
+          <w:sz w:val="21"/>
+          <w:szCs w:val="21"/>
+          <w:lang w:eastAsia="en-GB"/>
+          <w14:ligatures w14:val="none"/>
+        </w:rPr>
+        <w:t>tenant_no</w:t>
+      </w:r>
+      <w:proofErr w:type="spellEnd"/>
+      <w:r>
+        <w:rPr>
+          <w:rFonts w:ascii="Arial" w:eastAsia="Times New Roman" w:hAnsi="Arial" w:cs="Arial"/>
+          <w:color w:val="000000"/>
+          <w:kern w:val="0"/>
+          <w:sz w:val="21"/>
+          <w:szCs w:val="21"/>
+          <w:lang w:eastAsia="en-GB"/>
+          <w14:ligatures w14:val="none"/>
+        </w:rPr>
+        <w:t>)</w:t>
+      </w:r>
+    </w:p>
+    <w:p>
+      <w:pPr>
+        <w:pStyle w:val="ListParagraph"/>
+        <w:numPr>
+          <w:ilvl w:val="0"/>
+          <w:numId w:val="3"/>
+        </w:numPr>
+        <w:spacing w:after="0" w:line="240" w:lineRule="auto"/>
+        <w:rPr>
+          <w:rFonts w:ascii="Arial" w:eastAsia="Times New Roman" w:hAnsi="Arial" w:cs="Arial"/>
+          <w:color w:val="000000"/>
+          <w:kern w:val="0"/>
+          <w:sz w:val="21"/>
+          <w:szCs w:val="21"/>
+          <w:u w:val="single"/>
+          <w:lang w:eastAsia="en-GB"/>
+          <w14:ligatures w14:val="none"/>
+        </w:rPr>
+      </w:pPr>
+      <w:r>
+        <w:rPr>
+          <w:rFonts w:ascii="Arial" w:eastAsia="Times New Roman" w:hAnsi="Arial" w:cs="Arial"/>
+          <w:color w:val="000000"/>
+          <w:kern w:val="0"/>
+          <w:sz w:val="21"/>
+          <w:szCs w:val="21"/>
+          <w:lang w:eastAsia="en-GB"/>
+          <w14:ligatures w14:val="none"/>
+        </w:rPr>
+        <w:t>PAYMENT (</w:t>
+      </w:r>
+      <w:r>
+        <w:rPr>
+          <w:rFonts w:ascii="Arial" w:eastAsia="Times New Roman" w:hAnsi="Arial" w:cs="Arial"/>
+          <w:color w:val="000000"/>
+          <w:kern w:val="0"/>
+          <w:sz w:val="21"/>
+          <w:szCs w:val="21"/>
+          <w:u w:val="single"/>
+          <w:lang w:eastAsia="en-GB"/>
+          <w14:ligatures w14:val="none"/>
+        </w:rPr>
+        <w:t>pay_no,</w:t>
+      </w:r>
+      <w:r>
+        <w:rPr>
+          <w:rFonts w:ascii="Arial" w:eastAsia="Times New Roman" w:hAnsi="Arial" w:cs="Arial"/>
+          <w:color w:val="000000"/>
+          <w:kern w:val="0"/>
+          <w:sz w:val="21"/>
+          <w:szCs w:val="21"/>
+          <w:lang w:eastAsia="en-GB"/>
+          <w14:ligatures w14:val="none"/>
+        </w:rPr>
+        <w:t xml:space="preserve"> </w:t>
+      </w:r>
+      <w:proofErr w:type="spellStart"/>
+      <w:r>
+        <w:rPr>
+          <w:rFonts w:ascii="Arial" w:eastAsia="Times New Roman" w:hAnsi="Arial" w:cs="Arial"/>
+          <w:color w:val="000000"/>
+          <w:kern w:val="0"/>
+          <w:sz w:val="21"/>
+          <w:szCs w:val="21"/>
+          <w:lang w:eastAsia="en-GB"/>
+          <w14:ligatures w14:val="none"/>
+        </w:rPr>
+        <w:t>pay_date</w:t>
+      </w:r>
+      <w:proofErr w:type="spellEnd"/>
+      <w:r>
+        <w:rPr>
+          <w:rFonts w:ascii="Arial" w:eastAsia="Times New Roman" w:hAnsi="Arial" w:cs="Arial"/>
+          <w:color w:val="000000"/>
+          <w:kern w:val="0"/>
+          <w:sz w:val="21"/>
+          <w:szCs w:val="21"/>
+          <w:lang w:eastAsia="en-GB"/>
+          <w14:ligatures w14:val="none"/>
+        </w:rPr>
+        <w:t xml:space="preserve">, </w:t>
+      </w:r>
+      <w:proofErr w:type="spellStart"/>
+      <w:r>
+        <w:rPr>
+          <w:rFonts w:ascii="Arial" w:eastAsia="Times New Roman" w:hAnsi="Arial" w:cs="Arial"/>
+          <w:color w:val="000000"/>
+          <w:kern w:val="0"/>
+          <w:sz w:val="21"/>
+          <w:szCs w:val="21"/>
+          <w:lang w:eastAsia="en-GB"/>
+          <w14:ligatures w14:val="none"/>
+        </w:rPr>
+        <w:t>pay_type</w:t>
+      </w:r>
+      <w:proofErr w:type="spellEnd"/>
+      <w:r>
+        <w:rPr>
+          <w:rFonts w:ascii="Arial" w:eastAsia="Times New Roman" w:hAnsi="Arial" w:cs="Arial"/>
+          <w:color w:val="000000"/>
+          <w:kern w:val="0"/>
+          <w:sz w:val="21"/>
+          <w:szCs w:val="21"/>
+          <w:lang w:eastAsia="en-GB"/>
+          <w14:ligatures w14:val="none"/>
+        </w:rPr>
+        <w:t xml:space="preserve">, </w:t>
+      </w:r>
+      <w:proofErr w:type="spellStart"/>
+      <w:r>
+        <w:rPr>
+          <w:rFonts w:ascii="Arial" w:eastAsia="Times New Roman" w:hAnsi="Arial" w:cs="Arial"/>
+          <w:color w:val="000000"/>
+          <w:kern w:val="0"/>
+          <w:sz w:val="21"/>
+          <w:szCs w:val="21"/>
+          <w:lang w:eastAsia="en-GB"/>
+          <w14:ligatures w14:val="none"/>
+        </w:rPr>
+        <w:t>pay_amount</w:t>
+      </w:r>
+      <w:proofErr w:type="spellEnd"/>
+      <w:r>
+        <w:rPr>
+          <w:rFonts w:ascii="Arial" w:eastAsia="Times New Roman" w:hAnsi="Arial" w:cs="Arial"/>
+          <w:color w:val="000000"/>
+          <w:kern w:val="0"/>
+          <w:sz w:val="21"/>
+          <w:szCs w:val="21"/>
+          <w:lang w:eastAsia="en-GB"/>
+          <w14:ligatures w14:val="none"/>
+        </w:rPr>
+        <w:t xml:space="preserve">, </w:t>
+      </w:r>
+      <w:proofErr w:type="spellStart"/>
+      <w:r>
+        <w:rPr>
+          <w:rFonts w:ascii="Arial" w:eastAsia="Times New Roman" w:hAnsi="Arial" w:cs="Arial"/>
+          <w:color w:val="000000"/>
+          <w:kern w:val="0"/>
+          <w:sz w:val="21"/>
+          <w:szCs w:val="21"/>
+          <w:lang w:eastAsia="en-GB"/>
+          <w14:ligatures w14:val="none"/>
+        </w:rPr>
+        <w:t>pay_paidby</w:t>
+      </w:r>
+      <w:proofErr w:type="spellEnd"/>
+      <w:r>
+        <w:rPr>
+          <w:rFonts w:ascii="Arial" w:eastAsia="Times New Roman" w:hAnsi="Arial" w:cs="Arial"/>
+          <w:color w:val="000000"/>
+          <w:kern w:val="0"/>
+          <w:sz w:val="21"/>
+          <w:szCs w:val="21"/>
+          <w:lang w:eastAsia="en-GB"/>
+          <w14:ligatures w14:val="none"/>
+        </w:rPr>
+        <w:t>, prop_no, rent_lease_startdate)</w:t>
+      </w:r>
+    </w:p>
+    <w:p>
+      <w:pPr>
+        <w:rPr>
+          <w:rFonts w:asciiTheme="minorBidi" w:hAnsiTheme="minorBidi"/>
+          <w:sz w:val="21"/>
+          <w:szCs w:val="21"/>
+          <w:lang w:val="en-US"/>
+        </w:rPr>
+      </w:pPr>
+    </w:p>
+    <w:p>
+      <w:pPr>
+        <w:rPr>
+          <w:rFonts w:asciiTheme="minorBidi" w:hAnsiTheme="minorBidi"/>
+          <w:sz w:val="21"/>
+          <w:szCs w:val="21"/>
+          <w:lang w:val="en-US"/>
+        </w:rPr>
+      </w:pPr>
+    </w:p>
+    <w:p>
+      <w:pPr>
+        <w:rPr>
+          <w:rFonts w:asciiTheme="minorBidi" w:hAnsiTheme="minorBidi"/>
+          <w:b/>
+          <w:bCs/>
           <w:sz w:val="21"/>
           <w:szCs w:val="21"/>
           <w:lang w:val="en-US"/>
@@ -4482,6 +5379,95 @@
 <file path=word/numbering.xml><?xml version="1.0" encoding="utf-8"?>
 <w:numbering xmlns:wpc="http://schemas.microsoft.com/office/word/2010/wordprocessingCanvas" xmlns:cx="http://schemas.microsoft.com/office/drawing/2014/chartex" xmlns:cx1="http://schemas.microsoft.com/office/drawing/2015/9/8/chartex" xmlns:cx2="http://schemas.microsoft.com/office/drawing/2015/10/21/chartex" xmlns:cx3="http://schemas.microsoft.com/office/drawing/2016/5/9/chartex" xmlns:cx4="http://schemas.microsoft.com/office/drawing/2016/5/10/chartex" xmlns:cx5="http://schemas.microsoft.com/office/drawing/2016/5/11/chartex" xmlns:cx6="http://schemas.microsoft.com/office/drawing/2016/5/12/chartex" xmlns:cx7="http://schemas.microsoft.com/office/drawing/2016/5/13/chartex" xmlns:cx8="http://schemas.microsoft.com/office/drawing/2016/5/14/chartex" xmlns:mc="http://schemas.openxmlformats.org/markup-compatibility/2006" xmlns:aink="http://schemas.microsoft.com/office/drawing/2016/ink" xmlns:am3d="http://schemas.microsoft.com/office/drawing/2017/model3d" xmlns:o="urn:schemas-microsoft-com:office:office" xmlns:oel="http://schemas.microsoft.com/office/2019/extlst" xmlns:r="http://schemas.openxmlformats.org/officeDocument/2006/relationships" xmlns:m="http://schemas.openxmlformats.org/officeDocument/2006/math" xmlns:v="urn:schemas-microsoft-com:vml" xmlns:wp14="http://schemas.microsoft.com/office/word/2010/wordprocessingDrawing" xmlns:wp="http://schemas.openxmlformats.org/drawingml/2006/wordprocessingDrawing" xmlns:w10="urn:schemas-microsoft-com:office:word" xmlns:w="http://schemas.openxmlformats.org/wordprocessingml/2006/main" xmlns:w14="http://schemas.microsoft.com/office/word/2010/wordml" xmlns:w15="http://schemas.microsoft.com/office/word/2012/wordml" xmlns:w16cex="http://schemas.microsoft.com/office/word/2018/wordml/cex" xmlns:w16cid="http://schemas.microsoft.com/office/word/2016/wordml/cid" xmlns:w16="http://schemas.microsoft.com/office/word/2018/wordml" xmlns:w16du="http://schemas.microsoft.com/office/word/2023/wordml/word16du" xmlns:w16sdtdh="http://schemas.microsoft.com/office/word/2020/wordml/sdtdatahash" xmlns:w16sdtfl="http://schemas.microsoft.com/office/word/2024/wordml/sdtformatlock" xmlns:w16se="http://schemas.microsoft.com/office/word/2015/wordml/symex" xmlns:wpg="http://schemas.microsoft.com/office/word/2010/wordprocessingGroup" xmlns:wpi="http://schemas.microsoft.com/office/word/2010/wordprocessingInk" xmlns:wne="http://schemas.microsoft.com/office/word/2006/wordml" xmlns:wps="http://schemas.microsoft.com/office/word/2010/wordprocessingShape" mc:Ignorable="w14 w15 w16se w16cid w16 w16cex w16sdtdh w16sdtfl w16du wp14">
   <w:abstractNum w:abstractNumId="0" w15:restartNumberingAfterBreak="0">
+    <w:nsid w:val="39C74A6C"/>
+    <w:multiLevelType w:val="hybridMultilevel"/>
+    <w:tmpl w:val="B714ED04"/>
+    <w:lvl w:ilvl="0" w:tplc="0809000F">
+      <w:start w:val="1"/>
+      <w:numFmt w:val="decimal"/>
+      <w:lvlText w:val="%1."/>
+      <w:lvlJc w:val="left"/>
+      <w:pPr>
+        <w:ind w:left="720" w:hanging="360"/>
+      </w:pPr>
+      <w:rPr>
+        <w:rFonts w:hint="default"/>
+      </w:rPr>
+    </w:lvl>
+    <w:lvl w:ilvl="1" w:tplc="08090019" w:tentative="1">
+      <w:start w:val="1"/>
+      <w:numFmt w:val="lowerLetter"/>
+      <w:lvlText w:val="%2."/>
+      <w:lvlJc w:val="left"/>
+      <w:pPr>
+        <w:ind w:left="1440" w:hanging="360"/>
+      </w:pPr>
+    </w:lvl>
+    <w:lvl w:ilvl="2" w:tplc="0809001B" w:tentative="1">
+      <w:start w:val="1"/>
+      <w:numFmt w:val="lowerRoman"/>
+      <w:lvlText w:val="%3."/>
+      <w:lvlJc w:val="right"/>
+      <w:pPr>
+        <w:ind w:left="2160" w:hanging="180"/>
+      </w:pPr>
+    </w:lvl>
+    <w:lvl w:ilvl="3" w:tplc="0809000F" w:tentative="1">
+      <w:start w:val="1"/>
+      <w:numFmt w:val="decimal"/>
+      <w:lvlText w:val="%4."/>
+      <w:lvlJc w:val="left"/>
+      <w:pPr>
+        <w:ind w:left="2880" w:hanging="360"/>
+      </w:pPr>
+    </w:lvl>
+    <w:lvl w:ilvl="4" w:tplc="08090019" w:tentative="1">
+      <w:start w:val="1"/>
+      <w:numFmt w:val="lowerLetter"/>
+      <w:lvlText w:val="%5."/>
+      <w:lvlJc w:val="left"/>
+      <w:pPr>
+        <w:ind w:left="3600" w:hanging="360"/>
+      </w:pPr>
+    </w:lvl>
+    <w:lvl w:ilvl="5" w:tplc="0809001B" w:tentative="1">
+      <w:start w:val="1"/>
+      <w:numFmt w:val="lowerRoman"/>
+      <w:lvlText w:val="%6."/>
+      <w:lvlJc w:val="right"/>
+      <w:pPr>
+        <w:ind w:left="4320" w:hanging="180"/>
+      </w:pPr>
+    </w:lvl>
+    <w:lvl w:ilvl="6" w:tplc="0809000F" w:tentative="1">
+      <w:start w:val="1"/>
+      <w:numFmt w:val="decimal"/>
+      <w:lvlText w:val="%7."/>
+      <w:lvlJc w:val="left"/>
+      <w:pPr>
+        <w:ind w:left="5040" w:hanging="360"/>
+      </w:pPr>
+    </w:lvl>
+    <w:lvl w:ilvl="7" w:tplc="08090019" w:tentative="1">
+      <w:start w:val="1"/>
+      <w:numFmt w:val="lowerLetter"/>
+      <w:lvlText w:val="%8."/>
+      <w:lvlJc w:val="left"/>
+      <w:pPr>
+        <w:ind w:left="5760" w:hanging="360"/>
+      </w:pPr>
+    </w:lvl>
+    <w:lvl w:ilvl="8" w:tplc="0809001B" w:tentative="1">
+      <w:start w:val="1"/>
+      <w:numFmt w:val="lowerRoman"/>
+      <w:lvlText w:val="%9."/>
+      <w:lvlJc w:val="right"/>
+      <w:pPr>
+        <w:ind w:left="6480" w:hanging="180"/>
+      </w:pPr>
+    </w:lvl>
+  </w:abstractNum>
+  <w:abstractNum w:abstractNumId="1" w15:restartNumberingAfterBreak="0">
     <w:nsid w:val="5E717208"/>
     <w:multiLevelType w:val="hybridMultilevel"/>
     <w:tmpl w:val="1DD4B912"/>
@@ -4594,7 +5580,7 @@
       </w:rPr>
     </w:lvl>
   </w:abstractNum>
-  <w:abstractNum w:abstractNumId="1" w15:restartNumberingAfterBreak="0">
+  <w:abstractNum w:abstractNumId="2" w15:restartNumberingAfterBreak="0">
     <w:nsid w:val="75DE159A"/>
     <w:multiLevelType w:val="hybridMultilevel"/>
     <w:tmpl w:val="73BA1CA6"/>
@@ -4684,10 +5670,13 @@
     </w:lvl>
   </w:abstractNum>
   <w:num w:numId="1" w16cid:durableId="270552267">
-    <w:abstractNumId w:val="0"/>
+    <w:abstractNumId w:val="1"/>
   </w:num>
   <w:num w:numId="2" w16cid:durableId="1000157948">
-    <w:abstractNumId w:val="1"/>
+    <w:abstractNumId w:val="2"/>
+  </w:num>
+  <w:num w:numId="3" w16cid:durableId="1688873047">
+    <w:abstractNumId w:val="0"/>
   </w:num>
 </w:numbering>
 </file>

</xml_diff>